<commit_message>
feat: complete LinkedIn integrations, branding assets, and ACE Loop Framework v2
</commit_message>
<xml_diff>
--- a/ACE_Loop_Framework_v2.docx
+++ b/ACE_Loop_Framework_v2.docx
@@ -127,6 +127,16 @@
     <w:p>
       <w:r>
         <w:t>14. Appendix: Terminology Glossary</w:t>
+      </w:r>
+    </w:p>
+    <w:p>
+      <w:r>
+        <w:t>15. Beyond the Loops - The Complete AI Expert Competency Map</w:t>
+      </w:r>
+    </w:p>
+    <w:p>
+      <w:r>
+        <w:t>16. The Path to Mastery - From Framework to Expertise</w:t>
       </w:r>
     </w:p>
     <w:p>
@@ -5232,6 +5242,841 @@
         </w:tc>
       </w:tr>
     </w:tbl>
+    <w:p>
+      <w:r>
+        <w:br w:type="page"/>
+      </w:r>
+    </w:p>
+    <w:p>
+      <w:pPr>
+        <w:pStyle w:val="Heading1"/>
+      </w:pPr>
+      <w:r>
+        <w:t>15. Beyond the Loops - The Complete AI Expert Competency Map</w:t>
+      </w:r>
+    </w:p>
+    <w:p>
+      <w:r>
+        <w:t>The ACE Loop Framework teaches workflow discipline: how to structure the interaction between human and agent so that output is verified, sessions are managed, and practice compounds over time. Discipline alone, however, is only one pillar. This section maps the complete set of competencies that, as of 2026, separate a genuine AI expert from someone who merely uses AI tools. Master the loops AND these pillars, and the combination is what produces expertise.</w:t>
+      </w:r>
+    </w:p>
+    <w:p>
+      <w:pPr>
+        <w:pStyle w:val="Heading2"/>
+      </w:pPr>
+      <w:r>
+        <w:t>15.1 Mental Model Mastery: Understanding What You Are Operating</w:t>
+      </w:r>
+    </w:p>
+    <w:p>
+      <w:r>
+        <w:t>This is the foundation everything else sits on. An expert understands - at a working level, not a research level - how the systems they operate actually behave:</w:t>
+      </w:r>
+    </w:p>
+    <w:p>
+      <w:pPr>
+        <w:pStyle w:val="ListBullet"/>
+      </w:pPr>
+      <w:r>
+        <w:t>Probabilistic generation. Models predict tokens. There is no internal database of facts and no deterministic logic. Every output is a plausible continuation, not a verified truth. This single mental model explains hallucination, cross-session inconsistency, and why context quality dominates output quality.</w:t>
+      </w:r>
+    </w:p>
+    <w:p>
+      <w:pPr>
+        <w:pStyle w:val="ListBullet"/>
+      </w:pPr>
+      <w:r>
+        <w:t>Context windows and attention. What fits, what degrades, what gets lost in the middle, and why a large token window is not the same as reliable memory.</w:t>
+      </w:r>
+    </w:p>
+    <w:p>
+      <w:pPr>
+        <w:pStyle w:val="ListBullet"/>
+      </w:pPr>
+      <w:r>
+        <w:t>Training versus inference. Why a model cannot learn from your session unless memory or tooling is explicitly built, and why prompting, retrieval (RAG), and fine-tuning are different tools for different problems. The most common expensive mistake is reaching for fine-tuning when retrieval was needed.</w:t>
+      </w:r>
+    </w:p>
+    <w:p>
+      <w:pPr>
+        <w:pStyle w:val="ListBullet"/>
+      </w:pPr>
+      <w:r>
+        <w:t>Known failure modes. Hallucination, sycophancy (agreeing when you are wrong), mode collapse on long tasks, prompt injection, and confident wrongness. Experts expect these and design around them; amateurs are surprised by them.</w:t>
+      </w:r>
+    </w:p>
+    <w:p>
+      <w:pPr>
+        <w:pStyle w:val="Heading2"/>
+      </w:pPr>
+      <w:r>
+        <w:t>15.2 Context Engineering (The Real Skill of 2025-2026)</w:t>
+      </w:r>
+    </w:p>
+    <w:p>
+      <w:r>
+        <w:t>Prompt engineering mattered in 2023; context engineering has superseded it. The skill is no longer writing a clever prompt - it is curating everything the model sees:</w:t>
+      </w:r>
+    </w:p>
+    <w:p>
+      <w:pPr>
+        <w:pStyle w:val="ListBullet"/>
+      </w:pPr>
+      <w:r>
+        <w:t>Retrieval (RAG): knowing when to stuff context versus retrieve it; chunking strategies, embedding selection, hybrid semantic-plus-keyword search, and re-ranking. Most complaints that "the AI is dumb" are actually retrieval problems.</w:t>
+      </w:r>
+    </w:p>
+    <w:p>
+      <w:pPr>
+        <w:pStyle w:val="ListBullet"/>
+      </w:pPr>
+      <w:r>
+        <w:t>Structured context: system prompts, memory files (such as AGENTS.md), schemas, few-shot examples, and tool outputs - organized deliberately rather than dumped.</w:t>
+      </w:r>
+    </w:p>
+    <w:p>
+      <w:pPr>
+        <w:pStyle w:val="ListBullet"/>
+      </w:pPr>
+      <w:r>
+        <w:t>Context compression and budgets: summarization, pruning stale information, and deciding what deserves scarce tokens. The handoff summary of the Macro Loop is one tactic; experts have a full repertoire.</w:t>
+      </w:r>
+    </w:p>
+    <w:p>
+      <w:pPr>
+        <w:pStyle w:val="ListBullet"/>
+      </w:pPr>
+      <w:r>
+        <w:t>Structured outputs: forcing JSON and schemas so model output is machine-consumable, not merely human-readable.</w:t>
+      </w:r>
+    </w:p>
+    <w:p>
+      <w:pPr>
+        <w:pStyle w:val="Heading2"/>
+      </w:pPr>
+      <w:r>
+        <w:t>15.3 Tooling and Orchestration Fluency</w:t>
+      </w:r>
+    </w:p>
+    <w:p>
+      <w:r>
+        <w:t>The 2026 expert does not just chat with models - they wire them into systems:</w:t>
+      </w:r>
+    </w:p>
+    <w:p>
+      <w:pPr>
+        <w:pStyle w:val="ListBullet"/>
+      </w:pPr>
+      <w:r>
+        <w:t>Agent harnesses: Claude Code, Cursor, Cline, OpenCode, and autonomous-agent platforms - and knowing how each harness system prompt, tool set, and sandbox changes model behavior.</w:t>
+      </w:r>
+    </w:p>
+    <w:p>
+      <w:pPr>
+        <w:pStyle w:val="ListBullet"/>
+      </w:pPr>
+      <w:r>
+        <w:t>MCP (Model Context Protocol): connecting agents to databases, APIs, browsers, and internal tools. MCP is becoming the universal adapter layer for AI - knowing how to build and consume MCP servers is the HTTP knowledge of this era.</w:t>
+      </w:r>
+    </w:p>
+    <w:p>
+      <w:pPr>
+        <w:pStyle w:val="ListBullet"/>
+      </w:pPr>
+      <w:r>
+        <w:t>Multi-agent orchestration: when to parallelize independent subtasks (git worktrees, isolated contexts), when to serialize (shared state), and when a single well-contextualized agent beats a committee of five - which is more often than the hype suggests.</w:t>
+      </w:r>
+    </w:p>
+    <w:p>
+      <w:pPr>
+        <w:pStyle w:val="ListBullet"/>
+      </w:pPr>
+      <w:r>
+        <w:t>Tool calling and evaluation of tool results: the Observe step of the Micro Loop generalized beyond coding.</w:t>
+      </w:r>
+    </w:p>
+    <w:p>
+      <w:pPr>
+        <w:pStyle w:val="ListBullet"/>
+      </w:pPr>
+      <w:r>
+        <w:t>Automation glue: CI/CD integration, hooks, scheduled agents, and event-driven workflows.</w:t>
+      </w:r>
+    </w:p>
+    <w:p>
+      <w:pPr>
+        <w:pStyle w:val="Heading2"/>
+      </w:pPr>
+      <w:r>
+        <w:t>15.4 Verification, Evaluation and Quality Engineering</w:t>
+      </w:r>
+    </w:p>
+    <w:p>
+      <w:r>
+        <w:t>This is what makes an expert trustworthy rather than merely fast:</w:t>
+      </w:r>
+    </w:p>
+    <w:p>
+      <w:pPr>
+        <w:pStyle w:val="ListBullet"/>
+      </w:pPr>
+      <w:r>
+        <w:t>Building evals: the single most underrated skill. If you cannot measure whether an AI system got better, you are vibing, not engineering. Experts write test cases, golden datasets, and judge pipelines for any AI workflow they run - not just code.</w:t>
+      </w:r>
+    </w:p>
+    <w:p>
+      <w:pPr>
+        <w:pStyle w:val="ListBullet"/>
+      </w:pPr>
+      <w:r>
+        <w:t>Statistical skepticism: one successful run means nothing. Understand sampling variance, temperature effects, and regression-test prompts like code.</w:t>
+      </w:r>
+    </w:p>
+    <w:p>
+      <w:pPr>
+        <w:pStyle w:val="ListBullet"/>
+      </w:pPr>
+      <w:r>
+        <w:t>Security literacy: prompt injection (direct and indirect - including malicious instructions hidden inside fetched content), data exfiltration through tool calls, over-privileged agents, and the principle of least agency: give the agent the minimum tools and permissions required.</w:t>
+      </w:r>
+    </w:p>
+    <w:p>
+      <w:pPr>
+        <w:pStyle w:val="ListBullet"/>
+      </w:pPr>
+      <w:r>
+        <w:t>Human-in-the-loop design: knowing exactly which steps to gate (irreversible, high-stakes, ambiguous) and which to automate.</w:t>
+      </w:r>
+    </w:p>
+    <w:p>
+      <w:r>
+        <w:t>The pattern documented in research is that users of AI assistants become more confident AND less secure. Experts invert that curve: higher speed with higher standards.</w:t>
+      </w:r>
+    </w:p>
+    <w:p>
+      <w:pPr>
+        <w:pStyle w:val="Heading2"/>
+      </w:pPr>
+      <w:r>
+        <w:t>15.5 Deep Domain Expertise (The Non-Negotiable Pillar)</w:t>
+      </w:r>
+    </w:p>
+    <w:p>
+      <w:r>
+        <w:t>This is the hard truth most "become an AI expert" content skips: AI amplifies domain knowledge; it does not replace it. A person who does not know software architecture cannot verify an agent architecture. A person who does not know a domain cannot check output in that domain. The expert pattern is T-shaped with AI leverage: deep expertise in at least one domain (so you can verify and judge), broad working knowledge across others, and AI as the lever that lets you operate across the breadth. Without domain judgment you can only ever be an AI operator; with it, you are an AI expert.</w:t>
+      </w:r>
+    </w:p>
+    <w:p>
+      <w:pPr>
+        <w:pStyle w:val="Heading2"/>
+      </w:pPr>
+      <w:r>
+        <w:t>15.6 Systems and Product Thinking</w:t>
+      </w:r>
+    </w:p>
+    <w:p>
+      <w:r>
+        <w:t>Performing any kind of task with AI means treating tasks as systems, not one-offs:</w:t>
+      </w:r>
+    </w:p>
+    <w:p>
+      <w:pPr>
+        <w:pStyle w:val="ListBullet"/>
+      </w:pPr>
+      <w:r>
+        <w:t>Decomposition: breaking an ambiguous goal into verifiable subtasks - the Macro Loop generalized to any domain.</w:t>
+      </w:r>
+    </w:p>
+    <w:p>
+      <w:pPr>
+        <w:pStyle w:val="ListBullet"/>
+      </w:pPr>
+      <w:r>
+        <w:t>Cost, latency and scale awareness: knowing when a small fast model suffices versus a frontier model; caching (including prompt caching); when 80 percent quality at a fraction of the cost beats perfection.</w:t>
+      </w:r>
+    </w:p>
+    <w:p>
+      <w:pPr>
+        <w:pStyle w:val="ListBullet"/>
+      </w:pPr>
+      <w:r>
+        <w:t>Failure design: retries, fallbacks, circuit breakers, and degradation paths - reliability engineering applied to probabilistic components.</w:t>
+      </w:r>
+    </w:p>
+    <w:p>
+      <w:pPr>
+        <w:pStyle w:val="ListBullet"/>
+      </w:pPr>
+      <w:r>
+        <w:t>Data stewardship: privacy, PII handling, retention, training-data policy, and regulatory awareness (the EU AI Act is in force; sector rules continue to land).</w:t>
+      </w:r>
+    </w:p>
+    <w:p>
+      <w:pPr>
+        <w:pStyle w:val="Heading2"/>
+      </w:pPr>
+      <w:r>
+        <w:t>15.7 The Meta-Skill: Learning Velocity and Epistemics</w:t>
+      </w:r>
+    </w:p>
+    <w:p>
+      <w:r>
+        <w:t>The half-life of specific AI knowledge is measured in months. Models, tools, and best practices churn constantly. What does not churn:</w:t>
+      </w:r>
+    </w:p>
+    <w:p>
+      <w:pPr>
+        <w:pStyle w:val="ListBullet"/>
+      </w:pPr>
+      <w:r>
+        <w:t>First-principles thinking: when a new tool drops, experts ask what underlying problem it solves and map it onto what they already know; amateurs relearn everything from scratch.</w:t>
+      </w:r>
+    </w:p>
+    <w:p>
+      <w:pPr>
+        <w:pStyle w:val="ListBullet"/>
+      </w:pPr>
+      <w:r>
+        <w:t>Empiricism over vibes: testing claims yourself. The field is saturated with hype; run the 30-minute experiment before believing the 30-minute tutorial.</w:t>
+      </w:r>
+    </w:p>
+    <w:p>
+      <w:pPr>
+        <w:pStyle w:val="ListBullet"/>
+      </w:pPr>
+      <w:r>
+        <w:t>Deliberate practice with feedback: the Meta Loop applied to your own skillset.</w:t>
+      </w:r>
+    </w:p>
+    <w:p>
+      <w:pPr>
+        <w:pStyle w:val="ListBullet"/>
+      </w:pPr>
+      <w:r>
+        <w:t>Taste: after enough repetitions you develop fast judgment about what "good" looks like. This is the last thing AI cannot hand you.</w:t>
+      </w:r>
+    </w:p>
+    <w:p>
+      <w:pPr>
+        <w:pStyle w:val="Heading2"/>
+      </w:pPr>
+      <w:r>
+        <w:t>15.8 Communication and Delegation Skills</w:t>
+      </w:r>
+    </w:p>
+    <w:p>
+      <w:r>
+        <w:t>Working with AI is a management skill, not a typing skill:</w:t>
+      </w:r>
+    </w:p>
+    <w:p>
+      <w:pPr>
+        <w:pStyle w:val="ListBullet"/>
+      </w:pPr>
+      <w:r>
+        <w:t>Writing precise specifications (the Spec-First discipline) - clear thinking made testable. This transfers directly to managing humans.</w:t>
+      </w:r>
+    </w:p>
+    <w:p>
+      <w:pPr>
+        <w:pStyle w:val="ListBullet"/>
+      </w:pPr>
+      <w:r>
+        <w:t>Feedback quality: specific, actionable, referenced ("change line 47 to X") versus vague ("this feels off").</w:t>
+      </w:r>
+    </w:p>
+    <w:p>
+      <w:pPr>
+        <w:pStyle w:val="ListBullet"/>
+      </w:pPr>
+      <w:r>
+        <w:t>Knowing when NOT to use AI: some tasks are faster by hand, some decisions must stay human, and some data must never touch a model. Judgment about when is as expert as mastery of how.</w:t>
+      </w:r>
+    </w:p>
+    <w:p>
+      <w:r>
+        <w:t>Pillar summary:</w:t>
+      </w:r>
+    </w:p>
+    <w:tbl>
+      <w:tblPr>
+        <w:tblStyle w:val="LightGrid-Accent1"/>
+        <w:tblW w:type="auto" w:w="0"/>
+        <w:tblLook w:firstColumn="1" w:firstRow="1" w:lastColumn="0" w:lastRow="0" w:noHBand="0" w:noVBand="1" w:val="04A0"/>
+      </w:tblPr>
+      <w:tblGrid>
+        <w:gridCol w:w="4320"/>
+        <w:gridCol w:w="4320"/>
+      </w:tblGrid>
+      <w:tr>
+        <w:tc>
+          <w:tcPr>
+            <w:tcW w:type="dxa" w:w="4320"/>
+          </w:tcPr>
+          <w:p>
+            <w:r>
+              <w:t>Pillar</w:t>
+            </w:r>
+          </w:p>
+        </w:tc>
+        <w:tc>
+          <w:tcPr>
+            <w:tcW w:type="dxa" w:w="4320"/>
+          </w:tcPr>
+          <w:p>
+            <w:r>
+              <w:t>What It Gives You</w:t>
+            </w:r>
+          </w:p>
+        </w:tc>
+      </w:tr>
+      <w:tr>
+        <w:tc>
+          <w:tcPr>
+            <w:tcW w:type="dxa" w:w="4320"/>
+          </w:tcPr>
+          <w:p>
+            <w:r>
+              <w:t>Mental models</w:t>
+            </w:r>
+          </w:p>
+        </w:tc>
+        <w:tc>
+          <w:tcPr>
+            <w:tcW w:type="dxa" w:w="4320"/>
+          </w:tcPr>
+          <w:p>
+            <w:r>
+              <w:t>Predict failures before they happen</w:t>
+            </w:r>
+          </w:p>
+        </w:tc>
+      </w:tr>
+      <w:tr>
+        <w:tc>
+          <w:tcPr>
+            <w:tcW w:type="dxa" w:w="4320"/>
+          </w:tcPr>
+          <w:p>
+            <w:r>
+              <w:t>Context engineering</w:t>
+            </w:r>
+          </w:p>
+        </w:tc>
+        <w:tc>
+          <w:tcPr>
+            <w:tcW w:type="dxa" w:w="4320"/>
+          </w:tcPr>
+          <w:p>
+            <w:r>
+              <w:t>Reliability and quality control</w:t>
+            </w:r>
+          </w:p>
+        </w:tc>
+      </w:tr>
+      <w:tr>
+        <w:tc>
+          <w:tcPr>
+            <w:tcW w:type="dxa" w:w="4320"/>
+          </w:tcPr>
+          <w:p>
+            <w:r>
+              <w:t>Tooling / orchestration (MCP, agents)</w:t>
+            </w:r>
+          </w:p>
+        </w:tc>
+        <w:tc>
+          <w:tcPr>
+            <w:tcW w:type="dxa" w:w="4320"/>
+          </w:tcPr>
+          <w:p>
+            <w:r>
+              <w:t>Scale and automation</w:t>
+            </w:r>
+          </w:p>
+        </w:tc>
+      </w:tr>
+      <w:tr>
+        <w:tc>
+          <w:tcPr>
+            <w:tcW w:type="dxa" w:w="4320"/>
+          </w:tcPr>
+          <w:p>
+            <w:r>
+              <w:t>Verification and evals</w:t>
+            </w:r>
+          </w:p>
+        </w:tc>
+        <w:tc>
+          <w:tcPr>
+            <w:tcW w:type="dxa" w:w="4320"/>
+          </w:tcPr>
+          <w:p>
+            <w:r>
+              <w:t>Trustworthiness; speed without risk</w:t>
+            </w:r>
+          </w:p>
+        </w:tc>
+      </w:tr>
+      <w:tr>
+        <w:tc>
+          <w:tcPr>
+            <w:tcW w:type="dxa" w:w="4320"/>
+          </w:tcPr>
+          <w:p>
+            <w:r>
+              <w:t>Domain expertise</w:t>
+            </w:r>
+          </w:p>
+        </w:tc>
+        <w:tc>
+          <w:tcPr>
+            <w:tcW w:type="dxa" w:w="4320"/>
+          </w:tcPr>
+          <w:p>
+            <w:r>
+              <w:t>Judgment: knowing right from merely plausible</w:t>
+            </w:r>
+          </w:p>
+        </w:tc>
+      </w:tr>
+      <w:tr>
+        <w:tc>
+          <w:tcPr>
+            <w:tcW w:type="dxa" w:w="4320"/>
+          </w:tcPr>
+          <w:p>
+            <w:r>
+              <w:t>Systems thinking</w:t>
+            </w:r>
+          </w:p>
+        </w:tc>
+        <w:tc>
+          <w:tcPr>
+            <w:tcW w:type="dxa" w:w="4320"/>
+          </w:tcPr>
+          <w:p>
+            <w:r>
+              <w:t>Turning one-offs into repeatable engines</w:t>
+            </w:r>
+          </w:p>
+        </w:tc>
+      </w:tr>
+      <w:tr>
+        <w:tc>
+          <w:tcPr>
+            <w:tcW w:type="dxa" w:w="4320"/>
+          </w:tcPr>
+          <w:p>
+            <w:r>
+              <w:t>Learning velocity</w:t>
+            </w:r>
+          </w:p>
+        </w:tc>
+        <w:tc>
+          <w:tcPr>
+            <w:tcW w:type="dxa" w:w="4320"/>
+          </w:tcPr>
+          <w:p>
+            <w:r>
+              <w:t>Staying current without churning</w:t>
+            </w:r>
+          </w:p>
+        </w:tc>
+      </w:tr>
+      <w:tr>
+        <w:tc>
+          <w:tcPr>
+            <w:tcW w:type="dxa" w:w="4320"/>
+          </w:tcPr>
+          <w:p>
+            <w:r>
+              <w:t>Communication / delegation</w:t>
+            </w:r>
+          </w:p>
+        </w:tc>
+        <w:tc>
+          <w:tcPr>
+            <w:tcW w:type="dxa" w:w="4320"/>
+          </w:tcPr>
+          <w:p>
+            <w:r>
+              <w:t>Leverage across any task, any domain</w:t>
+            </w:r>
+          </w:p>
+        </w:tc>
+      </w:tr>
+    </w:tbl>
+    <w:p>
+      <w:r>
+        <w:t>One-line summary: an AI expert in 2026 is a domain expert with engineering-grade verification habits, context-engineering skill, and the discipline to never trust an unverified output - operating through structured loops rather than one-shot prompting.</w:t>
+      </w:r>
+    </w:p>
+    <w:p>
+      <w:r>
+        <w:br w:type="page"/>
+      </w:r>
+    </w:p>
+    <w:p>
+      <w:pPr>
+        <w:pStyle w:val="Heading1"/>
+      </w:pPr>
+      <w:r>
+        <w:t>16. The Path to Mastery - From Framework to Expertise</w:t>
+      </w:r>
+    </w:p>
+    <w:p>
+      <w:r>
+        <w:t>A framework is a map, not the territory. It is perhaps 10 percent of the journey: it shows what the destination looks like and which roads exist, but it cannot walk the roads. The gap between knowing the framework and being an expert is filled by exactly one thing: repetitions with real stakes.</w:t>
+      </w:r>
+    </w:p>
+    <w:p>
+      <w:pPr>
+        <w:pStyle w:val="Heading2"/>
+      </w:pPr>
+      <w:r>
+        <w:t>16.1 Knowledge Is Not Expertise</w:t>
+      </w:r>
+    </w:p>
+    <w:p>
+      <w:r>
+        <w:t>A top-tier AI expert is someone who has:</w:t>
+      </w:r>
+    </w:p>
+    <w:p>
+      <w:pPr>
+        <w:pStyle w:val="ListBullet"/>
+      </w:pPr>
+      <w:r>
+        <w:t>Shipped dozens of real things with agents - things with users, consequences, deadlines, and bugs found in production. Not tutorials, not toy projects. Real failures that cost real time and taught real lessons.</w:t>
+      </w:r>
+    </w:p>
+    <w:p>
+      <w:pPr>
+        <w:pStyle w:val="ListBullet"/>
+      </w:pPr>
+      <w:r>
+        <w:t>Been burned in every documented way. You do not truly internalize the Trust Trap until you have merged unverified agent code and watched it corrupt data. You do not understand context degradation until you have lost an afternoon to a five-hour session that kept contradicting itself. The framework describes these failures; only living them turns them into reflexes.</w:t>
+      </w:r>
+    </w:p>
+    <w:p>
+      <w:pPr>
+        <w:pStyle w:val="ListBullet"/>
+      </w:pPr>
+      <w:r>
+        <w:t>Built and broken evals, RAG pipelines, MCP servers, and multi-agent systems - and fixed them under pressure.</w:t>
+      </w:r>
+    </w:p>
+    <w:p>
+      <w:pPr>
+        <w:pStyle w:val="ListBullet"/>
+      </w:pPr>
+      <w:r>
+        <w:t>Accumulated taste through thousands of judgment calls: which output is actually good, which approach will scale, and when to ignore the AI entirely.</w:t>
+      </w:r>
+    </w:p>
+    <w:p>
+      <w:r>
+        <w:t>Realistic timelines for someone working intensively - daily, on real projects, with deliberate feedback loops: genuine professional competence (7/10) arrives in roughly 6-12 months; deep expertise (9/10) takes two or more years of shipping; frontier-level (10/10) means working where the field is being invented, not just applied - and it is never a stable state.</w:t>
+      </w:r>
+    </w:p>
+    <w:p>
+      <w:pPr>
+        <w:pStyle w:val="Heading2"/>
+      </w:pPr>
+      <w:r>
+        <w:t>16.2 Competency Levels</w:t>
+      </w:r>
+    </w:p>
+    <w:p>
+      <w:r>
+        <w:t>The honest ladder:</w:t>
+      </w:r>
+    </w:p>
+    <w:tbl>
+      <w:tblPr>
+        <w:tblStyle w:val="LightGrid-Accent1"/>
+        <w:tblW w:type="auto" w:w="0"/>
+        <w:tblLook w:firstColumn="1" w:firstRow="1" w:lastColumn="0" w:lastRow="0" w:noHBand="0" w:noVBand="1" w:val="04A0"/>
+      </w:tblPr>
+      <w:tblGrid>
+        <w:gridCol w:w="4320"/>
+        <w:gridCol w:w="4320"/>
+      </w:tblGrid>
+      <w:tr>
+        <w:tc>
+          <w:tcPr>
+            <w:tcW w:type="dxa" w:w="4320"/>
+          </w:tcPr>
+          <w:p>
+            <w:r>
+              <w:t>Level</w:t>
+            </w:r>
+          </w:p>
+        </w:tc>
+        <w:tc>
+          <w:tcPr>
+            <w:tcW w:type="dxa" w:w="4320"/>
+          </w:tcPr>
+          <w:p>
+            <w:r>
+              <w:t>What It Takes</w:t>
+            </w:r>
+          </w:p>
+        </w:tc>
+      </w:tr>
+      <w:tr>
+        <w:tc>
+          <w:tcPr>
+            <w:tcW w:type="dxa" w:w="4320"/>
+          </w:tcPr>
+          <w:p>
+            <w:r>
+              <w:t>5/10 - competent user</w:t>
+            </w:r>
+          </w:p>
+        </w:tc>
+        <w:tc>
+          <w:tcPr>
+            <w:tcW w:type="dxa" w:w="4320"/>
+          </w:tcPr>
+          <w:p>
+            <w:r>
+              <w:t>Weeks. Know the loops, use plan mode, maintain AGENTS.md</w:t>
+            </w:r>
+          </w:p>
+        </w:tc>
+      </w:tr>
+      <w:tr>
+        <w:tc>
+          <w:tcPr>
+            <w:tcW w:type="dxa" w:w="4320"/>
+          </w:tcPr>
+          <w:p>
+            <w:r>
+              <w:t>7/10 - professional</w:t>
+            </w:r>
+          </w:p>
+        </w:tc>
+        <w:tc>
+          <w:tcPr>
+            <w:tcW w:type="dxa" w:w="4320"/>
+          </w:tcPr>
+          <w:p>
+            <w:r>
+              <w:t>6-12 months of daily real work. Verification habits, evals, security awareness</w:t>
+            </w:r>
+          </w:p>
+        </w:tc>
+      </w:tr>
+      <w:tr>
+        <w:tc>
+          <w:tcPr>
+            <w:tcW w:type="dxa" w:w="4320"/>
+          </w:tcPr>
+          <w:p>
+            <w:r>
+              <w:t>9/10 - expert</w:t>
+            </w:r>
+          </w:p>
+        </w:tc>
+        <w:tc>
+          <w:tcPr>
+            <w:tcW w:type="dxa" w:w="4320"/>
+          </w:tcPr>
+          <w:p>
+            <w:r>
+              <w:t>2+ years of shipping. Deep domain expertise plus systems built at scale</w:t>
+            </w:r>
+          </w:p>
+        </w:tc>
+      </w:tr>
+      <w:tr>
+        <w:tc>
+          <w:tcPr>
+            <w:tcW w:type="dxa" w:w="4320"/>
+          </w:tcPr>
+          <w:p>
+            <w:r>
+              <w:t>10/10 - frontier</w:t>
+            </w:r>
+          </w:p>
+        </w:tc>
+        <w:tc>
+          <w:tcPr>
+            <w:tcW w:type="dxa" w:w="4320"/>
+          </w:tcPr>
+          <w:p>
+            <w:r>
+              <w:t>Years plus working where the field is being invented, not just applied</w:t>
+            </w:r>
+          </w:p>
+        </w:tc>
+      </w:tr>
+    </w:tbl>
+    <w:p>
+      <w:r>
+        <w:t>A 10/10 also does not exist as a stable state. The half-life problem applies: a 2024 expert who stopped learning is a 5/10 today. The score constantly decays; only the learning loop - the Meta Loop - maintains it.</w:t>
+      </w:r>
+    </w:p>
+    <w:p>
+      <w:pPr>
+        <w:pStyle w:val="Heading2"/>
+      </w:pPr>
+      <w:r>
+        <w:t>16.3 A 90-Day Practice Plan</w:t>
+      </w:r>
+    </w:p>
+    <w:p>
+      <w:r>
+        <w:t>Apply the framework to a real project (for example, the repository this document lives in):</w:t>
+      </w:r>
+    </w:p>
+    <w:p>
+      <w:pPr>
+        <w:pStyle w:val="ListBullet"/>
+      </w:pPr>
+      <w:r>
+        <w:t>Week 1: Apply the 80/20. Write one proper spec, run one full Macro Loop, add one line to AGENTS.md after the session.</w:t>
+      </w:r>
+    </w:p>
+    <w:p>
+      <w:pPr>
+        <w:pStyle w:val="ListBullet"/>
+      </w:pPr>
+      <w:r>
+        <w:t>Month 1: Build one eval (even a 10-case test of an agent workflow). Build one MCP integration. Run one two-stage debug session following SC-1 exactly.</w:t>
+      </w:r>
+    </w:p>
+    <w:p>
+      <w:pPr>
+        <w:pStyle w:val="ListBullet"/>
+      </w:pPr>
+      <w:r>
+        <w:t>Quarter: Ship one real feature end-to-end with agents, including a fresh-session review agent and a security gate. Break something deliberately and recover using the rollback loop (SC-11).</w:t>
+      </w:r>
+    </w:p>
+    <w:p>
+      <w:pPr>
+        <w:pStyle w:val="ListBullet"/>
+      </w:pPr>
+      <w:r>
+        <w:t>Continuously: After every session, three minutes of documentation (Gold Standard 9). Track the correction rate over time - that trend line is the progress toward expertise.</w:t>
+      </w:r>
+    </w:p>
+    <w:p>
+      <w:pPr>
+        <w:pStyle w:val="Heading2"/>
+      </w:pPr>
+      <w:r>
+        <w:t>16.4 Closing Note</w:t>
+      </w:r>
+    </w:p>
+    <w:p>
+      <w:r>
+        <w:t>The framework does not make you an expert. The framework executed relentlessly on real work does. The preceding chapters describe exactly what relentless execution looks like; the only remaining variable is the repetitions. The question is not "can I be a 10/10?" but "what is my next rep?"</w:t>
+      </w:r>
+    </w:p>
     <w:sectPr>
       <w:pgSz w:w="12240" w:h="15840"/>
       <w:pgMar w:top="1440" w:right="1800" w:bottom="1440" w:left="1800" w:header="720" w:footer="720" w:gutter="0"/>

</xml_diff>

<commit_message>
docs(governance): update AGENTS.md and ACE framework specification
</commit_message>
<xml_diff>
--- a/ACE_Loop_Framework_v2.docx
+++ b/ACE_Loop_Framework_v2.docx
@@ -137,6 +137,78 @@
     <w:p>
       <w:r>
         <w:t>16. The Path to Mastery - From Framework to Expertise</w:t>
+      </w:r>
+    </w:p>
+    <w:p>
+      <w:pPr>
+        <w:spacing w:before="0" w:after="0"/>
+      </w:pPr>
+      <w:r>
+        <w:rPr>
+          <w:rFonts w:ascii="Calibri" w:hAnsi="Calibri"/>
+          <w:sz w:val="22"/>
+        </w:rPr>
+        <w:t>17. Autonomous Swarm &amp; Subagent Governance</w:t>
+      </w:r>
+    </w:p>
+    <w:p>
+      <w:pPr>
+        <w:spacing w:before="0" w:after="0"/>
+      </w:pPr>
+      <w:r>
+        <w:rPr>
+          <w:rFonts w:ascii="Calibri" w:hAnsi="Calibri"/>
+          <w:sz w:val="22"/>
+        </w:rPr>
+        <w:t>18. External Infrastructure &amp; The Agent Memory Architecture</w:t>
+      </w:r>
+    </w:p>
+    <w:p>
+      <w:pPr>
+        <w:spacing w:before="0" w:after="0"/>
+      </w:pPr>
+      <w:r>
+        <w:rPr>
+          <w:rFonts w:ascii="Calibri" w:hAnsi="Calibri"/>
+          <w:sz w:val="22"/>
+        </w:rPr>
+        <w:t>19. Domain Inception, Modern Stack Selection &amp; Design Excellence</w:t>
+      </w:r>
+    </w:p>
+    <w:p>
+      <w:pPr>
+        <w:spacing w:before="0" w:after="0"/>
+      </w:pPr>
+      <w:r>
+        <w:rPr>
+          <w:rFonts w:ascii="Calibri" w:hAnsi="Calibri"/>
+          <w:sz w:val="22"/>
+        </w:rPr>
+        <w:t>20. Market Inception &amp; Competitive Gap Exploitation</w:t>
+      </w:r>
+    </w:p>
+    <w:p>
+      <w:pPr>
+        <w:spacing w:before="0" w:after="0"/>
+      </w:pPr>
+      <w:r>
+        <w:rPr>
+          <w:rFonts w:ascii="Calibri" w:hAnsi="Calibri"/>
+          <w:sz w:val="22"/>
+        </w:rPr>
+        <w:t>21. Universal Operating System &amp; Master AGENTS.md Blueprint</w:t>
+      </w:r>
+    </w:p>
+    <w:p>
+      <w:pPr>
+        <w:spacing w:before="0" w:after="0"/>
+      </w:pPr>
+      <w:r>
+        <w:rPr>
+          <w:rFonts w:ascii="Calibri" w:hAnsi="Calibri"/>
+          <w:sz w:val="22"/>
+        </w:rPr>
+        <w:t>22. Online Web Research &amp; Grounding Protocol</w:t>
       </w:r>
     </w:p>
     <w:p>
@@ -6076,6 +6148,4179 @@
       <w:r>
         <w:t>The framework does not make you an expert. The framework executed relentlessly on real work does. The preceding chapters describe exactly what relentless execution looks like; the only remaining variable is the repetitions. The question is not "can I be a 10/10?" but "what is my next rep?"</w:t>
       </w:r>
+    </w:p>
+    <w:p>
+      <w:pPr>
+        <w:pStyle w:val="Heading1"/>
+        <w:keepNext/>
+        <w:spacing w:before="280" w:after="80"/>
+      </w:pPr>
+      <w:r>
+        <w:rPr>
+          <w:rFonts w:ascii="Calibri" w:hAnsi="Calibri"/>
+          <w:b/>
+          <w:color w:val="1B3A5C"/>
+          <w:sz w:val="28"/>
+        </w:rPr>
+        <w:t>17. Autonomous Swarm &amp; Subagent Governance</w:t>
+      </w:r>
+    </w:p>
+    <w:p>
+      <w:pPr>
+        <w:pStyle w:val="Heading2"/>
+        <w:keepNext/>
+        <w:spacing w:before="200" w:after="80"/>
+      </w:pPr>
+      <w:r>
+        <w:rPr>
+          <w:rFonts w:ascii="Calibri" w:hAnsi="Calibri"/>
+          <w:b/>
+          <w:color w:val="1B3A5C"/>
+          <w:sz w:val="25"/>
+        </w:rPr>
+        <w:t>17.1 From Chatbot to Chief Orchestrator</w:t>
+      </w:r>
+    </w:p>
+    <w:p>
+      <w:pPr>
+        <w:spacing w:before="0" w:after="80" w:line="276" w:lineRule="auto"/>
+      </w:pPr>
+      <w:r>
+        <w:rPr>
+          <w:rFonts w:ascii="Calibri" w:hAnsi="Calibri"/>
+          <w:sz w:val="22"/>
+        </w:rPr>
+        <w:t>The evolution of agentic engineering requires moving beyond single-agent chat paradigms. In production workflows, a single agent attempting to hold the entire implementation, test suite, and architectural context simultaneously inevitably suffers from Context Degradation (Anti-Pattern 12.3). As active conversation and tool outputs exceed ~15,000 tokens, attention heads dilute: the agent begins hallucinating library versions, forgetting boundary conditions, and silently skipping edge-case tests.</w:t>
+      </w:r>
+    </w:p>
+    <w:p>
+      <w:pPr>
+        <w:spacing w:before="0" w:after="80" w:line="276" w:lineRule="auto"/>
+      </w:pPr>
+      <w:r>
+        <w:rPr>
+          <w:rFonts w:ascii="Calibri" w:hAnsi="Calibri"/>
+          <w:sz w:val="22"/>
+        </w:rPr>
+        <w:t>In the ACE Framework, the primary agent operates not as an individual worker, but as the Chief Orchestrator. The orchestrator autonomously parses tasks into a Directed Acyclic Graph (DAG) of dependencies and determines whether each task should execute in a single thread or be dispatched to a swarm of parallel, specialized subagents.</w:t>
+      </w:r>
+    </w:p>
+    <w:p>
+      <w:pPr>
+        <w:pStyle w:val="Heading2"/>
+        <w:keepNext/>
+        <w:spacing w:before="200" w:after="80"/>
+      </w:pPr>
+      <w:r>
+        <w:rPr>
+          <w:rFonts w:ascii="Calibri" w:hAnsi="Calibri"/>
+          <w:b/>
+          <w:color w:val="1B3A5C"/>
+          <w:sz w:val="25"/>
+        </w:rPr>
+        <w:t>17.2 The Autonomous Subagent Dispatch Matrix</w:t>
+      </w:r>
+    </w:p>
+    <w:p>
+      <w:pPr>
+        <w:spacing w:before="0" w:after="80" w:line="276" w:lineRule="auto"/>
+      </w:pPr>
+      <w:r>
+        <w:rPr>
+          <w:rFonts w:ascii="Calibri" w:hAnsi="Calibri"/>
+          <w:sz w:val="22"/>
+        </w:rPr>
+        <w:t>Subagent swarms are not deployed on arbitrary whims. They are governed by strict mathematical and topological invariants. Deploying swarms for sequential tasks creates synchronization deadlocks, whereas executing decoupled tasks with a single agent creates catastrophic context bloat.</w:t>
+      </w:r>
+    </w:p>
+    <w:tbl>
+      <w:tblPr>
+        <w:tblStyle w:val="LightGrid-Accent1"/>
+        <w:tblW w:type="auto" w:w="0"/>
+        <w:jc w:val="center"/>
+        <w:tblLook w:firstColumn="1" w:firstRow="1" w:lastColumn="0" w:lastRow="0" w:noHBand="0" w:noVBand="1" w:val="04A0"/>
+      </w:tblPr>
+      <w:tblGrid>
+        <w:gridCol w:w="2160"/>
+        <w:gridCol w:w="2160"/>
+        <w:gridCol w:w="2160"/>
+        <w:gridCol w:w="2160"/>
+      </w:tblGrid>
+      <w:tr>
+        <w:tc>
+          <w:tcPr>
+            <w:tcW w:type="dxa" w:w="2160"/>
+            <w:shd w:fill="1B3A5C"/>
+            <w:tcMar>
+              <w:top w:w="100" w:type="dxa"/>
+              <w:bottom w:w="100" w:type="dxa"/>
+              <w:left w:w="140" w:type="dxa"/>
+              <w:right w:w="140" w:type="dxa"/>
+            </w:tcMar>
+          </w:tcPr>
+          <w:p>
+            <w:pPr>
+              <w:spacing w:before="0" w:after="0"/>
+            </w:pPr>
+            <w:r>
+              <w:rPr>
+                <w:rFonts w:ascii="Calibri" w:hAnsi="Calibri"/>
+                <w:b/>
+                <w:color w:val="FFFFFF"/>
+                <w:sz w:val="20"/>
+              </w:rPr>
+              <w:t>Operational Vector</w:t>
+            </w:r>
+          </w:p>
+        </w:tc>
+        <w:tc>
+          <w:tcPr>
+            <w:tcW w:type="dxa" w:w="2160"/>
+            <w:shd w:fill="1B3A5C"/>
+            <w:tcMar>
+              <w:top w:w="100" w:type="dxa"/>
+              <w:bottom w:w="100" w:type="dxa"/>
+              <w:left w:w="140" w:type="dxa"/>
+              <w:right w:w="140" w:type="dxa"/>
+            </w:tcMar>
+          </w:tcPr>
+          <w:p>
+            <w:pPr>
+              <w:spacing w:before="0" w:after="0"/>
+            </w:pPr>
+            <w:r>
+              <w:rPr>
+                <w:rFonts w:ascii="Calibri" w:hAnsi="Calibri"/>
+                <w:b/>
+                <w:color w:val="FFFFFF"/>
+                <w:sz w:val="20"/>
+              </w:rPr>
+              <w:t>Recommended Agent Mode</w:t>
+            </w:r>
+          </w:p>
+        </w:tc>
+        <w:tc>
+          <w:tcPr>
+            <w:tcW w:type="dxa" w:w="2160"/>
+            <w:shd w:fill="1B3A5C"/>
+            <w:tcMar>
+              <w:top w:w="100" w:type="dxa"/>
+              <w:bottom w:w="100" w:type="dxa"/>
+              <w:left w:w="140" w:type="dxa"/>
+              <w:right w:w="140" w:type="dxa"/>
+            </w:tcMar>
+          </w:tcPr>
+          <w:p>
+            <w:pPr>
+              <w:spacing w:before="0" w:after="0"/>
+            </w:pPr>
+            <w:r>
+              <w:rPr>
+                <w:rFonts w:ascii="Calibri" w:hAnsi="Calibri"/>
+                <w:b/>
+                <w:color w:val="FFFFFF"/>
+                <w:sz w:val="20"/>
+              </w:rPr>
+              <w:t>Execution Mechanism</w:t>
+            </w:r>
+          </w:p>
+        </w:tc>
+        <w:tc>
+          <w:tcPr>
+            <w:tcW w:type="dxa" w:w="2160"/>
+            <w:shd w:fill="1B3A5C"/>
+            <w:tcMar>
+              <w:top w:w="100" w:type="dxa"/>
+              <w:bottom w:w="100" w:type="dxa"/>
+              <w:left w:w="140" w:type="dxa"/>
+              <w:right w:w="140" w:type="dxa"/>
+            </w:tcMar>
+          </w:tcPr>
+          <w:p>
+            <w:pPr>
+              <w:spacing w:before="0" w:after="0"/>
+            </w:pPr>
+            <w:r>
+              <w:rPr>
+                <w:rFonts w:ascii="Calibri" w:hAnsi="Calibri"/>
+                <w:b/>
+                <w:color w:val="FFFFFF"/>
+                <w:sz w:val="20"/>
+              </w:rPr>
+              <w:t>Failure Mode If Violated</w:t>
+            </w:r>
+          </w:p>
+        </w:tc>
+      </w:tr>
+      <w:tr>
+        <w:tc>
+          <w:tcPr>
+            <w:tcW w:type="dxa" w:w="2160"/>
+            <w:tcMar>
+              <w:top w:w="80" w:type="dxa"/>
+              <w:bottom w:w="80" w:type="dxa"/>
+              <w:left w:w="120" w:type="dxa"/>
+              <w:right w:w="120" w:type="dxa"/>
+            </w:tcMar>
+          </w:tcPr>
+          <w:p>
+            <w:pPr>
+              <w:spacing w:before="0" w:after="0" w:line="264" w:lineRule="auto"/>
+            </w:pPr>
+            <w:r>
+              <w:rPr>
+                <w:rFonts w:ascii="Calibri" w:hAnsi="Calibri"/>
+                <w:sz w:val="19"/>
+              </w:rPr>
+              <w:t>Adversarial Review (SC-6 &amp; SC-8)</w:t>
+            </w:r>
+          </w:p>
+        </w:tc>
+        <w:tc>
+          <w:tcPr>
+            <w:tcW w:type="dxa" w:w="2160"/>
+            <w:tcMar>
+              <w:top w:w="80" w:type="dxa"/>
+              <w:bottom w:w="80" w:type="dxa"/>
+              <w:left w:w="120" w:type="dxa"/>
+              <w:right w:w="120" w:type="dxa"/>
+            </w:tcMar>
+          </w:tcPr>
+          <w:p>
+            <w:pPr>
+              <w:spacing w:before="0" w:after="0" w:line="264" w:lineRule="auto"/>
+            </w:pPr>
+            <w:r>
+              <w:rPr>
+                <w:rFonts w:ascii="Calibri" w:hAnsi="Calibri"/>
+                <w:sz w:val="19"/>
+              </w:rPr>
+              <w:t>Swarm (Isolated Auditor)</w:t>
+            </w:r>
+          </w:p>
+        </w:tc>
+        <w:tc>
+          <w:tcPr>
+            <w:tcW w:type="dxa" w:w="2160"/>
+            <w:tcMar>
+              <w:top w:w="80" w:type="dxa"/>
+              <w:bottom w:w="80" w:type="dxa"/>
+              <w:left w:w="120" w:type="dxa"/>
+              <w:right w:w="120" w:type="dxa"/>
+            </w:tcMar>
+          </w:tcPr>
+          <w:p>
+            <w:pPr>
+              <w:spacing w:before="0" w:after="0" w:line="264" w:lineRule="auto"/>
+            </w:pPr>
+            <w:r>
+              <w:rPr>
+                <w:rFonts w:ascii="Calibri" w:hAnsi="Calibri"/>
+                <w:sz w:val="19"/>
+              </w:rPr>
+              <w:t>Fresh, unpolluted context subagent with zero builder bias</w:t>
+            </w:r>
+          </w:p>
+        </w:tc>
+        <w:tc>
+          <w:tcPr>
+            <w:tcW w:type="dxa" w:w="2160"/>
+            <w:tcMar>
+              <w:top w:w="80" w:type="dxa"/>
+              <w:bottom w:w="80" w:type="dxa"/>
+              <w:left w:w="120" w:type="dxa"/>
+              <w:right w:w="120" w:type="dxa"/>
+            </w:tcMar>
+          </w:tcPr>
+          <w:p>
+            <w:pPr>
+              <w:spacing w:before="0" w:after="0" w:line="264" w:lineRule="auto"/>
+            </w:pPr>
+            <w:r>
+              <w:rPr>
+                <w:rFonts w:ascii="Calibri" w:hAnsi="Calibri"/>
+                <w:sz w:val="19"/>
+              </w:rPr>
+              <w:t>The Trust Trap &amp; Confirmation Bias (Author rubber-stamps own flaws)</w:t>
+            </w:r>
+          </w:p>
+        </w:tc>
+      </w:tr>
+      <w:tr>
+        <w:tc>
+          <w:tcPr>
+            <w:tcW w:type="dxa" w:w="2160"/>
+            <w:shd w:fill="F7F9FB"/>
+            <w:tcMar>
+              <w:top w:w="80" w:type="dxa"/>
+              <w:bottom w:w="80" w:type="dxa"/>
+              <w:left w:w="120" w:type="dxa"/>
+              <w:right w:w="120" w:type="dxa"/>
+            </w:tcMar>
+          </w:tcPr>
+          <w:p>
+            <w:pPr>
+              <w:spacing w:before="0" w:after="0" w:line="264" w:lineRule="auto"/>
+            </w:pPr>
+            <w:r>
+              <w:rPr>
+                <w:rFonts w:ascii="Calibri" w:hAnsi="Calibri"/>
+                <w:sz w:val="19"/>
+              </w:rPr>
+              <w:t>Horizontal Decoupling</w:t>
+            </w:r>
+          </w:p>
+        </w:tc>
+        <w:tc>
+          <w:tcPr>
+            <w:tcW w:type="dxa" w:w="2160"/>
+            <w:shd w:fill="F7F9FB"/>
+            <w:tcMar>
+              <w:top w:w="80" w:type="dxa"/>
+              <w:bottom w:w="80" w:type="dxa"/>
+              <w:left w:w="120" w:type="dxa"/>
+              <w:right w:w="120" w:type="dxa"/>
+            </w:tcMar>
+          </w:tcPr>
+          <w:p>
+            <w:pPr>
+              <w:spacing w:before="0" w:after="0" w:line="264" w:lineRule="auto"/>
+            </w:pPr>
+            <w:r>
+              <w:rPr>
+                <w:rFonts w:ascii="Calibri" w:hAnsi="Calibri"/>
+                <w:sz w:val="19"/>
+              </w:rPr>
+              <w:t>Swarm (Parallel Workers)</w:t>
+            </w:r>
+          </w:p>
+        </w:tc>
+        <w:tc>
+          <w:tcPr>
+            <w:tcW w:type="dxa" w:w="2160"/>
+            <w:shd w:fill="F7F9FB"/>
+            <w:tcMar>
+              <w:top w:w="80" w:type="dxa"/>
+              <w:bottom w:w="80" w:type="dxa"/>
+              <w:left w:w="120" w:type="dxa"/>
+              <w:right w:w="120" w:type="dxa"/>
+            </w:tcMar>
+          </w:tcPr>
+          <w:p>
+            <w:pPr>
+              <w:spacing w:before="0" w:after="0" w:line="264" w:lineRule="auto"/>
+            </w:pPr>
+            <w:r>
+              <w:rPr>
+                <w:rFonts w:ascii="Calibri" w:hAnsi="Calibri"/>
+                <w:sz w:val="19"/>
+              </w:rPr>
+              <w:t>Isolated Git worktrees per directory (/src vs /frontend)</w:t>
+            </w:r>
+          </w:p>
+        </w:tc>
+        <w:tc>
+          <w:tcPr>
+            <w:tcW w:type="dxa" w:w="2160"/>
+            <w:shd w:fill="F7F9FB"/>
+            <w:tcMar>
+              <w:top w:w="80" w:type="dxa"/>
+              <w:bottom w:w="80" w:type="dxa"/>
+              <w:left w:w="120" w:type="dxa"/>
+              <w:right w:w="120" w:type="dxa"/>
+            </w:tcMar>
+          </w:tcPr>
+          <w:p>
+            <w:pPr>
+              <w:spacing w:before="0" w:after="0" w:line="264" w:lineRule="auto"/>
+            </w:pPr>
+            <w:r>
+              <w:rPr>
+                <w:rFonts w:ascii="Calibri" w:hAnsi="Calibri"/>
+                <w:sz w:val="19"/>
+              </w:rPr>
+              <w:t>Context thrashing, sluggish execution, token bloat</w:t>
+            </w:r>
+          </w:p>
+        </w:tc>
+      </w:tr>
+      <w:tr>
+        <w:tc>
+          <w:tcPr>
+            <w:tcW w:type="dxa" w:w="2160"/>
+            <w:tcMar>
+              <w:top w:w="80" w:type="dxa"/>
+              <w:bottom w:w="80" w:type="dxa"/>
+              <w:left w:w="120" w:type="dxa"/>
+              <w:right w:w="120" w:type="dxa"/>
+            </w:tcMar>
+          </w:tcPr>
+          <w:p>
+            <w:pPr>
+              <w:spacing w:before="0" w:after="0" w:line="264" w:lineRule="auto"/>
+            </w:pPr>
+            <w:r>
+              <w:rPr>
+                <w:rFonts w:ascii="Calibri" w:hAnsi="Calibri"/>
+                <w:sz w:val="19"/>
+              </w:rPr>
+              <w:t>Large Batch Migrations (SC-7)</w:t>
+            </w:r>
+          </w:p>
+        </w:tc>
+        <w:tc>
+          <w:tcPr>
+            <w:tcW w:type="dxa" w:w="2160"/>
+            <w:tcMar>
+              <w:top w:w="80" w:type="dxa"/>
+              <w:bottom w:w="80" w:type="dxa"/>
+              <w:left w:w="120" w:type="dxa"/>
+              <w:right w:w="120" w:type="dxa"/>
+            </w:tcMar>
+          </w:tcPr>
+          <w:p>
+            <w:pPr>
+              <w:spacing w:before="0" w:after="0" w:line="264" w:lineRule="auto"/>
+            </w:pPr>
+            <w:r>
+              <w:rPr>
+                <w:rFonts w:ascii="Calibri" w:hAnsi="Calibri"/>
+                <w:sz w:val="19"/>
+              </w:rPr>
+              <w:t>Swarm (Chunked Workers)</w:t>
+            </w:r>
+          </w:p>
+        </w:tc>
+        <w:tc>
+          <w:tcPr>
+            <w:tcW w:type="dxa" w:w="2160"/>
+            <w:tcMar>
+              <w:top w:w="80" w:type="dxa"/>
+              <w:bottom w:w="80" w:type="dxa"/>
+              <w:left w:w="120" w:type="dxa"/>
+              <w:right w:w="120" w:type="dxa"/>
+            </w:tcMar>
+          </w:tcPr>
+          <w:p>
+            <w:pPr>
+              <w:spacing w:before="0" w:after="0" w:line="264" w:lineRule="auto"/>
+            </w:pPr>
+            <w:r>
+              <w:rPr>
+                <w:rFonts w:ascii="Calibri" w:hAnsi="Calibri"/>
+                <w:sz w:val="19"/>
+              </w:rPr>
+              <w:t>Slice 20+ routes/files into 4-file atomic worker packets</w:t>
+            </w:r>
+          </w:p>
+        </w:tc>
+        <w:tc>
+          <w:tcPr>
+            <w:tcW w:type="dxa" w:w="2160"/>
+            <w:tcMar>
+              <w:top w:w="80" w:type="dxa"/>
+              <w:bottom w:w="80" w:type="dxa"/>
+              <w:left w:w="120" w:type="dxa"/>
+              <w:right w:w="120" w:type="dxa"/>
+            </w:tcMar>
+          </w:tcPr>
+          <w:p>
+            <w:pPr>
+              <w:spacing w:before="0" w:after="0" w:line="264" w:lineRule="auto"/>
+            </w:pPr>
+            <w:r>
+              <w:rPr>
+                <w:rFonts w:ascii="Calibri" w:hAnsi="Calibri"/>
+                <w:sz w:val="19"/>
+              </w:rPr>
+              <w:t>Timeout crashes, memory exhaustion, partial half-broken commits</w:t>
+            </w:r>
+          </w:p>
+        </w:tc>
+      </w:tr>
+      <w:tr>
+        <w:tc>
+          <w:tcPr>
+            <w:tcW w:type="dxa" w:w="2160"/>
+            <w:shd w:fill="F7F9FB"/>
+            <w:tcMar>
+              <w:top w:w="80" w:type="dxa"/>
+              <w:bottom w:w="80" w:type="dxa"/>
+              <w:left w:w="120" w:type="dxa"/>
+              <w:right w:w="120" w:type="dxa"/>
+            </w:tcMar>
+          </w:tcPr>
+          <w:p>
+            <w:pPr>
+              <w:spacing w:before="0" w:after="0" w:line="264" w:lineRule="auto"/>
+            </w:pPr>
+            <w:r>
+              <w:rPr>
+                <w:rFonts w:ascii="Calibri" w:hAnsi="Calibri"/>
+                <w:sz w:val="19"/>
+              </w:rPr>
+              <w:t>Deep Research &amp; Mapping (SC-4)</w:t>
+            </w:r>
+          </w:p>
+        </w:tc>
+        <w:tc>
+          <w:tcPr>
+            <w:tcW w:type="dxa" w:w="2160"/>
+            <w:shd w:fill="F7F9FB"/>
+            <w:tcMar>
+              <w:top w:w="80" w:type="dxa"/>
+              <w:bottom w:w="80" w:type="dxa"/>
+              <w:left w:w="120" w:type="dxa"/>
+              <w:right w:w="120" w:type="dxa"/>
+            </w:tcMar>
+          </w:tcPr>
+          <w:p>
+            <w:pPr>
+              <w:spacing w:before="0" w:after="0" w:line="264" w:lineRule="auto"/>
+            </w:pPr>
+            <w:r>
+              <w:rPr>
+                <w:rFonts w:ascii="Calibri" w:hAnsi="Calibri"/>
+                <w:sz w:val="19"/>
+              </w:rPr>
+              <w:t>Swarm (Explorer)</w:t>
+            </w:r>
+          </w:p>
+        </w:tc>
+        <w:tc>
+          <w:tcPr>
+            <w:tcW w:type="dxa" w:w="2160"/>
+            <w:shd w:fill="F7F9FB"/>
+            <w:tcMar>
+              <w:top w:w="80" w:type="dxa"/>
+              <w:bottom w:w="80" w:type="dxa"/>
+              <w:left w:w="120" w:type="dxa"/>
+              <w:right w:w="120" w:type="dxa"/>
+            </w:tcMar>
+          </w:tcPr>
+          <w:p>
+            <w:pPr>
+              <w:spacing w:before="0" w:after="0" w:line="264" w:lineRule="auto"/>
+            </w:pPr>
+            <w:r>
+              <w:rPr>
+                <w:rFonts w:ascii="Calibri" w:hAnsi="Calibri"/>
+                <w:sz w:val="19"/>
+              </w:rPr>
+              <w:t>Read-only subagent searches external docs and returns concise summary</w:t>
+            </w:r>
+          </w:p>
+        </w:tc>
+        <w:tc>
+          <w:tcPr>
+            <w:tcW w:type="dxa" w:w="2160"/>
+            <w:shd w:fill="F7F9FB"/>
+            <w:tcMar>
+              <w:top w:w="80" w:type="dxa"/>
+              <w:bottom w:w="80" w:type="dxa"/>
+              <w:left w:w="120" w:type="dxa"/>
+              <w:right w:w="120" w:type="dxa"/>
+            </w:tcMar>
+          </w:tcPr>
+          <w:p>
+            <w:pPr>
+              <w:spacing w:before="0" w:after="0" w:line="264" w:lineRule="auto"/>
+            </w:pPr>
+            <w:r>
+              <w:rPr>
+                <w:rFonts w:ascii="Calibri" w:hAnsi="Calibri"/>
+                <w:sz w:val="19"/>
+              </w:rPr>
+              <w:t>Orchestrator context window poisoned with 30,000 tokens of raw HTML</w:t>
+            </w:r>
+          </w:p>
+        </w:tc>
+      </w:tr>
+      <w:tr>
+        <w:tc>
+          <w:tcPr>
+            <w:tcW w:type="dxa" w:w="2160"/>
+            <w:tcMar>
+              <w:top w:w="80" w:type="dxa"/>
+              <w:bottom w:w="80" w:type="dxa"/>
+              <w:left w:w="120" w:type="dxa"/>
+              <w:right w:w="120" w:type="dxa"/>
+            </w:tcMar>
+          </w:tcPr>
+          <w:p>
+            <w:pPr>
+              <w:spacing w:before="0" w:after="0" w:line="264" w:lineRule="auto"/>
+            </w:pPr>
+            <w:r>
+              <w:rPr>
+                <w:rFonts w:ascii="Calibri" w:hAnsi="Calibri"/>
+                <w:sz w:val="19"/>
+              </w:rPr>
+              <w:t>Strictly Sequential Steps</w:t>
+            </w:r>
+          </w:p>
+        </w:tc>
+        <w:tc>
+          <w:tcPr>
+            <w:tcW w:type="dxa" w:w="2160"/>
+            <w:tcMar>
+              <w:top w:w="80" w:type="dxa"/>
+              <w:bottom w:w="80" w:type="dxa"/>
+              <w:left w:w="120" w:type="dxa"/>
+              <w:right w:w="120" w:type="dxa"/>
+            </w:tcMar>
+          </w:tcPr>
+          <w:p>
+            <w:pPr>
+              <w:spacing w:before="0" w:after="0" w:line="264" w:lineRule="auto"/>
+            </w:pPr>
+            <w:r>
+              <w:rPr>
+                <w:rFonts w:ascii="Calibri" w:hAnsi="Calibri"/>
+                <w:sz w:val="19"/>
+              </w:rPr>
+              <w:t>Single Agent (Retained)</w:t>
+            </w:r>
+          </w:p>
+        </w:tc>
+        <w:tc>
+          <w:tcPr>
+            <w:tcW w:type="dxa" w:w="2160"/>
+            <w:tcMar>
+              <w:top w:w="80" w:type="dxa"/>
+              <w:bottom w:w="80" w:type="dxa"/>
+              <w:left w:w="120" w:type="dxa"/>
+              <w:right w:w="120" w:type="dxa"/>
+            </w:tcMar>
+          </w:tcPr>
+          <w:p>
+            <w:pPr>
+              <w:spacing w:before="0" w:after="0" w:line="264" w:lineRule="auto"/>
+            </w:pPr>
+            <w:r>
+              <w:rPr>
+                <w:rFonts w:ascii="Calibri" w:hAnsi="Calibri"/>
+                <w:sz w:val="19"/>
+              </w:rPr>
+              <w:t>Meso Loop step-by-step pipeline (Schema -&gt; API -&gt; Integration Test)</w:t>
+            </w:r>
+          </w:p>
+        </w:tc>
+        <w:tc>
+          <w:tcPr>
+            <w:tcW w:type="dxa" w:w="2160"/>
+            <w:tcMar>
+              <w:top w:w="80" w:type="dxa"/>
+              <w:bottom w:w="80" w:type="dxa"/>
+              <w:left w:w="120" w:type="dxa"/>
+              <w:right w:w="120" w:type="dxa"/>
+            </w:tcMar>
+          </w:tcPr>
+          <w:p>
+            <w:pPr>
+              <w:spacing w:before="0" w:after="0" w:line="264" w:lineRule="auto"/>
+            </w:pPr>
+            <w:r>
+              <w:rPr>
+                <w:rFonts w:ascii="Calibri" w:hAnsi="Calibri"/>
+                <w:sz w:val="19"/>
+              </w:rPr>
+              <w:t>Synchronization race conditions, broken dependencies, hallucinated interfaces</w:t>
+            </w:r>
+          </w:p>
+        </w:tc>
+      </w:tr>
+      <w:tr>
+        <w:tc>
+          <w:tcPr>
+            <w:tcW w:type="dxa" w:w="2160"/>
+            <w:shd w:fill="F7F9FB"/>
+            <w:tcMar>
+              <w:top w:w="80" w:type="dxa"/>
+              <w:bottom w:w="80" w:type="dxa"/>
+              <w:left w:w="120" w:type="dxa"/>
+              <w:right w:w="120" w:type="dxa"/>
+            </w:tcMar>
+          </w:tcPr>
+          <w:p>
+            <w:pPr>
+              <w:spacing w:before="0" w:after="0" w:line="264" w:lineRule="auto"/>
+            </w:pPr>
+            <w:r>
+              <w:rPr>
+                <w:rFonts w:ascii="Calibri" w:hAnsi="Calibri"/>
+                <w:sz w:val="19"/>
+              </w:rPr>
+              <w:t>Micro Bugfix (&lt;15 mins, SC-2)</w:t>
+            </w:r>
+          </w:p>
+        </w:tc>
+        <w:tc>
+          <w:tcPr>
+            <w:tcW w:type="dxa" w:w="2160"/>
+            <w:shd w:fill="F7F9FB"/>
+            <w:tcMar>
+              <w:top w:w="80" w:type="dxa"/>
+              <w:bottom w:w="80" w:type="dxa"/>
+              <w:left w:w="120" w:type="dxa"/>
+              <w:right w:w="120" w:type="dxa"/>
+            </w:tcMar>
+          </w:tcPr>
+          <w:p>
+            <w:pPr>
+              <w:spacing w:before="0" w:after="0" w:line="264" w:lineRule="auto"/>
+            </w:pPr>
+            <w:r>
+              <w:rPr>
+                <w:rFonts w:ascii="Calibri" w:hAnsi="Calibri"/>
+                <w:sz w:val="19"/>
+              </w:rPr>
+              <w:t>Single Agent (Retained)</w:t>
+            </w:r>
+          </w:p>
+        </w:tc>
+        <w:tc>
+          <w:tcPr>
+            <w:tcW w:type="dxa" w:w="2160"/>
+            <w:shd w:fill="F7F9FB"/>
+            <w:tcMar>
+              <w:top w:w="80" w:type="dxa"/>
+              <w:bottom w:w="80" w:type="dxa"/>
+              <w:left w:w="120" w:type="dxa"/>
+              <w:right w:w="120" w:type="dxa"/>
+            </w:tcMar>
+          </w:tcPr>
+          <w:p>
+            <w:pPr>
+              <w:spacing w:before="0" w:after="0" w:line="264" w:lineRule="auto"/>
+            </w:pPr>
+            <w:r>
+              <w:rPr>
+                <w:rFonts w:ascii="Calibri" w:hAnsi="Calibri"/>
+                <w:sz w:val="19"/>
+              </w:rPr>
+              <w:t>Reproduce-first failing test followed by targeted single-file fix</w:t>
+            </w:r>
+          </w:p>
+        </w:tc>
+        <w:tc>
+          <w:tcPr>
+            <w:tcW w:type="dxa" w:w="2160"/>
+            <w:shd w:fill="F7F9FB"/>
+            <w:tcMar>
+              <w:top w:w="80" w:type="dxa"/>
+              <w:bottom w:w="80" w:type="dxa"/>
+              <w:left w:w="120" w:type="dxa"/>
+              <w:right w:w="120" w:type="dxa"/>
+            </w:tcMar>
+          </w:tcPr>
+          <w:p>
+            <w:pPr>
+              <w:spacing w:before="0" w:after="0" w:line="264" w:lineRule="auto"/>
+            </w:pPr>
+            <w:r>
+              <w:rPr>
+                <w:rFonts w:ascii="Calibri" w:hAnsi="Calibri"/>
+                <w:sz w:val="19"/>
+              </w:rPr>
+              <w:t>Subagent coordination overhead exceeds fix duration 5x</w:t>
+            </w:r>
+          </w:p>
+        </w:tc>
+      </w:tr>
+      <w:tr>
+        <w:tc>
+          <w:tcPr>
+            <w:tcW w:type="dxa" w:w="2160"/>
+            <w:tcMar>
+              <w:top w:w="80" w:type="dxa"/>
+              <w:bottom w:w="80" w:type="dxa"/>
+              <w:left w:w="120" w:type="dxa"/>
+              <w:right w:w="120" w:type="dxa"/>
+            </w:tcMar>
+          </w:tcPr>
+          <w:p>
+            <w:pPr>
+              <w:spacing w:before="0" w:after="0" w:line="264" w:lineRule="auto"/>
+            </w:pPr>
+            <w:r>
+              <w:rPr>
+                <w:rFonts w:ascii="Calibri" w:hAnsi="Calibri"/>
+                <w:sz w:val="19"/>
+              </w:rPr>
+              <w:t>Shared File Mutations</w:t>
+            </w:r>
+          </w:p>
+        </w:tc>
+        <w:tc>
+          <w:tcPr>
+            <w:tcW w:type="dxa" w:w="2160"/>
+            <w:tcMar>
+              <w:top w:w="80" w:type="dxa"/>
+              <w:bottom w:w="80" w:type="dxa"/>
+              <w:left w:w="120" w:type="dxa"/>
+              <w:right w:w="120" w:type="dxa"/>
+            </w:tcMar>
+          </w:tcPr>
+          <w:p>
+            <w:pPr>
+              <w:spacing w:before="0" w:after="0" w:line="264" w:lineRule="auto"/>
+            </w:pPr>
+            <w:r>
+              <w:rPr>
+                <w:rFonts w:ascii="Calibri" w:hAnsi="Calibri"/>
+                <w:sz w:val="19"/>
+              </w:rPr>
+              <w:t>Single Agent (Retained)</w:t>
+            </w:r>
+          </w:p>
+        </w:tc>
+        <w:tc>
+          <w:tcPr>
+            <w:tcW w:type="dxa" w:w="2160"/>
+            <w:tcMar>
+              <w:top w:w="80" w:type="dxa"/>
+              <w:bottom w:w="80" w:type="dxa"/>
+              <w:left w:w="120" w:type="dxa"/>
+              <w:right w:w="120" w:type="dxa"/>
+            </w:tcMar>
+          </w:tcPr>
+          <w:p>
+            <w:pPr>
+              <w:spacing w:before="0" w:after="0" w:line="264" w:lineRule="auto"/>
+            </w:pPr>
+            <w:r>
+              <w:rPr>
+                <w:rFonts w:ascii="Calibri" w:hAnsi="Calibri"/>
+                <w:sz w:val="19"/>
+              </w:rPr>
+              <w:t>Atomic locking within single execution thread</w:t>
+            </w:r>
+          </w:p>
+        </w:tc>
+        <w:tc>
+          <w:tcPr>
+            <w:tcW w:type="dxa" w:w="2160"/>
+            <w:tcMar>
+              <w:top w:w="80" w:type="dxa"/>
+              <w:bottom w:w="80" w:type="dxa"/>
+              <w:left w:w="120" w:type="dxa"/>
+              <w:right w:w="120" w:type="dxa"/>
+            </w:tcMar>
+          </w:tcPr>
+          <w:p>
+            <w:pPr>
+              <w:spacing w:before="0" w:after="0" w:line="264" w:lineRule="auto"/>
+            </w:pPr>
+            <w:r>
+              <w:rPr>
+                <w:rFonts w:ascii="Calibri" w:hAnsi="Calibri"/>
+                <w:sz w:val="19"/>
+              </w:rPr>
+              <w:t>Git merge conflicts, clobbered changes, irreproducible test failures</w:t>
+            </w:r>
+          </w:p>
+        </w:tc>
+      </w:tr>
+    </w:tbl>
+    <w:p>
+      <w:pPr>
+        <w:spacing w:before="80" w:after="120"/>
+      </w:pPr>
+    </w:p>
+    <w:p>
+      <w:pPr>
+        <w:pStyle w:val="Heading2"/>
+        <w:keepNext/>
+        <w:spacing w:before="200" w:after="80"/>
+      </w:pPr>
+      <w:r>
+        <w:rPr>
+          <w:rFonts w:ascii="Calibri" w:hAnsi="Calibri"/>
+          <w:b/>
+          <w:color w:val="1B3A5C"/>
+          <w:sz w:val="25"/>
+        </w:rPr>
+        <w:t>17.3 The Cognitive Bias Trap &amp; The NexusPay Adversarial Case Study</w:t>
+      </w:r>
+    </w:p>
+    <w:p>
+      <w:pPr>
+        <w:spacing w:before="0" w:after="80" w:line="276" w:lineRule="auto"/>
+      </w:pPr>
+      <w:r>
+        <w:rPr>
+          <w:rFonts w:ascii="Calibri" w:hAnsi="Calibri"/>
+          <w:sz w:val="22"/>
+        </w:rPr>
+        <w:t>The absolute cardinal rule of swarm orchestration is: The builder agent must NEVER be the sole reviewer. When an agent writes code, its reasoning trace is psychologically primed by its implementation assumptions. It inherently believes its logic is sound because its own 28 unit tests pass.</w:t>
+      </w:r>
+    </w:p>
+    <w:p>
+      <w:pPr>
+        <w:spacing w:before="0" w:after="80" w:line="276" w:lineRule="auto"/>
+      </w:pPr>
+      <w:r>
+        <w:rPr>
+          <w:rFonts w:ascii="Calibri" w:hAnsi="Calibri"/>
+          <w:sz w:val="22"/>
+        </w:rPr>
+        <w:t>In the NexusPay reference implementation, the builder agent constructed a high-concurrency fintech payment engine with 28 passing unit tests. When an independent Adversarial Reviewer Subagent was dispatched with clean context and strict financial audit instructions, it caught a catastrophic flaw: the currency engine accepted negative fee percentages (e.g. -5%), allowing malicious actors to siphon treasury funds during fee calculations. The orchestrator remediated the finding and expanded the test suite to 38 passing tests in 0.23 seconds. Single-agent review would have shipped this multi-million dollar exploit to production.</w:t>
+      </w:r>
+    </w:p>
+    <w:tbl>
+      <w:tblPr>
+        <w:tblW w:type="auto" w:w="0"/>
+        <w:jc w:val="center"/>
+        <w:tblLook w:firstColumn="1" w:firstRow="1" w:lastColumn="0" w:lastRow="0" w:noHBand="0" w:noVBand="1" w:val="04A0"/>
+      </w:tblPr>
+      <w:tblGrid>
+        <w:gridCol w:w="8640"/>
+      </w:tblGrid>
+      <w:tr>
+        <w:tc>
+          <w:tcPr>
+            <w:tcW w:type="dxa" w:w="8640"/>
+            <w:shd w:fill="F0F4F8"/>
+            <w:tcMar>
+              <w:top w:w="140" w:type="dxa"/>
+              <w:bottom w:w="140" w:type="dxa"/>
+              <w:left w:w="200" w:type="dxa"/>
+              <w:right w:w="200" w:type="dxa"/>
+            </w:tcMar>
+            <w:tcBorders>
+              <w:top w:val="none"/>
+              <w:left w:val="single" w:sz="24" w:space="0" w:color="1B3A5C"/>
+              <w:bottom w:val="none"/>
+              <w:right w:val="none"/>
+            </w:tcBorders>
+          </w:tcPr>
+          <w:p>
+            <w:pPr>
+              <w:spacing w:before="0" w:after="40"/>
+            </w:pPr>
+            <w:r>
+              <w:rPr>
+                <w:rFonts w:ascii="Calibri" w:hAnsi="Calibri"/>
+                <w:b/>
+                <w:color w:val="1B3A5C"/>
+                <w:sz w:val="22"/>
+              </w:rPr>
+              <w:t>★ ORCHESTRATOR INVARIANT</w:t>
+              <w:br/>
+            </w:r>
+            <w:r>
+              <w:rPr>
+                <w:rFonts w:ascii="Calibri" w:hAnsi="Calibri"/>
+                <w:sz w:val="21"/>
+              </w:rPr>
+              <w:t>The Orchestrator agent evaluates the Subagent Dispatch Matrix autonomously. The human operator never micromanages swarm deployment; the human's role is restricted to approving the high-level Meso Loop plan and validating terminal test evidence.</w:t>
+            </w:r>
+          </w:p>
+        </w:tc>
+      </w:tr>
+    </w:tbl>
+    <w:p>
+      <w:pPr>
+        <w:spacing w:before="40" w:after="80"/>
+      </w:pPr>
+    </w:p>
+    <w:p>
+      <w:pPr>
+        <w:pStyle w:val="Heading1"/>
+        <w:keepNext/>
+        <w:spacing w:before="280" w:after="80"/>
+      </w:pPr>
+      <w:r>
+        <w:rPr>
+          <w:rFonts w:ascii="Calibri" w:hAnsi="Calibri"/>
+          <w:b/>
+          <w:color w:val="1B3A5C"/>
+          <w:sz w:val="28"/>
+        </w:rPr>
+        <w:t>18. External Infrastructure &amp; The Agent Memory Architecture</w:t>
+      </w:r>
+    </w:p>
+    <w:p>
+      <w:pPr>
+        <w:pStyle w:val="Heading2"/>
+        <w:keepNext/>
+        <w:spacing w:before="200" w:after="80"/>
+      </w:pPr>
+      <w:r>
+        <w:rPr>
+          <w:rFonts w:ascii="Calibri" w:hAnsi="Calibri"/>
+          <w:b/>
+          <w:color w:val="1B3A5C"/>
+          <w:sz w:val="25"/>
+        </w:rPr>
+        <w:t>18.1 Demystifying The 'Vector Database Trap'</w:t>
+      </w:r>
+    </w:p>
+    <w:p>
+      <w:pPr>
+        <w:spacing w:before="0" w:after="80" w:line="276" w:lineRule="auto"/>
+      </w:pPr>
+      <w:r>
+        <w:rPr>
+          <w:rFonts w:ascii="Calibri" w:hAnsi="Calibri"/>
+          <w:sz w:val="22"/>
+        </w:rPr>
+        <w:t>A rampant misconception in modern AI engineering is that every agentic workflow requires a vector database (Pinecone, Chroma, Qdrant, Weaviate) to index the project codebase. For repositories under 50,000 lines of code, vector databases represent an expensive, lossy anti-pattern:</w:t>
+      </w:r>
+    </w:p>
+    <w:p>
+      <w:pPr>
+        <w:pStyle w:val="ListBullet"/>
+        <w:spacing w:before="0" w:after="60" w:line="276" w:lineRule="auto"/>
+      </w:pPr>
+      <w:r>
+        <w:rPr>
+          <w:rFonts w:ascii="Calibri" w:hAnsi="Calibri"/>
+          <w:b/>
+          <w:sz w:val="22"/>
+        </w:rPr>
+        <w:t xml:space="preserve">Syntactic Lossiness: </w:t>
+      </w:r>
+      <w:r>
+        <w:rPr>
+          <w:rFonts w:ascii="Calibri" w:hAnsi="Calibri"/>
+          <w:sz w:val="22"/>
+        </w:rPr>
+        <w:t>Embeddings are probabilistic semantic approximations. They lose exact syntax, function signatures, line numbers, and variable references.</w:t>
+      </w:r>
+    </w:p>
+    <w:p>
+      <w:pPr>
+        <w:pStyle w:val="ListBullet"/>
+        <w:spacing w:before="0" w:after="60" w:line="276" w:lineRule="auto"/>
+      </w:pPr>
+      <w:r>
+        <w:rPr>
+          <w:rFonts w:ascii="Calibri" w:hAnsi="Calibri"/>
+          <w:b/>
+          <w:sz w:val="22"/>
+        </w:rPr>
+        <w:t xml:space="preserve">Chronological Blindness: </w:t>
+      </w:r>
+      <w:r>
+        <w:rPr>
+          <w:rFonts w:ascii="Calibri" w:hAnsi="Calibri"/>
+          <w:sz w:val="22"/>
+        </w:rPr>
+        <w:t>Embeddings cannot determine whether a code snippet was written before or after a breaking schema migration.</w:t>
+      </w:r>
+    </w:p>
+    <w:p>
+      <w:pPr>
+        <w:pStyle w:val="ListBullet"/>
+        <w:spacing w:before="0" w:after="60" w:line="276" w:lineRule="auto"/>
+      </w:pPr>
+      <w:r>
+        <w:rPr>
+          <w:rFonts w:ascii="Calibri" w:hAnsi="Calibri"/>
+          <w:b/>
+          <w:sz w:val="22"/>
+        </w:rPr>
+        <w:t xml:space="preserve">Deterministic Superiority: </w:t>
+      </w:r>
+      <w:r>
+        <w:rPr>
+          <w:rFonts w:ascii="Calibri" w:hAnsi="Calibri"/>
+          <w:sz w:val="22"/>
+        </w:rPr>
+        <w:t>Deterministic lexical tools (ripgrep / grep_search and fd / find_by_name) scan tens of thousands of lines of code in under 20 milliseconds, returning exact lines, filenames, and byte offsets with zero indexing lag and zero API cost.</w:t>
+      </w:r>
+    </w:p>
+    <w:p>
+      <w:pPr>
+        <w:pStyle w:val="Heading2"/>
+        <w:keepNext/>
+        <w:spacing w:before="200" w:after="80"/>
+      </w:pPr>
+      <w:r>
+        <w:rPr>
+          <w:rFonts w:ascii="Calibri" w:hAnsi="Calibri"/>
+          <w:b/>
+          <w:color w:val="1B3A5C"/>
+          <w:sz w:val="25"/>
+        </w:rPr>
+        <w:t>18.2 The Three-Tier Memory &amp; Infrastructure Model</w:t>
+      </w:r>
+    </w:p>
+    <w:p>
+      <w:pPr>
+        <w:spacing w:before="0" w:after="80" w:line="276" w:lineRule="auto"/>
+      </w:pPr>
+      <w:r>
+        <w:rPr>
+          <w:rFonts w:ascii="Calibri" w:hAnsi="Calibri"/>
+          <w:sz w:val="22"/>
+        </w:rPr>
+        <w:t>To architect scalable agentic systems, infrastructure must be separated into three distinct tiers:</w:t>
+      </w:r>
+    </w:p>
+    <w:tbl>
+      <w:tblPr>
+        <w:tblStyle w:val="LightGrid-Accent1"/>
+        <w:tblW w:type="auto" w:w="0"/>
+        <w:jc w:val="center"/>
+        <w:tblLook w:firstColumn="1" w:firstRow="1" w:lastColumn="0" w:lastRow="0" w:noHBand="0" w:noVBand="1" w:val="04A0"/>
+      </w:tblPr>
+      <w:tblGrid>
+        <w:gridCol w:w="2160"/>
+        <w:gridCol w:w="2160"/>
+        <w:gridCol w:w="2160"/>
+        <w:gridCol w:w="2160"/>
+      </w:tblGrid>
+      <w:tr>
+        <w:tc>
+          <w:tcPr>
+            <w:tcW w:type="dxa" w:w="2160"/>
+            <w:shd w:fill="1B3A5C"/>
+            <w:tcMar>
+              <w:top w:w="100" w:type="dxa"/>
+              <w:bottom w:w="100" w:type="dxa"/>
+              <w:left w:w="140" w:type="dxa"/>
+              <w:right w:w="140" w:type="dxa"/>
+            </w:tcMar>
+          </w:tcPr>
+          <w:p>
+            <w:pPr>
+              <w:spacing w:before="0" w:after="0"/>
+            </w:pPr>
+            <w:r>
+              <w:rPr>
+                <w:rFonts w:ascii="Calibri" w:hAnsi="Calibri"/>
+                <w:b/>
+                <w:color w:val="FFFFFF"/>
+                <w:sz w:val="20"/>
+              </w:rPr>
+              <w:t>Tier</w:t>
+            </w:r>
+          </w:p>
+        </w:tc>
+        <w:tc>
+          <w:tcPr>
+            <w:tcW w:type="dxa" w:w="2160"/>
+            <w:shd w:fill="1B3A5C"/>
+            <w:tcMar>
+              <w:top w:w="100" w:type="dxa"/>
+              <w:bottom w:w="100" w:type="dxa"/>
+              <w:left w:w="140" w:type="dxa"/>
+              <w:right w:w="140" w:type="dxa"/>
+            </w:tcMar>
+          </w:tcPr>
+          <w:p>
+            <w:pPr>
+              <w:spacing w:before="0" w:after="0"/>
+            </w:pPr>
+            <w:r>
+              <w:rPr>
+                <w:rFonts w:ascii="Calibri" w:hAnsi="Calibri"/>
+                <w:b/>
+                <w:color w:val="FFFFFF"/>
+                <w:sz w:val="20"/>
+              </w:rPr>
+              <w:t>Domain</w:t>
+            </w:r>
+          </w:p>
+        </w:tc>
+        <w:tc>
+          <w:tcPr>
+            <w:tcW w:type="dxa" w:w="2160"/>
+            <w:shd w:fill="1B3A5C"/>
+            <w:tcMar>
+              <w:top w:w="100" w:type="dxa"/>
+              <w:bottom w:w="100" w:type="dxa"/>
+              <w:left w:w="140" w:type="dxa"/>
+              <w:right w:w="140" w:type="dxa"/>
+            </w:tcMar>
+          </w:tcPr>
+          <w:p>
+            <w:pPr>
+              <w:spacing w:before="0" w:after="0"/>
+            </w:pPr>
+            <w:r>
+              <w:rPr>
+                <w:rFonts w:ascii="Calibri" w:hAnsi="Calibri"/>
+                <w:b/>
+                <w:color w:val="FFFFFF"/>
+                <w:sz w:val="20"/>
+              </w:rPr>
+              <w:t>Primary Technologies</w:t>
+            </w:r>
+          </w:p>
+        </w:tc>
+        <w:tc>
+          <w:tcPr>
+            <w:tcW w:type="dxa" w:w="2160"/>
+            <w:shd w:fill="1B3A5C"/>
+            <w:tcMar>
+              <w:top w:w="100" w:type="dxa"/>
+              <w:bottom w:w="100" w:type="dxa"/>
+              <w:left w:w="140" w:type="dxa"/>
+              <w:right w:w="140" w:type="dxa"/>
+            </w:tcMar>
+          </w:tcPr>
+          <w:p>
+            <w:pPr>
+              <w:spacing w:before="0" w:after="0"/>
+            </w:pPr>
+            <w:r>
+              <w:rPr>
+                <w:rFonts w:ascii="Calibri" w:hAnsi="Calibri"/>
+                <w:b/>
+                <w:color w:val="FFFFFF"/>
+                <w:sz w:val="20"/>
+              </w:rPr>
+              <w:t>Role in Agent Workflow</w:t>
+            </w:r>
+          </w:p>
+        </w:tc>
+      </w:tr>
+      <w:tr>
+        <w:tc>
+          <w:tcPr>
+            <w:tcW w:type="dxa" w:w="2160"/>
+            <w:tcMar>
+              <w:top w:w="80" w:type="dxa"/>
+              <w:bottom w:w="80" w:type="dxa"/>
+              <w:left w:w="120" w:type="dxa"/>
+              <w:right w:w="120" w:type="dxa"/>
+            </w:tcMar>
+          </w:tcPr>
+          <w:p>
+            <w:pPr>
+              <w:spacing w:before="0" w:after="0" w:line="264" w:lineRule="auto"/>
+            </w:pPr>
+            <w:r>
+              <w:rPr>
+                <w:rFonts w:ascii="Calibri" w:hAnsi="Calibri"/>
+                <w:sz w:val="19"/>
+              </w:rPr>
+              <w:t>Tier 1: Agent Governance Memory</w:t>
+            </w:r>
+          </w:p>
+        </w:tc>
+        <w:tc>
+          <w:tcPr>
+            <w:tcW w:type="dxa" w:w="2160"/>
+            <w:tcMar>
+              <w:top w:w="80" w:type="dxa"/>
+              <w:bottom w:w="80" w:type="dxa"/>
+              <w:left w:w="120" w:type="dxa"/>
+              <w:right w:w="120" w:type="dxa"/>
+            </w:tcMar>
+          </w:tcPr>
+          <w:p>
+            <w:pPr>
+              <w:spacing w:before="0" w:after="0" w:line="264" w:lineRule="auto"/>
+            </w:pPr>
+            <w:r>
+              <w:rPr>
+                <w:rFonts w:ascii="Calibri" w:hAnsi="Calibri"/>
+                <w:sz w:val="19"/>
+              </w:rPr>
+              <w:t>Agent's Internal Mind</w:t>
+            </w:r>
+          </w:p>
+        </w:tc>
+        <w:tc>
+          <w:tcPr>
+            <w:tcW w:type="dxa" w:w="2160"/>
+            <w:tcMar>
+              <w:top w:w="80" w:type="dxa"/>
+              <w:bottom w:w="80" w:type="dxa"/>
+              <w:left w:w="120" w:type="dxa"/>
+              <w:right w:w="120" w:type="dxa"/>
+            </w:tcMar>
+          </w:tcPr>
+          <w:p>
+            <w:pPr>
+              <w:spacing w:before="0" w:after="0" w:line="264" w:lineRule="auto"/>
+            </w:pPr>
+            <w:r>
+              <w:rPr>
+                <w:rFonts w:ascii="Calibri" w:hAnsi="Calibri"/>
+                <w:sz w:val="19"/>
+              </w:rPr>
+              <w:t>Markdown on disk (AGENTS.md, spec.md, plan.md, handoff.md) + Git</w:t>
+            </w:r>
+          </w:p>
+        </w:tc>
+        <w:tc>
+          <w:tcPr>
+            <w:tcW w:type="dxa" w:w="2160"/>
+            <w:tcMar>
+              <w:top w:w="80" w:type="dxa"/>
+              <w:bottom w:w="80" w:type="dxa"/>
+              <w:left w:w="120" w:type="dxa"/>
+              <w:right w:w="120" w:type="dxa"/>
+            </w:tcMar>
+          </w:tcPr>
+          <w:p>
+            <w:pPr>
+              <w:spacing w:before="0" w:after="0" w:line="264" w:lineRule="auto"/>
+            </w:pPr>
+            <w:r>
+              <w:rPr>
+                <w:rFonts w:ascii="Calibri" w:hAnsi="Calibri"/>
+                <w:sz w:val="19"/>
+              </w:rPr>
+              <w:t>Zero-latency, human-auditable, version-controlled persistent memory. Strictly NO heavy databases.</w:t>
+            </w:r>
+          </w:p>
+        </w:tc>
+      </w:tr>
+      <w:tr>
+        <w:tc>
+          <w:tcPr>
+            <w:tcW w:type="dxa" w:w="2160"/>
+            <w:shd w:fill="F7F9FB"/>
+            <w:tcMar>
+              <w:top w:w="80" w:type="dxa"/>
+              <w:bottom w:w="80" w:type="dxa"/>
+              <w:left w:w="120" w:type="dxa"/>
+              <w:right w:w="120" w:type="dxa"/>
+            </w:tcMar>
+          </w:tcPr>
+          <w:p>
+            <w:pPr>
+              <w:spacing w:before="0" w:after="0" w:line="264" w:lineRule="auto"/>
+            </w:pPr>
+            <w:r>
+              <w:rPr>
+                <w:rFonts w:ascii="Calibri" w:hAnsi="Calibri"/>
+                <w:sz w:val="19"/>
+              </w:rPr>
+              <w:t>Tier 2: Application Infrastructure</w:t>
+            </w:r>
+          </w:p>
+        </w:tc>
+        <w:tc>
+          <w:tcPr>
+            <w:tcW w:type="dxa" w:w="2160"/>
+            <w:shd w:fill="F7F9FB"/>
+            <w:tcMar>
+              <w:top w:w="80" w:type="dxa"/>
+              <w:bottom w:w="80" w:type="dxa"/>
+              <w:left w:w="120" w:type="dxa"/>
+              <w:right w:w="120" w:type="dxa"/>
+            </w:tcMar>
+          </w:tcPr>
+          <w:p>
+            <w:pPr>
+              <w:spacing w:before="0" w:after="0" w:line="264" w:lineRule="auto"/>
+            </w:pPr>
+            <w:r>
+              <w:rPr>
+                <w:rFonts w:ascii="Calibri" w:hAnsi="Calibri"/>
+                <w:sz w:val="19"/>
+              </w:rPr>
+              <w:t>The Software Being Built</w:t>
+            </w:r>
+          </w:p>
+        </w:tc>
+        <w:tc>
+          <w:tcPr>
+            <w:tcW w:type="dxa" w:w="2160"/>
+            <w:shd w:fill="F7F9FB"/>
+            <w:tcMar>
+              <w:top w:w="80" w:type="dxa"/>
+              <w:bottom w:w="80" w:type="dxa"/>
+              <w:left w:w="120" w:type="dxa"/>
+              <w:right w:w="120" w:type="dxa"/>
+            </w:tcMar>
+          </w:tcPr>
+          <w:p>
+            <w:pPr>
+              <w:spacing w:before="0" w:after="0" w:line="264" w:lineRule="auto"/>
+            </w:pPr>
+            <w:r>
+              <w:rPr>
+                <w:rFonts w:ascii="Calibri" w:hAnsi="Calibri"/>
+                <w:sz w:val="19"/>
+              </w:rPr>
+              <w:t>PostgreSQL, Redis, RabbitMQ, Celery, Docker, WAL, Timescale</w:t>
+            </w:r>
+          </w:p>
+        </w:tc>
+        <w:tc>
+          <w:tcPr>
+            <w:tcW w:type="dxa" w:w="2160"/>
+            <w:shd w:fill="F7F9FB"/>
+            <w:tcMar>
+              <w:top w:w="80" w:type="dxa"/>
+              <w:bottom w:w="80" w:type="dxa"/>
+              <w:left w:w="120" w:type="dxa"/>
+              <w:right w:w="120" w:type="dxa"/>
+            </w:tcMar>
+          </w:tcPr>
+          <w:p>
+            <w:pPr>
+              <w:spacing w:before="0" w:after="0" w:line="264" w:lineRule="auto"/>
+            </w:pPr>
+            <w:r>
+              <w:rPr>
+                <w:rFonts w:ascii="Calibri" w:hAnsi="Calibri"/>
+                <w:sz w:val="19"/>
+              </w:rPr>
+              <w:t>Persistent durability for the target product. The agent writes schemas, migrations, connection pools, and tests.</w:t>
+            </w:r>
+          </w:p>
+        </w:tc>
+      </w:tr>
+      <w:tr>
+        <w:tc>
+          <w:tcPr>
+            <w:tcW w:type="dxa" w:w="2160"/>
+            <w:tcMar>
+              <w:top w:w="80" w:type="dxa"/>
+              <w:bottom w:w="80" w:type="dxa"/>
+              <w:left w:w="120" w:type="dxa"/>
+              <w:right w:w="120" w:type="dxa"/>
+            </w:tcMar>
+          </w:tcPr>
+          <w:p>
+            <w:pPr>
+              <w:spacing w:before="0" w:after="0" w:line="264" w:lineRule="auto"/>
+            </w:pPr>
+            <w:r>
+              <w:rPr>
+                <w:rFonts w:ascii="Calibri" w:hAnsi="Calibri"/>
+                <w:sz w:val="19"/>
+              </w:rPr>
+              <w:t>Tier 3: Integration Bridges (MCP)</w:t>
+            </w:r>
+          </w:p>
+        </w:tc>
+        <w:tc>
+          <w:tcPr>
+            <w:tcW w:type="dxa" w:w="2160"/>
+            <w:tcMar>
+              <w:top w:w="80" w:type="dxa"/>
+              <w:bottom w:w="80" w:type="dxa"/>
+              <w:left w:w="120" w:type="dxa"/>
+              <w:right w:w="120" w:type="dxa"/>
+            </w:tcMar>
+          </w:tcPr>
+          <w:p>
+            <w:pPr>
+              <w:spacing w:before="0" w:after="0" w:line="264" w:lineRule="auto"/>
+            </w:pPr>
+            <w:r>
+              <w:rPr>
+                <w:rFonts w:ascii="Calibri" w:hAnsi="Calibri"/>
+                <w:sz w:val="19"/>
+              </w:rPr>
+              <w:t>Agent-to-System Interface</w:t>
+            </w:r>
+          </w:p>
+        </w:tc>
+        <w:tc>
+          <w:tcPr>
+            <w:tcW w:type="dxa" w:w="2160"/>
+            <w:tcMar>
+              <w:top w:w="80" w:type="dxa"/>
+              <w:bottom w:w="80" w:type="dxa"/>
+              <w:left w:w="120" w:type="dxa"/>
+              <w:right w:w="120" w:type="dxa"/>
+            </w:tcMar>
+          </w:tcPr>
+          <w:p>
+            <w:pPr>
+              <w:spacing w:before="0" w:after="0" w:line="264" w:lineRule="auto"/>
+            </w:pPr>
+            <w:r>
+              <w:rPr>
+                <w:rFonts w:ascii="Calibri" w:hAnsi="Calibri"/>
+                <w:sz w:val="19"/>
+              </w:rPr>
+              <w:t>Model Context Protocol (MCP) servers (postgres, docker, filesystem)</w:t>
+            </w:r>
+          </w:p>
+        </w:tc>
+        <w:tc>
+          <w:tcPr>
+            <w:tcW w:type="dxa" w:w="2160"/>
+            <w:tcMar>
+              <w:top w:w="80" w:type="dxa"/>
+              <w:bottom w:w="80" w:type="dxa"/>
+              <w:left w:w="120" w:type="dxa"/>
+              <w:right w:w="120" w:type="dxa"/>
+            </w:tcMar>
+          </w:tcPr>
+          <w:p>
+            <w:pPr>
+              <w:spacing w:before="0" w:after="0" w:line="264" w:lineRule="auto"/>
+            </w:pPr>
+            <w:r>
+              <w:rPr>
+                <w:rFonts w:ascii="Calibri" w:hAnsi="Calibri"/>
+                <w:sz w:val="19"/>
+              </w:rPr>
+              <w:t>Provides safe, standardized tool calls for the agent to query database schemas, seed test rows, and inspect logs live.</w:t>
+            </w:r>
+          </w:p>
+        </w:tc>
+      </w:tr>
+    </w:tbl>
+    <w:p>
+      <w:pPr>
+        <w:spacing w:before="80" w:after="120"/>
+      </w:pPr>
+    </w:p>
+    <w:p>
+      <w:pPr>
+        <w:pStyle w:val="Heading2"/>
+        <w:keepNext/>
+        <w:spacing w:before="200" w:after="80"/>
+      </w:pPr>
+      <w:r>
+        <w:rPr>
+          <w:rFonts w:ascii="Calibri" w:hAnsi="Calibri"/>
+          <w:b/>
+          <w:color w:val="1B3A5C"/>
+          <w:sz w:val="25"/>
+        </w:rPr>
+        <w:t>18.3 Enterprise Agent Observability &amp; Telemetry (Level 9-10 MLOps)</w:t>
+      </w:r>
+    </w:p>
+    <w:p>
+      <w:pPr>
+        <w:spacing w:before="0" w:after="80" w:line="276" w:lineRule="auto"/>
+      </w:pPr>
+      <w:r>
+        <w:rPr>
+          <w:rFonts w:ascii="Calibri" w:hAnsi="Calibri"/>
+          <w:sz w:val="22"/>
+        </w:rPr>
+        <w:t>When autonomous agents operate in enterprise production environments (e.g. continuous CI/CD repair bots, autonomous support agents), runtime observability becomes critical. Telemetry is implemented using standard OpenTelemetry collectors, Langfuse, or Arize Phoenix to track:</w:t>
+      </w:r>
+    </w:p>
+    <w:p>
+      <w:pPr>
+        <w:pStyle w:val="ListBullet"/>
+        <w:spacing w:before="0" w:after="60" w:line="276" w:lineRule="auto"/>
+      </w:pPr>
+      <w:r>
+        <w:rPr>
+          <w:rFonts w:ascii="Calibri" w:hAnsi="Calibri"/>
+          <w:b/>
+          <w:sz w:val="22"/>
+        </w:rPr>
+        <w:t xml:space="preserve">Token Burn &amp; Loop Velocity: </w:t>
+      </w:r>
+      <w:r>
+        <w:rPr>
+          <w:rFonts w:ascii="Calibri" w:hAnsi="Calibri"/>
+          <w:sz w:val="22"/>
+        </w:rPr>
+        <w:t>Detecting runaway subagent recursion before token budgets are exhausted.</w:t>
+      </w:r>
+    </w:p>
+    <w:p>
+      <w:pPr>
+        <w:pStyle w:val="ListBullet"/>
+        <w:spacing w:before="0" w:after="60" w:line="276" w:lineRule="auto"/>
+      </w:pPr>
+      <w:r>
+        <w:rPr>
+          <w:rFonts w:ascii="Calibri" w:hAnsi="Calibri"/>
+          <w:b/>
+          <w:sz w:val="22"/>
+        </w:rPr>
+        <w:t xml:space="preserve">Tool Call Latency &amp; Failure Rates: </w:t>
+      </w:r>
+      <w:r>
+        <w:rPr>
+          <w:rFonts w:ascii="Calibri" w:hAnsi="Calibri"/>
+          <w:sz w:val="22"/>
+        </w:rPr>
+        <w:t>Monitoring execution duration of bash commands, test runners, and database queries.</w:t>
+      </w:r>
+    </w:p>
+    <w:p>
+      <w:pPr>
+        <w:pStyle w:val="ListBullet"/>
+        <w:spacing w:before="0" w:after="60" w:line="276" w:lineRule="auto"/>
+      </w:pPr>
+      <w:r>
+        <w:rPr>
+          <w:rFonts w:ascii="Calibri" w:hAnsi="Calibri"/>
+          <w:b/>
+          <w:sz w:val="22"/>
+        </w:rPr>
+        <w:t xml:space="preserve">Evaluation-as-a-Judge: </w:t>
+      </w:r>
+      <w:r>
+        <w:rPr>
+          <w:rFonts w:ascii="Calibri" w:hAnsi="Calibri"/>
+          <w:sz w:val="22"/>
+        </w:rPr>
+        <w:t>Running automated adversarial evaluation suites (SC-12) to ensure agent self-corrections do not introduce subtle behavioral regressions.</w:t>
+      </w:r>
+    </w:p>
+    <w:p>
+      <w:pPr>
+        <w:pStyle w:val="Heading1"/>
+        <w:keepNext/>
+        <w:spacing w:before="280" w:after="80"/>
+      </w:pPr>
+      <w:r>
+        <w:rPr>
+          <w:rFonts w:ascii="Calibri" w:hAnsi="Calibri"/>
+          <w:b/>
+          <w:color w:val="1B3A5C"/>
+          <w:sz w:val="28"/>
+        </w:rPr>
+        <w:t>19. Domain Inception, Modern Stack Selection &amp; Design Excellence</w:t>
+      </w:r>
+    </w:p>
+    <w:p>
+      <w:pPr>
+        <w:pStyle w:val="Heading2"/>
+        <w:keepNext/>
+        <w:spacing w:before="200" w:after="80"/>
+      </w:pPr>
+      <w:r>
+        <w:rPr>
+          <w:rFonts w:ascii="Calibri" w:hAnsi="Calibri"/>
+          <w:b/>
+          <w:color w:val="1B3A5C"/>
+          <w:sz w:val="25"/>
+        </w:rPr>
+        <w:t>19.1 Phase 0: The Domain Inception Loop</w:t>
+      </w:r>
+    </w:p>
+    <w:p>
+      <w:pPr>
+        <w:spacing w:before="0" w:after="80" w:line="276" w:lineRule="auto"/>
+      </w:pPr>
+      <w:r>
+        <w:rPr>
+          <w:rFonts w:ascii="Calibri" w:hAnsi="Calibri"/>
+          <w:sz w:val="22"/>
+        </w:rPr>
+        <w:t>When an agent is given a vague prompt like 'build a payment system' or 'build a medical CRM', unconstrained models produce 'AI Slop'—generic UI cards, mocked endpoints, and zero consideration for edge cases. In the ACE Framework, all projects initiate with Phase 0: Domain Inception.</w:t>
+      </w:r>
+    </w:p>
+    <w:p>
+      <w:pPr>
+        <w:spacing w:before="0" w:after="80" w:line="276" w:lineRule="auto"/>
+      </w:pPr>
+      <w:r>
+        <w:rPr>
+          <w:rFonts w:ascii="Calibri" w:hAnsi="Calibri"/>
+          <w:sz w:val="22"/>
+        </w:rPr>
+        <w:t>During Domain Inception, the agent identifies the non-negotiable domain laws before writing code:</w:t>
+      </w:r>
+    </w:p>
+    <w:p>
+      <w:pPr>
+        <w:pStyle w:val="ListBullet"/>
+        <w:spacing w:before="0" w:after="60" w:line="276" w:lineRule="auto"/>
+      </w:pPr>
+      <w:r>
+        <w:rPr>
+          <w:rFonts w:ascii="Calibri" w:hAnsi="Calibri"/>
+          <w:b/>
+          <w:sz w:val="22"/>
+        </w:rPr>
+        <w:t xml:space="preserve">Fintech &amp; Payments: </w:t>
+      </w:r>
+      <w:r>
+        <w:rPr>
+          <w:rFonts w:ascii="Calibri" w:hAnsi="Calibri"/>
+          <w:sz w:val="22"/>
+        </w:rPr>
+        <w:t>Minor integer currency storage (cents), ISO-4217 bounds, double-entry ledgers, idempotent mutation keys, replay attack tolerance (&lt;=5s future, 300s past), HMAC webhook verification.</w:t>
+      </w:r>
+    </w:p>
+    <w:p>
+      <w:pPr>
+        <w:pStyle w:val="ListBullet"/>
+        <w:spacing w:before="0" w:after="60" w:line="276" w:lineRule="auto"/>
+      </w:pPr>
+      <w:r>
+        <w:rPr>
+          <w:rFonts w:ascii="Calibri" w:hAnsi="Calibri"/>
+          <w:b/>
+          <w:sz w:val="22"/>
+        </w:rPr>
+        <w:t xml:space="preserve">Healthcare &amp; Life Sciences: </w:t>
+      </w:r>
+      <w:r>
+        <w:rPr>
+          <w:rFonts w:ascii="Calibri" w:hAnsi="Calibri"/>
+          <w:sz w:val="22"/>
+        </w:rPr>
+        <w:t>Audit trails, field-level encryption, HIPAA data segregation, explicit patient consent tracking, zero PII logging.</w:t>
+      </w:r>
+    </w:p>
+    <w:p>
+      <w:pPr>
+        <w:pStyle w:val="ListBullet"/>
+        <w:spacing w:before="0" w:after="60" w:line="276" w:lineRule="auto"/>
+      </w:pPr>
+      <w:r>
+        <w:rPr>
+          <w:rFonts w:ascii="Calibri" w:hAnsi="Calibri"/>
+          <w:b/>
+          <w:sz w:val="22"/>
+        </w:rPr>
+        <w:t xml:space="preserve">E-Commerce &amp; Marketplaces: </w:t>
+      </w:r>
+      <w:r>
+        <w:rPr>
+          <w:rFonts w:ascii="Calibri" w:hAnsi="Calibri"/>
+          <w:sz w:val="22"/>
+        </w:rPr>
+        <w:t>Cart atomicity, optimistic inventory reservations, distributed mutex locks, idempotent payment callbacks, webhook retry backoffs.</w:t>
+      </w:r>
+    </w:p>
+    <w:p>
+      <w:pPr>
+        <w:pStyle w:val="Heading2"/>
+        <w:keepNext/>
+        <w:spacing w:before="200" w:after="80"/>
+      </w:pPr>
+      <w:r>
+        <w:rPr>
+          <w:rFonts w:ascii="Calibri" w:hAnsi="Calibri"/>
+          <w:b/>
+          <w:color w:val="1B3A5C"/>
+          <w:sz w:val="25"/>
+        </w:rPr>
+        <w:t>19.2 The 'Never Reinvent Wheels' Standard (Modern Concrete Component Selection)</w:t>
+      </w:r>
+    </w:p>
+    <w:p>
+      <w:pPr>
+        <w:spacing w:before="0" w:after="80" w:line="276" w:lineRule="auto"/>
+      </w:pPr>
+      <w:r>
+        <w:rPr>
+          <w:rFonts w:ascii="Calibri" w:hAnsi="Calibri"/>
+          <w:sz w:val="22"/>
+        </w:rPr>
+        <w:t>LLMs possess an intrinsic 'Outdated Training Bias', defaulting to patterns common in 2019–2021 (e.g. custom JWTs in localStorage, Create React App, legacy Pydantic v1 syntax). The ACE Framework strictly mandates modern, battle-tested ecosystem primitives:</w:t>
+      </w:r>
+    </w:p>
+    <w:tbl>
+      <w:tblPr>
+        <w:tblStyle w:val="LightGrid-Accent1"/>
+        <w:tblW w:type="auto" w:w="0"/>
+        <w:jc w:val="center"/>
+        <w:tblLook w:firstColumn="1" w:firstRow="1" w:lastColumn="0" w:lastRow="0" w:noHBand="0" w:noVBand="1" w:val="04A0"/>
+      </w:tblPr>
+      <w:tblGrid>
+        <w:gridCol w:w="2160"/>
+        <w:gridCol w:w="2160"/>
+        <w:gridCol w:w="2160"/>
+        <w:gridCol w:w="2160"/>
+      </w:tblGrid>
+      <w:tr>
+        <w:tc>
+          <w:tcPr>
+            <w:tcW w:type="dxa" w:w="2160"/>
+            <w:shd w:fill="1B3A5C"/>
+            <w:tcMar>
+              <w:top w:w="100" w:type="dxa"/>
+              <w:bottom w:w="100" w:type="dxa"/>
+              <w:left w:w="140" w:type="dxa"/>
+              <w:right w:w="140" w:type="dxa"/>
+            </w:tcMar>
+          </w:tcPr>
+          <w:p>
+            <w:pPr>
+              <w:spacing w:before="0" w:after="0"/>
+            </w:pPr>
+            <w:r>
+              <w:rPr>
+                <w:rFonts w:ascii="Calibri" w:hAnsi="Calibri"/>
+                <w:b/>
+                <w:color w:val="FFFFFF"/>
+                <w:sz w:val="20"/>
+              </w:rPr>
+              <w:t>Architectural Vector</w:t>
+            </w:r>
+          </w:p>
+        </w:tc>
+        <w:tc>
+          <w:tcPr>
+            <w:tcW w:type="dxa" w:w="2160"/>
+            <w:shd w:fill="1B3A5C"/>
+            <w:tcMar>
+              <w:top w:w="100" w:type="dxa"/>
+              <w:bottom w:w="100" w:type="dxa"/>
+              <w:left w:w="140" w:type="dxa"/>
+              <w:right w:w="140" w:type="dxa"/>
+            </w:tcMar>
+          </w:tcPr>
+          <w:p>
+            <w:pPr>
+              <w:spacing w:before="0" w:after="0"/>
+            </w:pPr>
+            <w:r>
+              <w:rPr>
+                <w:rFonts w:ascii="Calibri" w:hAnsi="Calibri"/>
+                <w:b/>
+                <w:color w:val="FFFFFF"/>
+                <w:sz w:val="20"/>
+              </w:rPr>
+              <w:t>Legacy Anti-Pattern (Banned)</w:t>
+            </w:r>
+          </w:p>
+        </w:tc>
+        <w:tc>
+          <w:tcPr>
+            <w:tcW w:type="dxa" w:w="2160"/>
+            <w:shd w:fill="1B3A5C"/>
+            <w:tcMar>
+              <w:top w:w="100" w:type="dxa"/>
+              <w:bottom w:w="100" w:type="dxa"/>
+              <w:left w:w="140" w:type="dxa"/>
+              <w:right w:w="140" w:type="dxa"/>
+            </w:tcMar>
+          </w:tcPr>
+          <w:p>
+            <w:pPr>
+              <w:spacing w:before="0" w:after="0"/>
+            </w:pPr>
+            <w:r>
+              <w:rPr>
+                <w:rFonts w:ascii="Calibri" w:hAnsi="Calibri"/>
+                <w:b/>
+                <w:color w:val="FFFFFF"/>
+                <w:sz w:val="20"/>
+              </w:rPr>
+              <w:t>Modern Production Standard</w:t>
+            </w:r>
+          </w:p>
+        </w:tc>
+        <w:tc>
+          <w:tcPr>
+            <w:tcW w:type="dxa" w:w="2160"/>
+            <w:shd w:fill="1B3A5C"/>
+            <w:tcMar>
+              <w:top w:w="100" w:type="dxa"/>
+              <w:bottom w:w="100" w:type="dxa"/>
+              <w:left w:w="140" w:type="dxa"/>
+              <w:right w:w="140" w:type="dxa"/>
+            </w:tcMar>
+          </w:tcPr>
+          <w:p>
+            <w:pPr>
+              <w:spacing w:before="0" w:after="0"/>
+            </w:pPr>
+            <w:r>
+              <w:rPr>
+                <w:rFonts w:ascii="Calibri" w:hAnsi="Calibri"/>
+                <w:b/>
+                <w:color w:val="FFFFFF"/>
+                <w:sz w:val="20"/>
+              </w:rPr>
+              <w:t>Rationale</w:t>
+            </w:r>
+          </w:p>
+        </w:tc>
+      </w:tr>
+      <w:tr>
+        <w:tc>
+          <w:tcPr>
+            <w:tcW w:type="dxa" w:w="2160"/>
+            <w:tcMar>
+              <w:top w:w="80" w:type="dxa"/>
+              <w:bottom w:w="80" w:type="dxa"/>
+              <w:left w:w="120" w:type="dxa"/>
+              <w:right w:w="120" w:type="dxa"/>
+            </w:tcMar>
+          </w:tcPr>
+          <w:p>
+            <w:pPr>
+              <w:spacing w:before="0" w:after="0" w:line="264" w:lineRule="auto"/>
+            </w:pPr>
+            <w:r>
+              <w:rPr>
+                <w:rFonts w:ascii="Calibri" w:hAnsi="Calibri"/>
+                <w:sz w:val="19"/>
+              </w:rPr>
+              <w:t>Authentication &amp; Sessions</w:t>
+            </w:r>
+          </w:p>
+        </w:tc>
+        <w:tc>
+          <w:tcPr>
+            <w:tcW w:type="dxa" w:w="2160"/>
+            <w:tcMar>
+              <w:top w:w="80" w:type="dxa"/>
+              <w:bottom w:w="80" w:type="dxa"/>
+              <w:left w:w="120" w:type="dxa"/>
+              <w:right w:w="120" w:type="dxa"/>
+            </w:tcMar>
+          </w:tcPr>
+          <w:p>
+            <w:pPr>
+              <w:spacing w:before="0" w:after="0" w:line="264" w:lineRule="auto"/>
+            </w:pPr>
+            <w:r>
+              <w:rPr>
+                <w:rFonts w:ascii="Calibri" w:hAnsi="Calibri"/>
+                <w:sz w:val="19"/>
+              </w:rPr>
+              <w:t>Custom JWTs in localStorage, raw MD5/SHA passwords</w:t>
+            </w:r>
+          </w:p>
+        </w:tc>
+        <w:tc>
+          <w:tcPr>
+            <w:tcW w:type="dxa" w:w="2160"/>
+            <w:tcMar>
+              <w:top w:w="80" w:type="dxa"/>
+              <w:bottom w:w="80" w:type="dxa"/>
+              <w:left w:w="120" w:type="dxa"/>
+              <w:right w:w="120" w:type="dxa"/>
+            </w:tcMar>
+          </w:tcPr>
+          <w:p>
+            <w:pPr>
+              <w:spacing w:before="0" w:after="0" w:line="264" w:lineRule="auto"/>
+            </w:pPr>
+            <w:r>
+              <w:rPr>
+                <w:rFonts w:ascii="Calibri" w:hAnsi="Calibri"/>
+                <w:sz w:val="19"/>
+              </w:rPr>
+              <w:t>OAuth2/OIDC + PKCE, Argon2id, HTTP-only secure cookies, Auth.js, Clerk, Supabase</w:t>
+            </w:r>
+          </w:p>
+        </w:tc>
+        <w:tc>
+          <w:tcPr>
+            <w:tcW w:type="dxa" w:w="2160"/>
+            <w:tcMar>
+              <w:top w:w="80" w:type="dxa"/>
+              <w:bottom w:w="80" w:type="dxa"/>
+              <w:left w:w="120" w:type="dxa"/>
+              <w:right w:w="120" w:type="dxa"/>
+            </w:tcMar>
+          </w:tcPr>
+          <w:p>
+            <w:pPr>
+              <w:spacing w:before="0" w:after="0" w:line="264" w:lineRule="auto"/>
+            </w:pPr>
+            <w:r>
+              <w:rPr>
+                <w:rFonts w:ascii="Calibri" w:hAnsi="Calibri"/>
+                <w:sz w:val="19"/>
+              </w:rPr>
+              <w:t>Eliminates XSS token theft, timing attacks, and custom session vulnerabilities.</w:t>
+            </w:r>
+          </w:p>
+        </w:tc>
+      </w:tr>
+      <w:tr>
+        <w:tc>
+          <w:tcPr>
+            <w:tcW w:type="dxa" w:w="2160"/>
+            <w:shd w:fill="F7F9FB"/>
+            <w:tcMar>
+              <w:top w:w="80" w:type="dxa"/>
+              <w:bottom w:w="80" w:type="dxa"/>
+              <w:left w:w="120" w:type="dxa"/>
+              <w:right w:w="120" w:type="dxa"/>
+            </w:tcMar>
+          </w:tcPr>
+          <w:p>
+            <w:pPr>
+              <w:spacing w:before="0" w:after="0" w:line="264" w:lineRule="auto"/>
+            </w:pPr>
+            <w:r>
+              <w:rPr>
+                <w:rFonts w:ascii="Calibri" w:hAnsi="Calibri"/>
+                <w:sz w:val="19"/>
+              </w:rPr>
+              <w:t>Data Validation</w:t>
+            </w:r>
+          </w:p>
+        </w:tc>
+        <w:tc>
+          <w:tcPr>
+            <w:tcW w:type="dxa" w:w="2160"/>
+            <w:shd w:fill="F7F9FB"/>
+            <w:tcMar>
+              <w:top w:w="80" w:type="dxa"/>
+              <w:bottom w:w="80" w:type="dxa"/>
+              <w:left w:w="120" w:type="dxa"/>
+              <w:right w:w="120" w:type="dxa"/>
+            </w:tcMar>
+          </w:tcPr>
+          <w:p>
+            <w:pPr>
+              <w:spacing w:before="0" w:after="0" w:line="264" w:lineRule="auto"/>
+            </w:pPr>
+            <w:r>
+              <w:rPr>
+                <w:rFonts w:ascii="Calibri" w:hAnsi="Calibri"/>
+                <w:sz w:val="19"/>
+              </w:rPr>
+              <w:t>Manual if/else statements, bespoke regex</w:t>
+            </w:r>
+          </w:p>
+        </w:tc>
+        <w:tc>
+          <w:tcPr>
+            <w:tcW w:type="dxa" w:w="2160"/>
+            <w:shd w:fill="F7F9FB"/>
+            <w:tcMar>
+              <w:top w:w="80" w:type="dxa"/>
+              <w:bottom w:w="80" w:type="dxa"/>
+              <w:left w:w="120" w:type="dxa"/>
+              <w:right w:w="120" w:type="dxa"/>
+            </w:tcMar>
+          </w:tcPr>
+          <w:p>
+            <w:pPr>
+              <w:spacing w:before="0" w:after="0" w:line="264" w:lineRule="auto"/>
+            </w:pPr>
+            <w:r>
+              <w:rPr>
+                <w:rFonts w:ascii="Calibri" w:hAnsi="Calibri"/>
+                <w:sz w:val="19"/>
+              </w:rPr>
+              <w:t>Pydantic v2 (Python), Zod (TypeScript), Serde (Rust)</w:t>
+            </w:r>
+          </w:p>
+        </w:tc>
+        <w:tc>
+          <w:tcPr>
+            <w:tcW w:type="dxa" w:w="2160"/>
+            <w:shd w:fill="F7F9FB"/>
+            <w:tcMar>
+              <w:top w:w="80" w:type="dxa"/>
+              <w:bottom w:w="80" w:type="dxa"/>
+              <w:left w:w="120" w:type="dxa"/>
+              <w:right w:w="120" w:type="dxa"/>
+            </w:tcMar>
+          </w:tcPr>
+          <w:p>
+            <w:pPr>
+              <w:spacing w:before="0" w:after="0" w:line="264" w:lineRule="auto"/>
+            </w:pPr>
+            <w:r>
+              <w:rPr>
+                <w:rFonts w:ascii="Calibri" w:hAnsi="Calibri"/>
+                <w:sz w:val="19"/>
+              </w:rPr>
+              <w:t>Guarantees strict runtime boundary validation and typed serialization.</w:t>
+            </w:r>
+          </w:p>
+        </w:tc>
+      </w:tr>
+      <w:tr>
+        <w:tc>
+          <w:tcPr>
+            <w:tcW w:type="dxa" w:w="2160"/>
+            <w:tcMar>
+              <w:top w:w="80" w:type="dxa"/>
+              <w:bottom w:w="80" w:type="dxa"/>
+              <w:left w:w="120" w:type="dxa"/>
+              <w:right w:w="120" w:type="dxa"/>
+            </w:tcMar>
+          </w:tcPr>
+          <w:p>
+            <w:pPr>
+              <w:spacing w:before="0" w:after="0" w:line="264" w:lineRule="auto"/>
+            </w:pPr>
+            <w:r>
+              <w:rPr>
+                <w:rFonts w:ascii="Calibri" w:hAnsi="Calibri"/>
+                <w:sz w:val="19"/>
+              </w:rPr>
+              <w:t>UI Component Primitives</w:t>
+            </w:r>
+          </w:p>
+        </w:tc>
+        <w:tc>
+          <w:tcPr>
+            <w:tcW w:type="dxa" w:w="2160"/>
+            <w:tcMar>
+              <w:top w:w="80" w:type="dxa"/>
+              <w:bottom w:w="80" w:type="dxa"/>
+              <w:left w:w="120" w:type="dxa"/>
+              <w:right w:w="120" w:type="dxa"/>
+            </w:tcMar>
+          </w:tcPr>
+          <w:p>
+            <w:pPr>
+              <w:spacing w:before="0" w:after="0" w:line="264" w:lineRule="auto"/>
+            </w:pPr>
+            <w:r>
+              <w:rPr>
+                <w:rFonts w:ascii="Calibri" w:hAnsi="Calibri"/>
+                <w:sz w:val="19"/>
+              </w:rPr>
+              <w:t>Custom un-styled &lt;div&gt; tags with raw onClick handlers</w:t>
+            </w:r>
+          </w:p>
+        </w:tc>
+        <w:tc>
+          <w:tcPr>
+            <w:tcW w:type="dxa" w:w="2160"/>
+            <w:tcMar>
+              <w:top w:w="80" w:type="dxa"/>
+              <w:bottom w:w="80" w:type="dxa"/>
+              <w:left w:w="120" w:type="dxa"/>
+              <w:right w:w="120" w:type="dxa"/>
+            </w:tcMar>
+          </w:tcPr>
+          <w:p>
+            <w:pPr>
+              <w:spacing w:before="0" w:after="0" w:line="264" w:lineRule="auto"/>
+            </w:pPr>
+            <w:r>
+              <w:rPr>
+                <w:rFonts w:ascii="Calibri" w:hAnsi="Calibri"/>
+                <w:sz w:val="19"/>
+              </w:rPr>
+              <w:t>Radix UI, Headless UI, Shadcn UI, Tailwind CSS</w:t>
+            </w:r>
+          </w:p>
+        </w:tc>
+        <w:tc>
+          <w:tcPr>
+            <w:tcW w:type="dxa" w:w="2160"/>
+            <w:tcMar>
+              <w:top w:w="80" w:type="dxa"/>
+              <w:bottom w:w="80" w:type="dxa"/>
+              <w:left w:w="120" w:type="dxa"/>
+              <w:right w:w="120" w:type="dxa"/>
+            </w:tcMar>
+          </w:tcPr>
+          <w:p>
+            <w:pPr>
+              <w:spacing w:before="0" w:after="0" w:line="264" w:lineRule="auto"/>
+            </w:pPr>
+            <w:r>
+              <w:rPr>
+                <w:rFonts w:ascii="Calibri" w:hAnsi="Calibri"/>
+                <w:sz w:val="19"/>
+              </w:rPr>
+              <w:t>Ensures zero visual slop, full WAI-ARIA accessibility, and responsive typography.</w:t>
+            </w:r>
+          </w:p>
+        </w:tc>
+      </w:tr>
+      <w:tr>
+        <w:tc>
+          <w:tcPr>
+            <w:tcW w:type="dxa" w:w="2160"/>
+            <w:shd w:fill="F7F9FB"/>
+            <w:tcMar>
+              <w:top w:w="80" w:type="dxa"/>
+              <w:bottom w:w="80" w:type="dxa"/>
+              <w:left w:w="120" w:type="dxa"/>
+              <w:right w:w="120" w:type="dxa"/>
+            </w:tcMar>
+          </w:tcPr>
+          <w:p>
+            <w:pPr>
+              <w:spacing w:before="0" w:after="0" w:line="264" w:lineRule="auto"/>
+            </w:pPr>
+            <w:r>
+              <w:rPr>
+                <w:rFonts w:ascii="Calibri" w:hAnsi="Calibri"/>
+                <w:sz w:val="19"/>
+              </w:rPr>
+              <w:t>Data Fetching &amp; State</w:t>
+            </w:r>
+          </w:p>
+        </w:tc>
+        <w:tc>
+          <w:tcPr>
+            <w:tcW w:type="dxa" w:w="2160"/>
+            <w:shd w:fill="F7F9FB"/>
+            <w:tcMar>
+              <w:top w:w="80" w:type="dxa"/>
+              <w:bottom w:w="80" w:type="dxa"/>
+              <w:left w:w="120" w:type="dxa"/>
+              <w:right w:w="120" w:type="dxa"/>
+            </w:tcMar>
+          </w:tcPr>
+          <w:p>
+            <w:pPr>
+              <w:spacing w:before="0" w:after="0" w:line="264" w:lineRule="auto"/>
+            </w:pPr>
+            <w:r>
+              <w:rPr>
+                <w:rFonts w:ascii="Calibri" w:hAnsi="Calibri"/>
+                <w:sz w:val="19"/>
+              </w:rPr>
+              <w:t>Raw useEffect() with nested fetch() waterfalls</w:t>
+            </w:r>
+          </w:p>
+        </w:tc>
+        <w:tc>
+          <w:tcPr>
+            <w:tcW w:type="dxa" w:w="2160"/>
+            <w:shd w:fill="F7F9FB"/>
+            <w:tcMar>
+              <w:top w:w="80" w:type="dxa"/>
+              <w:bottom w:w="80" w:type="dxa"/>
+              <w:left w:w="120" w:type="dxa"/>
+              <w:right w:w="120" w:type="dxa"/>
+            </w:tcMar>
+          </w:tcPr>
+          <w:p>
+            <w:pPr>
+              <w:spacing w:before="0" w:after="0" w:line="264" w:lineRule="auto"/>
+            </w:pPr>
+            <w:r>
+              <w:rPr>
+                <w:rFonts w:ascii="Calibri" w:hAnsi="Calibri"/>
+                <w:sz w:val="19"/>
+              </w:rPr>
+              <w:t>TanStack Query (React Query v5), SWR, Server Components</w:t>
+            </w:r>
+          </w:p>
+        </w:tc>
+        <w:tc>
+          <w:tcPr>
+            <w:tcW w:type="dxa" w:w="2160"/>
+            <w:shd w:fill="F7F9FB"/>
+            <w:tcMar>
+              <w:top w:w="80" w:type="dxa"/>
+              <w:bottom w:w="80" w:type="dxa"/>
+              <w:left w:w="120" w:type="dxa"/>
+              <w:right w:w="120" w:type="dxa"/>
+            </w:tcMar>
+          </w:tcPr>
+          <w:p>
+            <w:pPr>
+              <w:spacing w:before="0" w:after="0" w:line="264" w:lineRule="auto"/>
+            </w:pPr>
+            <w:r>
+              <w:rPr>
+                <w:rFonts w:ascii="Calibri" w:hAnsi="Calibri"/>
+                <w:sz w:val="19"/>
+              </w:rPr>
+              <w:t>Automatic caching, deduplication, optimistic updates, and background revalidation.</w:t>
+            </w:r>
+          </w:p>
+        </w:tc>
+      </w:tr>
+      <w:tr>
+        <w:tc>
+          <w:tcPr>
+            <w:tcW w:type="dxa" w:w="2160"/>
+            <w:tcMar>
+              <w:top w:w="80" w:type="dxa"/>
+              <w:bottom w:w="80" w:type="dxa"/>
+              <w:left w:w="120" w:type="dxa"/>
+              <w:right w:w="120" w:type="dxa"/>
+            </w:tcMar>
+          </w:tcPr>
+          <w:p>
+            <w:pPr>
+              <w:spacing w:before="0" w:after="0" w:line="264" w:lineRule="auto"/>
+            </w:pPr>
+            <w:r>
+              <w:rPr>
+                <w:rFonts w:ascii="Calibri" w:hAnsi="Calibri"/>
+                <w:sz w:val="19"/>
+              </w:rPr>
+              <w:t>Persistence &amp; Migrations</w:t>
+            </w:r>
+          </w:p>
+        </w:tc>
+        <w:tc>
+          <w:tcPr>
+            <w:tcW w:type="dxa" w:w="2160"/>
+            <w:tcMar>
+              <w:top w:w="80" w:type="dxa"/>
+              <w:bottom w:w="80" w:type="dxa"/>
+              <w:left w:w="120" w:type="dxa"/>
+              <w:right w:w="120" w:type="dxa"/>
+            </w:tcMar>
+          </w:tcPr>
+          <w:p>
+            <w:pPr>
+              <w:spacing w:before="0" w:after="0" w:line="264" w:lineRule="auto"/>
+            </w:pPr>
+            <w:r>
+              <w:rPr>
+                <w:rFonts w:ascii="Calibri" w:hAnsi="Calibri"/>
+                <w:sz w:val="19"/>
+              </w:rPr>
+              <w:t>Raw SQL string concatenation, deprecated ORM APIs</w:t>
+            </w:r>
+          </w:p>
+        </w:tc>
+        <w:tc>
+          <w:tcPr>
+            <w:tcW w:type="dxa" w:w="2160"/>
+            <w:tcMar>
+              <w:top w:w="80" w:type="dxa"/>
+              <w:bottom w:w="80" w:type="dxa"/>
+              <w:left w:w="120" w:type="dxa"/>
+              <w:right w:w="120" w:type="dxa"/>
+            </w:tcMar>
+          </w:tcPr>
+          <w:p>
+            <w:pPr>
+              <w:spacing w:before="0" w:after="0" w:line="264" w:lineRule="auto"/>
+            </w:pPr>
+            <w:r>
+              <w:rPr>
+                <w:rFonts w:ascii="Calibri" w:hAnsi="Calibri"/>
+                <w:sz w:val="19"/>
+              </w:rPr>
+              <w:t>SQLAlchemy 2.0 / SQLModel (Python), Drizzle / Prisma (TS)</w:t>
+            </w:r>
+          </w:p>
+        </w:tc>
+        <w:tc>
+          <w:tcPr>
+            <w:tcW w:type="dxa" w:w="2160"/>
+            <w:tcMar>
+              <w:top w:w="80" w:type="dxa"/>
+              <w:bottom w:w="80" w:type="dxa"/>
+              <w:left w:w="120" w:type="dxa"/>
+              <w:right w:w="120" w:type="dxa"/>
+            </w:tcMar>
+          </w:tcPr>
+          <w:p>
+            <w:pPr>
+              <w:spacing w:before="0" w:after="0" w:line="264" w:lineRule="auto"/>
+            </w:pPr>
+            <w:r>
+              <w:rPr>
+                <w:rFonts w:ascii="Calibri" w:hAnsi="Calibri"/>
+                <w:sz w:val="19"/>
+              </w:rPr>
+              <w:t>Strong typing, SQL injection prevention, and deterministic schema version control.</w:t>
+            </w:r>
+          </w:p>
+        </w:tc>
+      </w:tr>
+    </w:tbl>
+    <w:p>
+      <w:pPr>
+        <w:spacing w:before="80" w:after="120"/>
+      </w:pPr>
+    </w:p>
+    <w:p>
+      <w:pPr>
+        <w:pStyle w:val="Heading2"/>
+        <w:keepNext/>
+        <w:spacing w:before="200" w:after="80"/>
+      </w:pPr>
+      <w:r>
+        <w:rPr>
+          <w:rFonts w:ascii="Calibri" w:hAnsi="Calibri"/>
+          <w:b/>
+          <w:color w:val="1B3A5C"/>
+          <w:sz w:val="25"/>
+        </w:rPr>
+        <w:t>19.3 The Gated Product Blueprint (P0 / P1 / P2 Matrix)</w:t>
+      </w:r>
+    </w:p>
+    <w:p>
+      <w:pPr>
+        <w:spacing w:before="0" w:after="80" w:line="276" w:lineRule="auto"/>
+      </w:pPr>
+      <w:r>
+        <w:rPr>
+          <w:rFonts w:ascii="Calibri" w:hAnsi="Calibri"/>
+          <w:sz w:val="22"/>
+        </w:rPr>
+        <w:t>To prevent scope explosion and context collapse, the agent structures all feature brainstorms into a 3-tier Gated Blueprint in spec.md before any code is generated:</w:t>
+      </w:r>
+    </w:p>
+    <w:p>
+      <w:pPr>
+        <w:pStyle w:val="ListBullet"/>
+        <w:spacing w:before="0" w:after="60" w:line="276" w:lineRule="auto"/>
+      </w:pPr>
+      <w:r>
+        <w:rPr>
+          <w:rFonts w:ascii="Calibri" w:hAnsi="Calibri"/>
+          <w:b/>
+          <w:sz w:val="22"/>
+        </w:rPr>
+        <w:t xml:space="preserve">P0 (Core Engine): </w:t>
+      </w:r>
+      <w:r>
+        <w:rPr>
+          <w:rFonts w:ascii="Calibri" w:hAnsi="Calibri"/>
+          <w:sz w:val="22"/>
+        </w:rPr>
+        <w:t>Non-negotiable domain primitives and correctness (data schema, auth boundaries, transactional integrity, core APIs).</w:t>
+      </w:r>
+    </w:p>
+    <w:p>
+      <w:pPr>
+        <w:pStyle w:val="ListBullet"/>
+        <w:spacing w:before="0" w:after="60" w:line="276" w:lineRule="auto"/>
+      </w:pPr>
+      <w:r>
+        <w:rPr>
+          <w:rFonts w:ascii="Calibri" w:hAnsi="Calibri"/>
+          <w:b/>
+          <w:sz w:val="22"/>
+        </w:rPr>
+        <w:t xml:space="preserve">P1 (Craft &amp; UX Differentiators): </w:t>
+      </w:r>
+      <w:r>
+        <w:rPr>
+          <w:rFonts w:ascii="Calibri" w:hAnsi="Calibri"/>
+          <w:sz w:val="22"/>
+        </w:rPr>
+        <w:t>Defensive UX, micro-interactions, keyboard shortcuts, optimistic updates, loading skeletons, empty states with clear CTAs.</w:t>
+      </w:r>
+    </w:p>
+    <w:p>
+      <w:pPr>
+        <w:pStyle w:val="ListBullet"/>
+        <w:spacing w:before="0" w:after="60" w:line="276" w:lineRule="auto"/>
+      </w:pPr>
+      <w:r>
+        <w:rPr>
+          <w:rFonts w:ascii="Calibri" w:hAnsi="Calibri"/>
+          <w:b/>
+          <w:sz w:val="22"/>
+        </w:rPr>
+        <w:t xml:space="preserve">P2 (Deferred / Future Scale): </w:t>
+      </w:r>
+      <w:r>
+        <w:rPr>
+          <w:rFonts w:ascii="Calibri" w:hAnsi="Calibri"/>
+          <w:sz w:val="22"/>
+        </w:rPr>
+        <w:t>Advanced features (AI recommendations, enterprise SSO, multi-region syncing) documented in ROADMAP.md but strictly deferred from the initial build.</w:t>
+      </w:r>
+    </w:p>
+    <w:p>
+      <w:pPr>
+        <w:pStyle w:val="Heading1"/>
+        <w:keepNext/>
+        <w:spacing w:before="280" w:after="80"/>
+      </w:pPr>
+      <w:r>
+        <w:rPr>
+          <w:rFonts w:ascii="Calibri" w:hAnsi="Calibri"/>
+          <w:b/>
+          <w:color w:val="1B3A5C"/>
+          <w:sz w:val="28"/>
+        </w:rPr>
+        <w:t>20. Market Inception &amp; Competitive Gap Exploitation</w:t>
+      </w:r>
+    </w:p>
+    <w:p>
+      <w:pPr>
+        <w:pStyle w:val="Heading2"/>
+        <w:keepNext/>
+        <w:spacing w:before="200" w:after="80"/>
+      </w:pPr>
+      <w:r>
+        <w:rPr>
+          <w:rFonts w:ascii="Calibri" w:hAnsi="Calibri"/>
+          <w:b/>
+          <w:color w:val="1B3A5C"/>
+          <w:sz w:val="25"/>
+        </w:rPr>
+        <w:t>20.1 The Competitive Gap Subagent Persona</w:t>
+      </w:r>
+    </w:p>
+    <w:p>
+      <w:pPr>
+        <w:spacing w:before="0" w:after="80" w:line="276" w:lineRule="auto"/>
+      </w:pPr>
+      <w:r>
+        <w:rPr>
+          <w:rFonts w:ascii="Calibri" w:hAnsi="Calibri"/>
+          <w:sz w:val="22"/>
+        </w:rPr>
+        <w:t>Building software that merely replicates existing tools results in commoditized, low-value software. The highest leverage in agentic engineering is deploying a Competitive Gap &amp; Market Innovation Subagent during Phase 0. This agent studies market incumbents (e.g. HubSpot, Salesforce, Linear, Stripe, Jira) to detect structural failure vectors:</w:t>
+      </w:r>
+    </w:p>
+    <w:p>
+      <w:pPr>
+        <w:pStyle w:val="ListBullet"/>
+        <w:spacing w:before="0" w:after="60" w:line="276" w:lineRule="auto"/>
+      </w:pPr>
+      <w:r>
+        <w:rPr>
+          <w:rFonts w:ascii="Calibri" w:hAnsi="Calibri"/>
+          <w:b/>
+          <w:sz w:val="22"/>
+        </w:rPr>
+        <w:t xml:space="preserve">Vector 1: Pricing Dark Patterns: </w:t>
+      </w:r>
+      <w:r>
+        <w:rPr>
+          <w:rFonts w:ascii="Calibri" w:hAnsi="Calibri"/>
+          <w:sz w:val="22"/>
+        </w:rPr>
+        <w:t>Incumbents monetize user growth unfairly (e.g. HubSpot charging per stored contact even if 90% are inactive).</w:t>
+      </w:r>
+    </w:p>
+    <w:p>
+      <w:pPr>
+        <w:pStyle w:val="ListBullet"/>
+        <w:spacing w:before="0" w:after="60" w:line="276" w:lineRule="auto"/>
+      </w:pPr>
+      <w:r>
+        <w:rPr>
+          <w:rFonts w:ascii="Calibri" w:hAnsi="Calibri"/>
+          <w:b/>
+          <w:sz w:val="22"/>
+        </w:rPr>
+        <w:t xml:space="preserve">Vector 2: Architectural Bloat &amp; Sluggish UX: </w:t>
+      </w:r>
+      <w:r>
+        <w:rPr>
+          <w:rFonts w:ascii="Calibri" w:hAnsi="Calibri"/>
+          <w:sz w:val="22"/>
+        </w:rPr>
+        <w:t>Years of legacy feature creep result in 10-second page loads, bloated navigation bars, and clunky 20-step setups.</w:t>
+      </w:r>
+    </w:p>
+    <w:p>
+      <w:pPr>
+        <w:pStyle w:val="ListBullet"/>
+        <w:spacing w:before="0" w:after="60" w:line="276" w:lineRule="auto"/>
+      </w:pPr>
+      <w:r>
+        <w:rPr>
+          <w:rFonts w:ascii="Calibri" w:hAnsi="Calibri"/>
+          <w:b/>
+          <w:sz w:val="22"/>
+        </w:rPr>
+        <w:t xml:space="preserve">Vector 3: Data Lock-In &amp; Vendor Hostage: </w:t>
+      </w:r>
+      <w:r>
+        <w:rPr>
+          <w:rFonts w:ascii="Calibri" w:hAnsi="Calibri"/>
+          <w:sz w:val="22"/>
+        </w:rPr>
+        <w:t>Incumbents intentionally make data export difficult to trap customers inside proprietary ecosystems.</w:t>
+      </w:r>
+    </w:p>
+    <w:p>
+      <w:pPr>
+        <w:pStyle w:val="ListBullet"/>
+        <w:spacing w:before="0" w:after="60" w:line="276" w:lineRule="auto"/>
+      </w:pPr>
+      <w:r>
+        <w:rPr>
+          <w:rFonts w:ascii="Calibri" w:hAnsi="Calibri"/>
+          <w:b/>
+          <w:sz w:val="22"/>
+        </w:rPr>
+        <w:t xml:space="preserve">Vector 4: Power-User &amp; Developer Neglect: </w:t>
+      </w:r>
+      <w:r>
+        <w:rPr>
+          <w:rFonts w:ascii="Calibri" w:hAnsi="Calibri"/>
+          <w:sz w:val="22"/>
+        </w:rPr>
+        <w:t>Incumbents prioritize non-technical managers over practitioners, leaving APIs slow, undocumented, and devoid of version control.</w:t>
+      </w:r>
+    </w:p>
+    <w:p>
+      <w:pPr>
+        <w:pStyle w:val="Heading2"/>
+        <w:keepNext/>
+        <w:spacing w:before="200" w:after="80"/>
+      </w:pPr>
+      <w:r>
+        <w:rPr>
+          <w:rFonts w:ascii="Calibri" w:hAnsi="Calibri"/>
+          <w:b/>
+          <w:color w:val="1B3A5C"/>
+          <w:sz w:val="25"/>
+        </w:rPr>
+        <w:t>20.2 The Gap-to-Feature Translation Matrix (HubSpot Case Study)</w:t>
+      </w:r>
+    </w:p>
+    <w:p>
+      <w:pPr>
+        <w:spacing w:before="0" w:after="80" w:line="276" w:lineRule="auto"/>
+      </w:pPr>
+      <w:r>
+        <w:rPr>
+          <w:rFonts w:ascii="Calibri" w:hAnsi="Calibri"/>
+          <w:sz w:val="22"/>
+        </w:rPr>
+        <w:t>The Competitive Gap Subagent mines customer reviews (G2, Capterra, Reddit) and converts negative user sentiment into 10x technical wedges:</w:t>
+      </w:r>
+    </w:p>
+    <w:tbl>
+      <w:tblPr>
+        <w:tblStyle w:val="LightGrid-Accent1"/>
+        <w:tblW w:type="auto" w:w="0"/>
+        <w:jc w:val="center"/>
+        <w:tblLook w:firstColumn="1" w:firstRow="1" w:lastColumn="0" w:lastRow="0" w:noHBand="0" w:noVBand="1" w:val="04A0"/>
+      </w:tblPr>
+      <w:tblGrid>
+        <w:gridCol w:w="2160"/>
+        <w:gridCol w:w="2160"/>
+        <w:gridCol w:w="2160"/>
+        <w:gridCol w:w="2160"/>
+      </w:tblGrid>
+      <w:tr>
+        <w:tc>
+          <w:tcPr>
+            <w:tcW w:type="dxa" w:w="2160"/>
+            <w:shd w:fill="1B3A5C"/>
+            <w:tcMar>
+              <w:top w:w="100" w:type="dxa"/>
+              <w:bottom w:w="100" w:type="dxa"/>
+              <w:left w:w="140" w:type="dxa"/>
+              <w:right w:w="140" w:type="dxa"/>
+            </w:tcMar>
+          </w:tcPr>
+          <w:p>
+            <w:pPr>
+              <w:spacing w:before="0" w:after="0"/>
+            </w:pPr>
+            <w:r>
+              <w:rPr>
+                <w:rFonts w:ascii="Calibri" w:hAnsi="Calibri"/>
+                <w:b/>
+                <w:color w:val="FFFFFF"/>
+                <w:sz w:val="20"/>
+              </w:rPr>
+              <w:t>Incumbent Pain Point (The Market Gap)</w:t>
+            </w:r>
+          </w:p>
+        </w:tc>
+        <w:tc>
+          <w:tcPr>
+            <w:tcW w:type="dxa" w:w="2160"/>
+            <w:shd w:fill="1B3A5C"/>
+            <w:tcMar>
+              <w:top w:w="100" w:type="dxa"/>
+              <w:bottom w:w="100" w:type="dxa"/>
+              <w:left w:w="140" w:type="dxa"/>
+              <w:right w:w="140" w:type="dxa"/>
+            </w:tcMar>
+          </w:tcPr>
+          <w:p>
+            <w:pPr>
+              <w:spacing w:before="0" w:after="0"/>
+            </w:pPr>
+            <w:r>
+              <w:rPr>
+                <w:rFonts w:ascii="Calibri" w:hAnsi="Calibri"/>
+                <w:b/>
+                <w:color w:val="FFFFFF"/>
+                <w:sz w:val="20"/>
+              </w:rPr>
+              <w:t>Root Cause in Incumbent</w:t>
+            </w:r>
+          </w:p>
+        </w:tc>
+        <w:tc>
+          <w:tcPr>
+            <w:tcW w:type="dxa" w:w="2160"/>
+            <w:shd w:fill="1B3A5C"/>
+            <w:tcMar>
+              <w:top w:w="100" w:type="dxa"/>
+              <w:bottom w:w="100" w:type="dxa"/>
+              <w:left w:w="140" w:type="dxa"/>
+              <w:right w:w="140" w:type="dxa"/>
+            </w:tcMar>
+          </w:tcPr>
+          <w:p>
+            <w:pPr>
+              <w:spacing w:before="0" w:after="0"/>
+            </w:pPr>
+            <w:r>
+              <w:rPr>
+                <w:rFonts w:ascii="Calibri" w:hAnsi="Calibri"/>
+                <w:b/>
+                <w:color w:val="FFFFFF"/>
+                <w:sz w:val="20"/>
+              </w:rPr>
+              <w:t>10x Architectural Wedge Feature</w:t>
+            </w:r>
+          </w:p>
+        </w:tc>
+        <w:tc>
+          <w:tcPr>
+            <w:tcW w:type="dxa" w:w="2160"/>
+            <w:shd w:fill="1B3A5C"/>
+            <w:tcMar>
+              <w:top w:w="100" w:type="dxa"/>
+              <w:bottom w:w="100" w:type="dxa"/>
+              <w:left w:w="140" w:type="dxa"/>
+              <w:right w:w="140" w:type="dxa"/>
+            </w:tcMar>
+          </w:tcPr>
+          <w:p>
+            <w:pPr>
+              <w:spacing w:before="0" w:after="0"/>
+            </w:pPr>
+            <w:r>
+              <w:rPr>
+                <w:rFonts w:ascii="Calibri" w:hAnsi="Calibri"/>
+                <w:b/>
+                <w:color w:val="FFFFFF"/>
+                <w:sz w:val="20"/>
+              </w:rPr>
+              <w:t>Target Tier</w:t>
+            </w:r>
+          </w:p>
+        </w:tc>
+      </w:tr>
+      <w:tr>
+        <w:tc>
+          <w:tcPr>
+            <w:tcW w:type="dxa" w:w="2160"/>
+            <w:tcMar>
+              <w:top w:w="80" w:type="dxa"/>
+              <w:bottom w:w="80" w:type="dxa"/>
+              <w:left w:w="120" w:type="dxa"/>
+              <w:right w:w="120" w:type="dxa"/>
+            </w:tcMar>
+          </w:tcPr>
+          <w:p>
+            <w:pPr>
+              <w:spacing w:before="0" w:after="0" w:line="264" w:lineRule="auto"/>
+            </w:pPr>
+            <w:r>
+              <w:rPr>
+                <w:rFonts w:ascii="Calibri" w:hAnsi="Calibri"/>
+                <w:sz w:val="19"/>
+              </w:rPr>
+              <w:t>The 'Contact Tax' ($500+/mo for 50k inactive leads)</w:t>
+            </w:r>
+          </w:p>
+        </w:tc>
+        <w:tc>
+          <w:tcPr>
+            <w:tcW w:type="dxa" w:w="2160"/>
+            <w:tcMar>
+              <w:top w:w="80" w:type="dxa"/>
+              <w:bottom w:w="80" w:type="dxa"/>
+              <w:left w:w="120" w:type="dxa"/>
+              <w:right w:w="120" w:type="dxa"/>
+            </w:tcMar>
+          </w:tcPr>
+          <w:p>
+            <w:pPr>
+              <w:spacing w:before="0" w:after="0" w:line="264" w:lineRule="auto"/>
+            </w:pPr>
+            <w:r>
+              <w:rPr>
+                <w:rFonts w:ascii="Calibri" w:hAnsi="Calibri"/>
+                <w:sz w:val="19"/>
+              </w:rPr>
+              <w:t>Legacy per-seat/per-record database pricing</w:t>
+            </w:r>
+          </w:p>
+        </w:tc>
+        <w:tc>
+          <w:tcPr>
+            <w:tcW w:type="dxa" w:w="2160"/>
+            <w:tcMar>
+              <w:top w:w="80" w:type="dxa"/>
+              <w:bottom w:w="80" w:type="dxa"/>
+              <w:left w:w="120" w:type="dxa"/>
+              <w:right w:w="120" w:type="dxa"/>
+            </w:tcMar>
+          </w:tcPr>
+          <w:p>
+            <w:pPr>
+              <w:spacing w:before="0" w:after="0" w:line="264" w:lineRule="auto"/>
+            </w:pPr>
+            <w:r>
+              <w:rPr>
+                <w:rFonts w:ascii="Calibri" w:hAnsi="Calibri"/>
+                <w:sz w:val="19"/>
+              </w:rPr>
+              <w:t>Decoupled Storage: Free unlimited contact storage; pay only for emails actively delivered via AWS SES/Resend.</w:t>
+            </w:r>
+          </w:p>
+        </w:tc>
+        <w:tc>
+          <w:tcPr>
+            <w:tcW w:type="dxa" w:w="2160"/>
+            <w:tcMar>
+              <w:top w:w="80" w:type="dxa"/>
+              <w:bottom w:w="80" w:type="dxa"/>
+              <w:left w:w="120" w:type="dxa"/>
+              <w:right w:w="120" w:type="dxa"/>
+            </w:tcMar>
+          </w:tcPr>
+          <w:p>
+            <w:pPr>
+              <w:spacing w:before="0" w:after="0" w:line="264" w:lineRule="auto"/>
+            </w:pPr>
+            <w:r>
+              <w:rPr>
+                <w:rFonts w:ascii="Calibri" w:hAnsi="Calibri"/>
+                <w:sz w:val="19"/>
+              </w:rPr>
+              <w:t>P0 Core Engine</w:t>
+            </w:r>
+          </w:p>
+        </w:tc>
+      </w:tr>
+      <w:tr>
+        <w:tc>
+          <w:tcPr>
+            <w:tcW w:type="dxa" w:w="2160"/>
+            <w:shd w:fill="F7F9FB"/>
+            <w:tcMar>
+              <w:top w:w="80" w:type="dxa"/>
+              <w:bottom w:w="80" w:type="dxa"/>
+              <w:left w:w="120" w:type="dxa"/>
+              <w:right w:w="120" w:type="dxa"/>
+            </w:tcMar>
+          </w:tcPr>
+          <w:p>
+            <w:pPr>
+              <w:spacing w:before="0" w:after="0" w:line="264" w:lineRule="auto"/>
+            </w:pPr>
+            <w:r>
+              <w:rPr>
+                <w:rFonts w:ascii="Calibri" w:hAnsi="Calibri"/>
+                <w:sz w:val="19"/>
+              </w:rPr>
+              <w:t>Workflow Fragility (accidental live automation breaks)</w:t>
+            </w:r>
+          </w:p>
+        </w:tc>
+        <w:tc>
+          <w:tcPr>
+            <w:tcW w:type="dxa" w:w="2160"/>
+            <w:shd w:fill="F7F9FB"/>
+            <w:tcMar>
+              <w:top w:w="80" w:type="dxa"/>
+              <w:bottom w:w="80" w:type="dxa"/>
+              <w:left w:w="120" w:type="dxa"/>
+              <w:right w:w="120" w:type="dxa"/>
+            </w:tcMar>
+          </w:tcPr>
+          <w:p>
+            <w:pPr>
+              <w:spacing w:before="0" w:after="0" w:line="264" w:lineRule="auto"/>
+            </w:pPr>
+            <w:r>
+              <w:rPr>
+                <w:rFonts w:ascii="Calibri" w:hAnsi="Calibri"/>
+                <w:sz w:val="19"/>
+              </w:rPr>
+              <w:t>No version control; direct UI mutations on production data</w:t>
+            </w:r>
+          </w:p>
+        </w:tc>
+        <w:tc>
+          <w:tcPr>
+            <w:tcW w:type="dxa" w:w="2160"/>
+            <w:shd w:fill="F7F9FB"/>
+            <w:tcMar>
+              <w:top w:w="80" w:type="dxa"/>
+              <w:bottom w:w="80" w:type="dxa"/>
+              <w:left w:w="120" w:type="dxa"/>
+              <w:right w:w="120" w:type="dxa"/>
+            </w:tcMar>
+          </w:tcPr>
+          <w:p>
+            <w:pPr>
+              <w:spacing w:before="0" w:after="0" w:line="264" w:lineRule="auto"/>
+            </w:pPr>
+            <w:r>
+              <w:rPr>
+                <w:rFonts w:ascii="Calibri" w:hAnsi="Calibri"/>
+                <w:sz w:val="19"/>
+              </w:rPr>
+              <w:t>Workflows as Code: Automation defined in version-controlled YAML/Git with instant rollback and visual preview.</w:t>
+            </w:r>
+          </w:p>
+        </w:tc>
+        <w:tc>
+          <w:tcPr>
+            <w:tcW w:type="dxa" w:w="2160"/>
+            <w:shd w:fill="F7F9FB"/>
+            <w:tcMar>
+              <w:top w:w="80" w:type="dxa"/>
+              <w:bottom w:w="80" w:type="dxa"/>
+              <w:left w:w="120" w:type="dxa"/>
+              <w:right w:w="120" w:type="dxa"/>
+            </w:tcMar>
+          </w:tcPr>
+          <w:p>
+            <w:pPr>
+              <w:spacing w:before="0" w:after="0" w:line="264" w:lineRule="auto"/>
+            </w:pPr>
+            <w:r>
+              <w:rPr>
+                <w:rFonts w:ascii="Calibri" w:hAnsi="Calibri"/>
+                <w:sz w:val="19"/>
+              </w:rPr>
+              <w:t>P1 Differentiator</w:t>
+            </w:r>
+          </w:p>
+        </w:tc>
+      </w:tr>
+      <w:tr>
+        <w:tc>
+          <w:tcPr>
+            <w:tcW w:type="dxa" w:w="2160"/>
+            <w:tcMar>
+              <w:top w:w="80" w:type="dxa"/>
+              <w:bottom w:w="80" w:type="dxa"/>
+              <w:left w:w="120" w:type="dxa"/>
+              <w:right w:w="120" w:type="dxa"/>
+            </w:tcMar>
+          </w:tcPr>
+          <w:p>
+            <w:pPr>
+              <w:spacing w:before="0" w:after="0" w:line="264" w:lineRule="auto"/>
+            </w:pPr>
+            <w:r>
+              <w:rPr>
+                <w:rFonts w:ascii="Calibri" w:hAnsi="Calibri"/>
+                <w:sz w:val="19"/>
+              </w:rPr>
+              <w:t>Sluggish 5-second CRM list queries</w:t>
+            </w:r>
+          </w:p>
+        </w:tc>
+        <w:tc>
+          <w:tcPr>
+            <w:tcW w:type="dxa" w:w="2160"/>
+            <w:tcMar>
+              <w:top w:w="80" w:type="dxa"/>
+              <w:bottom w:w="80" w:type="dxa"/>
+              <w:left w:w="120" w:type="dxa"/>
+              <w:right w:w="120" w:type="dxa"/>
+            </w:tcMar>
+          </w:tcPr>
+          <w:p>
+            <w:pPr>
+              <w:spacing w:before="0" w:after="0" w:line="264" w:lineRule="auto"/>
+            </w:pPr>
+            <w:r>
+              <w:rPr>
+                <w:rFonts w:ascii="Calibri" w:hAnsi="Calibri"/>
+                <w:sz w:val="19"/>
+              </w:rPr>
+              <w:t>Server-rendered monolithic databases burdened with 10 years of legacy bloat</w:t>
+            </w:r>
+          </w:p>
+        </w:tc>
+        <w:tc>
+          <w:tcPr>
+            <w:tcW w:type="dxa" w:w="2160"/>
+            <w:tcMar>
+              <w:top w:w="80" w:type="dxa"/>
+              <w:bottom w:w="80" w:type="dxa"/>
+              <w:left w:w="120" w:type="dxa"/>
+              <w:right w:w="120" w:type="dxa"/>
+            </w:tcMar>
+          </w:tcPr>
+          <w:p>
+            <w:pPr>
+              <w:spacing w:before="0" w:after="0" w:line="264" w:lineRule="auto"/>
+            </w:pPr>
+            <w:r>
+              <w:rPr>
+                <w:rFonts w:ascii="Calibri" w:hAnsi="Calibri"/>
+                <w:sz w:val="19"/>
+              </w:rPr>
+              <w:t>Sub-100ms Instant CRM: Client-side optimistic caching with command-bar (⌘+K) instant keyboard navigation.</w:t>
+            </w:r>
+          </w:p>
+        </w:tc>
+        <w:tc>
+          <w:tcPr>
+            <w:tcW w:type="dxa" w:w="2160"/>
+            <w:tcMar>
+              <w:top w:w="80" w:type="dxa"/>
+              <w:bottom w:w="80" w:type="dxa"/>
+              <w:left w:w="120" w:type="dxa"/>
+              <w:right w:w="120" w:type="dxa"/>
+            </w:tcMar>
+          </w:tcPr>
+          <w:p>
+            <w:pPr>
+              <w:spacing w:before="0" w:after="0" w:line="264" w:lineRule="auto"/>
+            </w:pPr>
+            <w:r>
+              <w:rPr>
+                <w:rFonts w:ascii="Calibri" w:hAnsi="Calibri"/>
+                <w:sz w:val="19"/>
+              </w:rPr>
+              <w:t>P1 Differentiator</w:t>
+            </w:r>
+          </w:p>
+        </w:tc>
+      </w:tr>
+      <w:tr>
+        <w:tc>
+          <w:tcPr>
+            <w:tcW w:type="dxa" w:w="2160"/>
+            <w:shd w:fill="F7F9FB"/>
+            <w:tcMar>
+              <w:top w:w="80" w:type="dxa"/>
+              <w:bottom w:w="80" w:type="dxa"/>
+              <w:left w:w="120" w:type="dxa"/>
+              <w:right w:w="120" w:type="dxa"/>
+            </w:tcMar>
+          </w:tcPr>
+          <w:p>
+            <w:pPr>
+              <w:spacing w:before="0" w:after="0" w:line="264" w:lineRule="auto"/>
+            </w:pPr>
+            <w:r>
+              <w:rPr>
+                <w:rFonts w:ascii="Calibri" w:hAnsi="Calibri"/>
+                <w:sz w:val="19"/>
+              </w:rPr>
+              <w:t>Proprietary schemas and locked contact histories</w:t>
+            </w:r>
+          </w:p>
+        </w:tc>
+        <w:tc>
+          <w:tcPr>
+            <w:tcW w:type="dxa" w:w="2160"/>
+            <w:shd w:fill="F7F9FB"/>
+            <w:tcMar>
+              <w:top w:w="80" w:type="dxa"/>
+              <w:bottom w:w="80" w:type="dxa"/>
+              <w:left w:w="120" w:type="dxa"/>
+              <w:right w:w="120" w:type="dxa"/>
+            </w:tcMar>
+          </w:tcPr>
+          <w:p>
+            <w:pPr>
+              <w:spacing w:before="0" w:after="0" w:line="264" w:lineRule="auto"/>
+            </w:pPr>
+            <w:r>
+              <w:rPr>
+                <w:rFonts w:ascii="Calibri" w:hAnsi="Calibri"/>
+                <w:sz w:val="19"/>
+              </w:rPr>
+              <w:t>Deliberate walled-garden lock-in</w:t>
+            </w:r>
+          </w:p>
+        </w:tc>
+        <w:tc>
+          <w:tcPr>
+            <w:tcW w:type="dxa" w:w="2160"/>
+            <w:shd w:fill="F7F9FB"/>
+            <w:tcMar>
+              <w:top w:w="80" w:type="dxa"/>
+              <w:bottom w:w="80" w:type="dxa"/>
+              <w:left w:w="120" w:type="dxa"/>
+              <w:right w:w="120" w:type="dxa"/>
+            </w:tcMar>
+          </w:tcPr>
+          <w:p>
+            <w:pPr>
+              <w:spacing w:before="0" w:after="0" w:line="264" w:lineRule="auto"/>
+            </w:pPr>
+            <w:r>
+              <w:rPr>
+                <w:rFonts w:ascii="Calibri" w:hAnsi="Calibri"/>
+                <w:sz w:val="19"/>
+              </w:rPr>
+              <w:t>BYO-Database: Native PostgreSQL support with 1-click full JSON/Parquet export and zero schema lock-in.</w:t>
+            </w:r>
+          </w:p>
+        </w:tc>
+        <w:tc>
+          <w:tcPr>
+            <w:tcW w:type="dxa" w:w="2160"/>
+            <w:shd w:fill="F7F9FB"/>
+            <w:tcMar>
+              <w:top w:w="80" w:type="dxa"/>
+              <w:bottom w:w="80" w:type="dxa"/>
+              <w:left w:w="120" w:type="dxa"/>
+              <w:right w:w="120" w:type="dxa"/>
+            </w:tcMar>
+          </w:tcPr>
+          <w:p>
+            <w:pPr>
+              <w:spacing w:before="0" w:after="0" w:line="264" w:lineRule="auto"/>
+            </w:pPr>
+            <w:r>
+              <w:rPr>
+                <w:rFonts w:ascii="Calibri" w:hAnsi="Calibri"/>
+                <w:sz w:val="19"/>
+              </w:rPr>
+              <w:t>P1 Differentiator</w:t>
+            </w:r>
+          </w:p>
+        </w:tc>
+      </w:tr>
+    </w:tbl>
+    <w:p>
+      <w:pPr>
+        <w:spacing w:before="80" w:after="120"/>
+      </w:pPr>
+    </w:p>
+    <w:p>
+      <w:pPr>
+        <w:pStyle w:val="Heading2"/>
+        <w:keepNext/>
+        <w:spacing w:before="200" w:after="80"/>
+      </w:pPr>
+      <w:r>
+        <w:rPr>
+          <w:rFonts w:ascii="Calibri" w:hAnsi="Calibri"/>
+          <w:b/>
+          <w:color w:val="1B3A5C"/>
+          <w:sz w:val="25"/>
+        </w:rPr>
+        <w:t>20.3 Blueprint Integration &amp; The Value Innovation Rule</w:t>
+      </w:r>
+    </w:p>
+    <w:p>
+      <w:pPr>
+        <w:spacing w:before="0" w:after="80" w:line="276" w:lineRule="auto"/>
+      </w:pPr>
+      <w:r>
+        <w:rPr>
+          <w:rFonts w:ascii="Calibri" w:hAnsi="Calibri"/>
+          <w:sz w:val="22"/>
+        </w:rPr>
+        <w:t>Once the Competitive Gap Subagent identifies the incumbent's vulnerabilities, the orchestrator embeds the 10x architectural wedges into Tier P1 of the project's spec.md. The resulting application is not a pale imitation of an existing tool; it enters the market with distinct competitive superiority.</w:t>
+      </w:r>
+    </w:p>
+    <w:p>
+      <w:pPr>
+        <w:pStyle w:val="Heading1"/>
+        <w:keepNext/>
+        <w:spacing w:before="280" w:after="80"/>
+      </w:pPr>
+      <w:r>
+        <w:rPr>
+          <w:rFonts w:ascii="Calibri" w:hAnsi="Calibri"/>
+          <w:b/>
+          <w:color w:val="1B3A5C"/>
+          <w:sz w:val="28"/>
+        </w:rPr>
+        <w:t>21. Universal Operating System &amp; Master AGENTS.md Blueprint</w:t>
+      </w:r>
+    </w:p>
+    <w:p>
+      <w:pPr>
+        <w:pStyle w:val="Heading2"/>
+        <w:keepNext/>
+        <w:spacing w:before="200" w:after="80"/>
+      </w:pPr>
+      <w:r>
+        <w:rPr>
+          <w:rFonts w:ascii="Calibri" w:hAnsi="Calibri"/>
+          <w:b/>
+          <w:color w:val="1B3A5C"/>
+          <w:sz w:val="25"/>
+        </w:rPr>
+        <w:t>21.1 Architectural Anatomy of the Master Template</w:t>
+      </w:r>
+    </w:p>
+    <w:p>
+      <w:pPr>
+        <w:spacing w:before="0" w:after="80" w:line="276" w:lineRule="auto"/>
+      </w:pPr>
+      <w:r>
+        <w:rPr>
+          <w:rFonts w:ascii="Calibri" w:hAnsi="Calibri"/>
+          <w:sz w:val="22"/>
+        </w:rPr>
+        <w:t>The universal AGENTS.md file represents the executable constitutional law of an ACE project. It operates completely independently of external documentation links, providing any frontier LLM with the complete behavioral operating system in under 1,500 tokens.</w:t>
+      </w:r>
+    </w:p>
+    <w:p>
+      <w:pPr>
+        <w:spacing w:before="0" w:after="80" w:line="276" w:lineRule="auto"/>
+      </w:pPr>
+      <w:r>
+        <w:rPr>
+          <w:rFonts w:ascii="Calibri" w:hAnsi="Calibri"/>
+          <w:sz w:val="22"/>
+        </w:rPr>
+        <w:t>The master template comprises six tightly coupled governance tiers:</w:t>
+      </w:r>
+    </w:p>
+    <w:p>
+      <w:pPr>
+        <w:pStyle w:val="ListBullet"/>
+        <w:spacing w:before="0" w:after="60" w:line="276" w:lineRule="auto"/>
+      </w:pPr>
+      <w:r>
+        <w:rPr>
+          <w:rFonts w:ascii="Calibri" w:hAnsi="Calibri"/>
+          <w:b/>
+          <w:sz w:val="22"/>
+        </w:rPr>
+        <w:t xml:space="preserve">Tier 1: Operating Rules &amp; Cyclical Protocols: </w:t>
+      </w:r>
+      <w:r>
+        <w:rPr>
+          <w:rFonts w:ascii="Calibri" w:hAnsi="Calibri"/>
+          <w:sz w:val="22"/>
+        </w:rPr>
+        <w:t>Codifies the Micro Loop (test-after-every-change), Meso Loop (plan-before-edit), Macro Loop (context reset), and Meta Loop (compounding).</w:t>
+      </w:r>
+    </w:p>
+    <w:p>
+      <w:pPr>
+        <w:pStyle w:val="ListBullet"/>
+        <w:spacing w:before="0" w:after="60" w:line="276" w:lineRule="auto"/>
+      </w:pPr>
+      <w:r>
+        <w:rPr>
+          <w:rFonts w:ascii="Calibri" w:hAnsi="Calibri"/>
+          <w:b/>
+          <w:sz w:val="22"/>
+        </w:rPr>
+        <w:t xml:space="preserve">Tier 2: Autonomous Swarm Delegation Protocol: </w:t>
+      </w:r>
+      <w:r>
+        <w:rPr>
+          <w:rFonts w:ascii="Calibri" w:hAnsi="Calibri"/>
+          <w:sz w:val="22"/>
+        </w:rPr>
+        <w:t>Defines explicit conditions for when the orchestrator must dispatch swarms vs. retain single-agent execution.</w:t>
+      </w:r>
+    </w:p>
+    <w:p>
+      <w:pPr>
+        <w:pStyle w:val="ListBullet"/>
+        <w:spacing w:before="0" w:after="60" w:line="276" w:lineRule="auto"/>
+      </w:pPr>
+      <w:r>
+        <w:rPr>
+          <w:rFonts w:ascii="Calibri" w:hAnsi="Calibri"/>
+          <w:b/>
+          <w:sz w:val="22"/>
+        </w:rPr>
+        <w:t xml:space="preserve">Tier 3: Special Case Triggers (SC-1 through SC-12): </w:t>
+      </w:r>
+      <w:r>
+        <w:rPr>
+          <w:rFonts w:ascii="Calibri" w:hAnsi="Calibri"/>
+          <w:sz w:val="22"/>
+        </w:rPr>
+        <w:t>Enforces deterministic, stage-gated protocols for debugging, legacy refactoring, security audits, and headless autonomous runs.</w:t>
+      </w:r>
+    </w:p>
+    <w:p>
+      <w:pPr>
+        <w:pStyle w:val="ListBullet"/>
+        <w:spacing w:before="0" w:after="60" w:line="276" w:lineRule="auto"/>
+      </w:pPr>
+      <w:r>
+        <w:rPr>
+          <w:rFonts w:ascii="Calibri" w:hAnsi="Calibri"/>
+          <w:b/>
+          <w:sz w:val="22"/>
+        </w:rPr>
+        <w:t xml:space="preserve">Tier 4: Domain Inception, Modern Stack &amp; Design Excellence: </w:t>
+      </w:r>
+      <w:r>
+        <w:rPr>
+          <w:rFonts w:ascii="Calibri" w:hAnsi="Calibri"/>
+          <w:sz w:val="22"/>
+        </w:rPr>
+        <w:t>Mandates domain-specific invariants, modern concrete component selection, anti-slop UX standards, and competitive gap exploitation.</w:t>
+      </w:r>
+    </w:p>
+    <w:p>
+      <w:pPr>
+        <w:pStyle w:val="ListBullet"/>
+        <w:spacing w:before="0" w:after="60" w:line="276" w:lineRule="auto"/>
+      </w:pPr>
+      <w:r>
+        <w:rPr>
+          <w:rFonts w:ascii="Calibri" w:hAnsi="Calibri"/>
+          <w:b/>
+          <w:sz w:val="22"/>
+        </w:rPr>
+        <w:t xml:space="preserve">Tier 5: Project Stack &amp; Executable Commands: </w:t>
+      </w:r>
+      <w:r>
+        <w:rPr>
+          <w:rFonts w:ascii="Calibri" w:hAnsi="Calibri"/>
+          <w:sz w:val="22"/>
+        </w:rPr>
+        <w:t>Lists exact test runners, linter commands, and infrastructure boundaries (Markdown for agent memory, Postgres/Redis for application state).</w:t>
+      </w:r>
+    </w:p>
+    <w:p>
+      <w:pPr>
+        <w:pStyle w:val="ListBullet"/>
+        <w:spacing w:before="0" w:after="60" w:line="276" w:lineRule="auto"/>
+      </w:pPr>
+      <w:r>
+        <w:rPr>
+          <w:rFonts w:ascii="Calibri" w:hAnsi="Calibri"/>
+          <w:b/>
+          <w:sz w:val="22"/>
+        </w:rPr>
+        <w:t xml:space="preserve">Tier 6: Learned Conventions &amp; Anti-Patterns: </w:t>
+      </w:r>
+      <w:r>
+        <w:rPr>
+          <w:rFonts w:ascii="Calibri" w:hAnsi="Calibri"/>
+          <w:sz w:val="22"/>
+        </w:rPr>
+        <w:t>A self-appending memory ledger where the agent records discovered project quirks, domain rules, and bug anti-patterns after every task.</w:t>
+      </w:r>
+    </w:p>
+    <w:p>
+      <w:pPr>
+        <w:pStyle w:val="Heading2"/>
+        <w:keepNext/>
+        <w:spacing w:before="200" w:after="80"/>
+      </w:pPr>
+      <w:r>
+        <w:rPr>
+          <w:rFonts w:ascii="Calibri" w:hAnsi="Calibri"/>
+          <w:b/>
+          <w:color w:val="1B3A5C"/>
+          <w:sz w:val="25"/>
+        </w:rPr>
+        <w:t>21.2 Zero-Dependency Portability</w:t>
+      </w:r>
+    </w:p>
+    <w:p>
+      <w:pPr>
+        <w:spacing w:before="0" w:after="80" w:line="276" w:lineRule="auto"/>
+      </w:pPr>
+      <w:r>
+        <w:rPr>
+          <w:rFonts w:ascii="Calibri" w:hAnsi="Calibri"/>
+          <w:sz w:val="22"/>
+        </w:rPr>
+        <w:t>Because frontier models have already digested billions of lines of engineering literature during pre-training, AGENTS.md does not need to re-explain what TDD, HMAC, or mutex locks are. It acts as an operational state governor—activating the model's highest-discipline reasoning modes while preventing cognitive shortcuts.</w:t>
+      </w:r>
+    </w:p>
+    <w:p>
+      <w:pPr>
+        <w:spacing w:before="0" w:after="80" w:line="276" w:lineRule="auto"/>
+      </w:pPr>
+      <w:r>
+        <w:rPr>
+          <w:rFonts w:ascii="Calibri" w:hAnsi="Calibri"/>
+          <w:sz w:val="22"/>
+        </w:rPr>
+        <w:t>Copying AGENTS.md into the root of any greenfield or legacy repository instantly transforms any standard agent into a methodical, senior-level autonomous engineering partner.</w:t>
+      </w:r>
+    </w:p>
+    <w:p>
+      <w:pPr>
+        <w:pStyle w:val="Heading1"/>
+        <w:keepNext/>
+        <w:spacing w:before="280" w:after="80"/>
+      </w:pPr>
+      <w:r>
+        <w:rPr>
+          <w:rFonts w:ascii="Calibri" w:hAnsi="Calibri"/>
+          <w:b/>
+          <w:color w:val="1B3A5C"/>
+          <w:sz w:val="28"/>
+        </w:rPr>
+        <w:t>22. Online Web Research &amp; Grounding Protocol (The Anti-Hallucination Engine)</w:t>
+      </w:r>
+    </w:p>
+    <w:p>
+      <w:pPr>
+        <w:pStyle w:val="Heading2"/>
+        <w:keepNext/>
+        <w:spacing w:before="200" w:after="80"/>
+      </w:pPr>
+      <w:r>
+        <w:rPr>
+          <w:rFonts w:ascii="Calibri" w:hAnsi="Calibri"/>
+          <w:b/>
+          <w:color w:val="1B3A5C"/>
+          <w:sz w:val="25"/>
+        </w:rPr>
+        <w:t>22.1 The Training Data Cutoff &amp; Deprecation Reality</w:t>
+      </w:r>
+    </w:p>
+    <w:p>
+      <w:pPr>
+        <w:spacing w:before="0" w:after="80" w:line="276" w:lineRule="auto"/>
+      </w:pPr>
+      <w:r>
+        <w:rPr>
+          <w:rFonts w:ascii="Calibri" w:hAnsi="Calibri"/>
+          <w:sz w:val="22"/>
+        </w:rPr>
+        <w:t>Frontier Large Language Models are frozen at their pre-training snapshot dates. In modern software engineering, web frameworks, cloud SDKs, and regulatory statutes evolve continuously. When an agent encounters newly updated libraries (e.g. Next.js App Router, Pydantic v2 breaking syntax, Tailwind v4 engine, or Stripe API version changes), relying solely on internal model weights guarantees hallucinations:</w:t>
+      </w:r>
+    </w:p>
+    <w:p>
+      <w:pPr>
+        <w:pStyle w:val="ListBullet"/>
+        <w:spacing w:before="0" w:after="60" w:line="276" w:lineRule="auto"/>
+      </w:pPr>
+      <w:r>
+        <w:rPr>
+          <w:rFonts w:ascii="Calibri" w:hAnsi="Calibri"/>
+          <w:b/>
+          <w:sz w:val="22"/>
+        </w:rPr>
+        <w:t xml:space="preserve">Hallucinated Signatures: </w:t>
+      </w:r>
+      <w:r>
+        <w:rPr>
+          <w:rFonts w:ascii="Calibri" w:hAnsi="Calibri"/>
+          <w:sz w:val="22"/>
+        </w:rPr>
+        <w:t>The model invents methods, flags, or configuration arguments that look statistically plausible but do not exist in the installed release.</w:t>
+      </w:r>
+    </w:p>
+    <w:p>
+      <w:pPr>
+        <w:pStyle w:val="ListBullet"/>
+        <w:spacing w:before="0" w:after="60" w:line="276" w:lineRule="auto"/>
+      </w:pPr>
+      <w:r>
+        <w:rPr>
+          <w:rFonts w:ascii="Calibri" w:hAnsi="Calibri"/>
+          <w:b/>
+          <w:sz w:val="22"/>
+        </w:rPr>
+        <w:t xml:space="preserve">Zombie Patterns: </w:t>
+      </w:r>
+      <w:r>
+        <w:rPr>
+          <w:rFonts w:ascii="Calibri" w:hAnsi="Calibri"/>
+          <w:sz w:val="22"/>
+        </w:rPr>
+        <w:t>The model uses legacy StackOverflow patterns from 2019 that trigger deprecation warnings or runtime crashes in modern environments.</w:t>
+      </w:r>
+    </w:p>
+    <w:p>
+      <w:pPr>
+        <w:pStyle w:val="ListBullet"/>
+        <w:spacing w:before="0" w:after="60" w:line="276" w:lineRule="auto"/>
+      </w:pPr>
+      <w:r>
+        <w:rPr>
+          <w:rFonts w:ascii="Calibri" w:hAnsi="Calibri"/>
+          <w:b/>
+          <w:sz w:val="22"/>
+        </w:rPr>
+        <w:t xml:space="preserve">Stale Regulatory Baselines: </w:t>
+      </w:r>
+      <w:r>
+        <w:rPr>
+          <w:rFonts w:ascii="Calibri" w:hAnsi="Calibri"/>
+          <w:sz w:val="22"/>
+        </w:rPr>
+        <w:t>The model assumes obsolete statutory bounds (e.g. old tax tiers, superseded webhook headers, outdated OAuth RFCs).</w:t>
+      </w:r>
+    </w:p>
+    <w:p>
+      <w:pPr>
+        <w:pStyle w:val="Heading2"/>
+        <w:keepNext/>
+        <w:spacing w:before="200" w:after="80"/>
+      </w:pPr>
+      <w:r>
+        <w:rPr>
+          <w:rFonts w:ascii="Calibri" w:hAnsi="Calibri"/>
+          <w:b/>
+          <w:color w:val="1B3A5C"/>
+          <w:sz w:val="25"/>
+        </w:rPr>
+        <w:t>22.2 The Four Mandatory Web Search Trigger Gates</w:t>
+      </w:r>
+    </w:p>
+    <w:p>
+      <w:pPr>
+        <w:spacing w:before="0" w:after="80" w:line="276" w:lineRule="auto"/>
+      </w:pPr>
+      <w:r>
+        <w:rPr>
+          <w:rFonts w:ascii="Calibri" w:hAnsi="Calibri"/>
+          <w:sz w:val="22"/>
+        </w:rPr>
+        <w:t>Under the ACE Framework, live web search (search_web and read_url_content) is not optional curiosity—it is an enforced engineering gate before planning or code generation:</w:t>
+      </w:r>
+    </w:p>
+    <w:tbl>
+      <w:tblPr>
+        <w:tblStyle w:val="LightGrid-Accent1"/>
+        <w:tblW w:type="auto" w:w="0"/>
+        <w:jc w:val="center"/>
+        <w:tblLook w:firstColumn="1" w:firstRow="1" w:lastColumn="0" w:lastRow="0" w:noHBand="0" w:noVBand="1" w:val="04A0"/>
+      </w:tblPr>
+      <w:tblGrid>
+        <w:gridCol w:w="2160"/>
+        <w:gridCol w:w="2160"/>
+        <w:gridCol w:w="2160"/>
+        <w:gridCol w:w="2160"/>
+      </w:tblGrid>
+      <w:tr>
+        <w:tc>
+          <w:tcPr>
+            <w:tcW w:type="dxa" w:w="2160"/>
+            <w:shd w:fill="1B3A5C"/>
+            <w:tcMar>
+              <w:top w:w="100" w:type="dxa"/>
+              <w:bottom w:w="100" w:type="dxa"/>
+              <w:left w:w="140" w:type="dxa"/>
+              <w:right w:w="140" w:type="dxa"/>
+            </w:tcMar>
+          </w:tcPr>
+          <w:p>
+            <w:pPr>
+              <w:spacing w:before="0" w:after="0"/>
+            </w:pPr>
+            <w:r>
+              <w:rPr>
+                <w:rFonts w:ascii="Calibri" w:hAnsi="Calibri"/>
+                <w:b/>
+                <w:color w:val="FFFFFF"/>
+                <w:sz w:val="20"/>
+              </w:rPr>
+              <w:t>Gate Trigger</w:t>
+            </w:r>
+          </w:p>
+        </w:tc>
+        <w:tc>
+          <w:tcPr>
+            <w:tcW w:type="dxa" w:w="2160"/>
+            <w:shd w:fill="1B3A5C"/>
+            <w:tcMar>
+              <w:top w:w="100" w:type="dxa"/>
+              <w:bottom w:w="100" w:type="dxa"/>
+              <w:left w:w="140" w:type="dxa"/>
+              <w:right w:w="140" w:type="dxa"/>
+            </w:tcMar>
+          </w:tcPr>
+          <w:p>
+            <w:pPr>
+              <w:spacing w:before="0" w:after="0"/>
+            </w:pPr>
+            <w:r>
+              <w:rPr>
+                <w:rFonts w:ascii="Calibri" w:hAnsi="Calibri"/>
+                <w:b/>
+                <w:color w:val="FFFFFF"/>
+                <w:sz w:val="20"/>
+              </w:rPr>
+              <w:t>When Invoked</w:t>
+            </w:r>
+          </w:p>
+        </w:tc>
+        <w:tc>
+          <w:tcPr>
+            <w:tcW w:type="dxa" w:w="2160"/>
+            <w:shd w:fill="1B3A5C"/>
+            <w:tcMar>
+              <w:top w:w="100" w:type="dxa"/>
+              <w:bottom w:w="100" w:type="dxa"/>
+              <w:left w:w="140" w:type="dxa"/>
+              <w:right w:w="140" w:type="dxa"/>
+            </w:tcMar>
+          </w:tcPr>
+          <w:p>
+            <w:pPr>
+              <w:spacing w:before="0" w:after="0"/>
+            </w:pPr>
+            <w:r>
+              <w:rPr>
+                <w:rFonts w:ascii="Calibri" w:hAnsi="Calibri"/>
+                <w:b/>
+                <w:color w:val="FFFFFF"/>
+                <w:sz w:val="20"/>
+              </w:rPr>
+              <w:t>Online Research Objective</w:t>
+            </w:r>
+          </w:p>
+        </w:tc>
+        <w:tc>
+          <w:tcPr>
+            <w:tcW w:type="dxa" w:w="2160"/>
+            <w:shd w:fill="1B3A5C"/>
+            <w:tcMar>
+              <w:top w:w="100" w:type="dxa"/>
+              <w:bottom w:w="100" w:type="dxa"/>
+              <w:left w:w="140" w:type="dxa"/>
+              <w:right w:w="140" w:type="dxa"/>
+            </w:tcMar>
+          </w:tcPr>
+          <w:p>
+            <w:pPr>
+              <w:spacing w:before="0" w:after="0"/>
+            </w:pPr>
+            <w:r>
+              <w:rPr>
+                <w:rFonts w:ascii="Calibri" w:hAnsi="Calibri"/>
+                <w:b/>
+                <w:color w:val="FFFFFF"/>
+                <w:sz w:val="20"/>
+              </w:rPr>
+              <w:t>Required Evidence in spec.md / plan.md</w:t>
+            </w:r>
+          </w:p>
+        </w:tc>
+      </w:tr>
+      <w:tr>
+        <w:tc>
+          <w:tcPr>
+            <w:tcW w:type="dxa" w:w="2160"/>
+            <w:tcMar>
+              <w:top w:w="80" w:type="dxa"/>
+              <w:bottom w:w="80" w:type="dxa"/>
+              <w:left w:w="120" w:type="dxa"/>
+              <w:right w:w="120" w:type="dxa"/>
+            </w:tcMar>
+          </w:tcPr>
+          <w:p>
+            <w:pPr>
+              <w:spacing w:before="0" w:after="0" w:line="264" w:lineRule="auto"/>
+            </w:pPr>
+            <w:r>
+              <w:rPr>
+                <w:rFonts w:ascii="Calibri" w:hAnsi="Calibri"/>
+                <w:sz w:val="19"/>
+              </w:rPr>
+              <w:t>Gate 1: Third-Party API Integration</w:t>
+            </w:r>
+          </w:p>
+        </w:tc>
+        <w:tc>
+          <w:tcPr>
+            <w:tcW w:type="dxa" w:w="2160"/>
+            <w:tcMar>
+              <w:top w:w="80" w:type="dxa"/>
+              <w:bottom w:w="80" w:type="dxa"/>
+              <w:left w:w="120" w:type="dxa"/>
+              <w:right w:w="120" w:type="dxa"/>
+            </w:tcMar>
+          </w:tcPr>
+          <w:p>
+            <w:pPr>
+              <w:spacing w:before="0" w:after="0" w:line="264" w:lineRule="auto"/>
+            </w:pPr>
+            <w:r>
+              <w:rPr>
+                <w:rFonts w:ascii="Calibri" w:hAnsi="Calibri"/>
+                <w:sz w:val="19"/>
+              </w:rPr>
+              <w:t>Integrating external SDKs (Stripe, HubSpot, AWS SES, Resend, Twilio)</w:t>
+            </w:r>
+          </w:p>
+        </w:tc>
+        <w:tc>
+          <w:tcPr>
+            <w:tcW w:type="dxa" w:w="2160"/>
+            <w:tcMar>
+              <w:top w:w="80" w:type="dxa"/>
+              <w:bottom w:w="80" w:type="dxa"/>
+              <w:left w:w="120" w:type="dxa"/>
+              <w:right w:w="120" w:type="dxa"/>
+            </w:tcMar>
+          </w:tcPr>
+          <w:p>
+            <w:pPr>
+              <w:spacing w:before="0" w:after="0" w:line="264" w:lineRule="auto"/>
+            </w:pPr>
+            <w:r>
+              <w:rPr>
+                <w:rFonts w:ascii="Calibri" w:hAnsi="Calibri"/>
+                <w:sz w:val="19"/>
+              </w:rPr>
+              <w:t>Retrieve official, up-to-date REST endpoints, authentication headers, error codes, and webhook signature schemas.</w:t>
+            </w:r>
+          </w:p>
+        </w:tc>
+        <w:tc>
+          <w:tcPr>
+            <w:tcW w:type="dxa" w:w="2160"/>
+            <w:tcMar>
+              <w:top w:w="80" w:type="dxa"/>
+              <w:bottom w:w="80" w:type="dxa"/>
+              <w:left w:w="120" w:type="dxa"/>
+              <w:right w:w="120" w:type="dxa"/>
+            </w:tcMar>
+          </w:tcPr>
+          <w:p>
+            <w:pPr>
+              <w:spacing w:before="0" w:after="0" w:line="264" w:lineRule="auto"/>
+            </w:pPr>
+            <w:r>
+              <w:rPr>
+                <w:rFonts w:ascii="Calibri" w:hAnsi="Calibri"/>
+                <w:sz w:val="19"/>
+              </w:rPr>
+              <w:t>Direct citation of official documentation URL and verified payload schemas.</w:t>
+            </w:r>
+          </w:p>
+        </w:tc>
+      </w:tr>
+      <w:tr>
+        <w:tc>
+          <w:tcPr>
+            <w:tcW w:type="dxa" w:w="2160"/>
+            <w:shd w:fill="F7F9FB"/>
+            <w:tcMar>
+              <w:top w:w="80" w:type="dxa"/>
+              <w:bottom w:w="80" w:type="dxa"/>
+              <w:left w:w="120" w:type="dxa"/>
+              <w:right w:w="120" w:type="dxa"/>
+            </w:tcMar>
+          </w:tcPr>
+          <w:p>
+            <w:pPr>
+              <w:spacing w:before="0" w:after="0" w:line="264" w:lineRule="auto"/>
+            </w:pPr>
+            <w:r>
+              <w:rPr>
+                <w:rFonts w:ascii="Calibri" w:hAnsi="Calibri"/>
+                <w:sz w:val="19"/>
+              </w:rPr>
+              <w:t>Gate 2: Major Version Migrations &amp; Upgrades</w:t>
+            </w:r>
+          </w:p>
+        </w:tc>
+        <w:tc>
+          <w:tcPr>
+            <w:tcW w:type="dxa" w:w="2160"/>
+            <w:shd w:fill="F7F9FB"/>
+            <w:tcMar>
+              <w:top w:w="80" w:type="dxa"/>
+              <w:bottom w:w="80" w:type="dxa"/>
+              <w:left w:w="120" w:type="dxa"/>
+              <w:right w:w="120" w:type="dxa"/>
+            </w:tcMar>
+          </w:tcPr>
+          <w:p>
+            <w:pPr>
+              <w:spacing w:before="0" w:after="0" w:line="264" w:lineRule="auto"/>
+            </w:pPr>
+            <w:r>
+              <w:rPr>
+                <w:rFonts w:ascii="Calibri" w:hAnsi="Calibri"/>
+                <w:sz w:val="19"/>
+              </w:rPr>
+              <w:t>Scaffolding dependencies or updating major library versions (e.g. v1 -&gt; v2)</w:t>
+            </w:r>
+          </w:p>
+        </w:tc>
+        <w:tc>
+          <w:tcPr>
+            <w:tcW w:type="dxa" w:w="2160"/>
+            <w:shd w:fill="F7F9FB"/>
+            <w:tcMar>
+              <w:top w:w="80" w:type="dxa"/>
+              <w:bottom w:w="80" w:type="dxa"/>
+              <w:left w:w="120" w:type="dxa"/>
+              <w:right w:w="120" w:type="dxa"/>
+            </w:tcMar>
+          </w:tcPr>
+          <w:p>
+            <w:pPr>
+              <w:spacing w:before="0" w:after="0" w:line="264" w:lineRule="auto"/>
+            </w:pPr>
+            <w:r>
+              <w:rPr>
+                <w:rFonts w:ascii="Calibri" w:hAnsi="Calibri"/>
+                <w:sz w:val="19"/>
+              </w:rPr>
+              <w:t>Extract breaking changes, deprecated decorators, removed classes, and official migration steps.</w:t>
+            </w:r>
+          </w:p>
+        </w:tc>
+        <w:tc>
+          <w:tcPr>
+            <w:tcW w:type="dxa" w:w="2160"/>
+            <w:shd w:fill="F7F9FB"/>
+            <w:tcMar>
+              <w:top w:w="80" w:type="dxa"/>
+              <w:bottom w:w="80" w:type="dxa"/>
+              <w:left w:w="120" w:type="dxa"/>
+              <w:right w:w="120" w:type="dxa"/>
+            </w:tcMar>
+          </w:tcPr>
+          <w:p>
+            <w:pPr>
+              <w:spacing w:before="0" w:after="0" w:line="264" w:lineRule="auto"/>
+            </w:pPr>
+            <w:r>
+              <w:rPr>
+                <w:rFonts w:ascii="Calibri" w:hAnsi="Calibri"/>
+                <w:sz w:val="19"/>
+              </w:rPr>
+              <w:t>Verified list of replaced methods and confirmed package compatibility.</w:t>
+            </w:r>
+          </w:p>
+        </w:tc>
+      </w:tr>
+      <w:tr>
+        <w:tc>
+          <w:tcPr>
+            <w:tcW w:type="dxa" w:w="2160"/>
+            <w:tcMar>
+              <w:top w:w="80" w:type="dxa"/>
+              <w:bottom w:w="80" w:type="dxa"/>
+              <w:left w:w="120" w:type="dxa"/>
+              <w:right w:w="120" w:type="dxa"/>
+            </w:tcMar>
+          </w:tcPr>
+          <w:p>
+            <w:pPr>
+              <w:spacing w:before="0" w:after="0" w:line="264" w:lineRule="auto"/>
+            </w:pPr>
+            <w:r>
+              <w:rPr>
+                <w:rFonts w:ascii="Calibri" w:hAnsi="Calibri"/>
+                <w:sz w:val="19"/>
+              </w:rPr>
+              <w:t>Gate 3: Statutory &amp; Domain Compliance</w:t>
+            </w:r>
+          </w:p>
+        </w:tc>
+        <w:tc>
+          <w:tcPr>
+            <w:tcW w:type="dxa" w:w="2160"/>
+            <w:tcMar>
+              <w:top w:w="80" w:type="dxa"/>
+              <w:bottom w:w="80" w:type="dxa"/>
+              <w:left w:w="120" w:type="dxa"/>
+              <w:right w:w="120" w:type="dxa"/>
+            </w:tcMar>
+          </w:tcPr>
+          <w:p>
+            <w:pPr>
+              <w:spacing w:before="0" w:after="0" w:line="264" w:lineRule="auto"/>
+            </w:pPr>
+            <w:r>
+              <w:rPr>
+                <w:rFonts w:ascii="Calibri" w:hAnsi="Calibri"/>
+                <w:sz w:val="19"/>
+              </w:rPr>
+              <w:t>Building fintech, healthcare, security, or tax-sensitive applications</w:t>
+            </w:r>
+          </w:p>
+        </w:tc>
+        <w:tc>
+          <w:tcPr>
+            <w:tcW w:type="dxa" w:w="2160"/>
+            <w:tcMar>
+              <w:top w:w="80" w:type="dxa"/>
+              <w:bottom w:w="80" w:type="dxa"/>
+              <w:left w:w="120" w:type="dxa"/>
+              <w:right w:w="120" w:type="dxa"/>
+            </w:tcMar>
+          </w:tcPr>
+          <w:p>
+            <w:pPr>
+              <w:spacing w:before="0" w:after="0" w:line="264" w:lineRule="auto"/>
+            </w:pPr>
+            <w:r>
+              <w:rPr>
+                <w:rFonts w:ascii="Calibri" w:hAnsi="Calibri"/>
+                <w:sz w:val="19"/>
+              </w:rPr>
+              <w:t>Ground logic in official regulatory statutes (PCI-DSS 4.0, GDPR, HIPAA, ISO-4217, local VAT/GST rules).</w:t>
+            </w:r>
+          </w:p>
+        </w:tc>
+        <w:tc>
+          <w:tcPr>
+            <w:tcW w:type="dxa" w:w="2160"/>
+            <w:tcMar>
+              <w:top w:w="80" w:type="dxa"/>
+              <w:bottom w:w="80" w:type="dxa"/>
+              <w:left w:w="120" w:type="dxa"/>
+              <w:right w:w="120" w:type="dxa"/>
+            </w:tcMar>
+          </w:tcPr>
+          <w:p>
+            <w:pPr>
+              <w:spacing w:before="0" w:after="0" w:line="264" w:lineRule="auto"/>
+            </w:pPr>
+            <w:r>
+              <w:rPr>
+                <w:rFonts w:ascii="Calibri" w:hAnsi="Calibri"/>
+                <w:sz w:val="19"/>
+              </w:rPr>
+              <w:t>Explicit statutory citations and legal compliance checklists in the domain spec.</w:t>
+            </w:r>
+          </w:p>
+        </w:tc>
+      </w:tr>
+      <w:tr>
+        <w:tc>
+          <w:tcPr>
+            <w:tcW w:type="dxa" w:w="2160"/>
+            <w:shd w:fill="F7F9FB"/>
+            <w:tcMar>
+              <w:top w:w="80" w:type="dxa"/>
+              <w:bottom w:w="80" w:type="dxa"/>
+              <w:left w:w="120" w:type="dxa"/>
+              <w:right w:w="120" w:type="dxa"/>
+            </w:tcMar>
+          </w:tcPr>
+          <w:p>
+            <w:pPr>
+              <w:spacing w:before="0" w:after="0" w:line="264" w:lineRule="auto"/>
+            </w:pPr>
+            <w:r>
+              <w:rPr>
+                <w:rFonts w:ascii="Calibri" w:hAnsi="Calibri"/>
+                <w:sz w:val="19"/>
+              </w:rPr>
+              <w:t>Gate 4: Incumbent Competitive Gap Mining</w:t>
+            </w:r>
+          </w:p>
+        </w:tc>
+        <w:tc>
+          <w:tcPr>
+            <w:tcW w:type="dxa" w:w="2160"/>
+            <w:shd w:fill="F7F9FB"/>
+            <w:tcMar>
+              <w:top w:w="80" w:type="dxa"/>
+              <w:bottom w:w="80" w:type="dxa"/>
+              <w:left w:w="120" w:type="dxa"/>
+              <w:right w:w="120" w:type="dxa"/>
+            </w:tcMar>
+          </w:tcPr>
+          <w:p>
+            <w:pPr>
+              <w:spacing w:before="0" w:after="0" w:line="264" w:lineRule="auto"/>
+            </w:pPr>
+            <w:r>
+              <w:rPr>
+                <w:rFonts w:ascii="Calibri" w:hAnsi="Calibri"/>
+                <w:sz w:val="19"/>
+              </w:rPr>
+              <w:t>Phase 0 Domain Inception for market-facing products (e.g. CRM, CMS, PM tools)</w:t>
+            </w:r>
+          </w:p>
+        </w:tc>
+        <w:tc>
+          <w:tcPr>
+            <w:tcW w:type="dxa" w:w="2160"/>
+            <w:shd w:fill="F7F9FB"/>
+            <w:tcMar>
+              <w:top w:w="80" w:type="dxa"/>
+              <w:bottom w:w="80" w:type="dxa"/>
+              <w:left w:w="120" w:type="dxa"/>
+              <w:right w:w="120" w:type="dxa"/>
+            </w:tcMar>
+          </w:tcPr>
+          <w:p>
+            <w:pPr>
+              <w:spacing w:before="0" w:after="0" w:line="264" w:lineRule="auto"/>
+            </w:pPr>
+            <w:r>
+              <w:rPr>
+                <w:rFonts w:ascii="Calibri" w:hAnsi="Calibri"/>
+                <w:sz w:val="19"/>
+              </w:rPr>
+              <w:t>Mine Reddit (r/sales, r/SaaS), G2, Capterra, and Trustpilot for top verified customer complaints regarding market leaders.</w:t>
+            </w:r>
+          </w:p>
+        </w:tc>
+        <w:tc>
+          <w:tcPr>
+            <w:tcW w:type="dxa" w:w="2160"/>
+            <w:shd w:fill="F7F9FB"/>
+            <w:tcMar>
+              <w:top w:w="80" w:type="dxa"/>
+              <w:bottom w:w="80" w:type="dxa"/>
+              <w:left w:w="120" w:type="dxa"/>
+              <w:right w:w="120" w:type="dxa"/>
+            </w:tcMar>
+          </w:tcPr>
+          <w:p>
+            <w:pPr>
+              <w:spacing w:before="0" w:after="0" w:line="264" w:lineRule="auto"/>
+            </w:pPr>
+            <w:r>
+              <w:rPr>
+                <w:rFonts w:ascii="Calibri" w:hAnsi="Calibri"/>
+                <w:sz w:val="19"/>
+              </w:rPr>
+              <w:t>Documented Incumbent Pain Matrix mapping user friction into 10x architectural wedges.</w:t>
+            </w:r>
+          </w:p>
+        </w:tc>
+      </w:tr>
+    </w:tbl>
+    <w:p>
+      <w:pPr>
+        <w:spacing w:before="80" w:after="120"/>
+      </w:pPr>
+    </w:p>
+    <w:p>
+      <w:pPr>
+        <w:pStyle w:val="Heading2"/>
+        <w:keepNext/>
+        <w:spacing w:before="200" w:after="80"/>
+      </w:pPr>
+      <w:r>
+        <w:rPr>
+          <w:rFonts w:ascii="Calibri" w:hAnsi="Calibri"/>
+          <w:b/>
+          <w:color w:val="1B3A5C"/>
+          <w:sz w:val="25"/>
+        </w:rPr>
+        <w:t>22.3 Subagent Context Isolation for Web Scraping</w:t>
+      </w:r>
+    </w:p>
+    <w:p>
+      <w:pPr>
+        <w:spacing w:before="0" w:after="80" w:line="276" w:lineRule="auto"/>
+      </w:pPr>
+      <w:r>
+        <w:rPr>
+          <w:rFonts w:ascii="Calibri" w:hAnsi="Calibri"/>
+          <w:sz w:val="22"/>
+        </w:rPr>
+        <w:t>A primary cause of Context Collapse in multi-step sessions is ingesting raw HTML pages directly into the Orchestrator's working memory. A single web scrape can inject 40,000 tokens of boilerplate markup, navigation menus, and CSS styling, instantly diluting the orchestrator's active attention window.</w:t>
+      </w:r>
+    </w:p>
+    <w:p>
+      <w:pPr>
+        <w:spacing w:before="0" w:after="80" w:line="276" w:lineRule="auto"/>
+      </w:pPr>
+      <w:r>
+        <w:rPr>
+          <w:rFonts w:ascii="Calibri" w:hAnsi="Calibri"/>
+          <w:sz w:val="22"/>
+        </w:rPr>
+        <w:t>The ACE Framework mandates Subagent Context Isolation (SC-4):</w:t>
+      </w:r>
+    </w:p>
+    <w:p>
+      <w:pPr>
+        <w:pStyle w:val="ListBullet"/>
+        <w:spacing w:before="0" w:after="60" w:line="276" w:lineRule="auto"/>
+      </w:pPr>
+      <w:r>
+        <w:rPr>
+          <w:rFonts w:ascii="Calibri" w:hAnsi="Calibri"/>
+          <w:b/>
+          <w:sz w:val="22"/>
+        </w:rPr>
+        <w:t xml:space="preserve">Isolation Principle: </w:t>
+      </w:r>
+      <w:r>
+        <w:rPr>
+          <w:rFonts w:ascii="Calibri" w:hAnsi="Calibri"/>
+          <w:sz w:val="22"/>
+        </w:rPr>
+        <w:t>Whenever an exploration task requires querying search engines and scraping multiple documentation pages, the Orchestrator must dispatch an isolated Research Subagent.</w:t>
+      </w:r>
+    </w:p>
+    <w:p>
+      <w:pPr>
+        <w:pStyle w:val="ListBullet"/>
+        <w:spacing w:before="0" w:after="60" w:line="276" w:lineRule="auto"/>
+      </w:pPr>
+      <w:r>
+        <w:rPr>
+          <w:rFonts w:ascii="Calibri" w:hAnsi="Calibri"/>
+          <w:b/>
+          <w:sz w:val="22"/>
+        </w:rPr>
+        <w:t xml:space="preserve">Autonomous Filtration: </w:t>
+      </w:r>
+      <w:r>
+        <w:rPr>
+          <w:rFonts w:ascii="Calibri" w:hAnsi="Calibri"/>
+          <w:sz w:val="22"/>
+        </w:rPr>
+        <w:t>The Research Subagent performs the web searches, downloads page contents, filters noise, and adversarial checks conflicting documentation.</w:t>
+      </w:r>
+    </w:p>
+    <w:p>
+      <w:pPr>
+        <w:pStyle w:val="ListBullet"/>
+        <w:spacing w:before="0" w:after="60" w:line="276" w:lineRule="auto"/>
+      </w:pPr>
+      <w:r>
+        <w:rPr>
+          <w:rFonts w:ascii="Calibri" w:hAnsi="Calibri"/>
+          <w:b/>
+          <w:sz w:val="22"/>
+        </w:rPr>
+        <w:t xml:space="preserve">Clean Distillation: </w:t>
+      </w:r>
+      <w:r>
+        <w:rPr>
+          <w:rFonts w:ascii="Calibri" w:hAnsi="Calibri"/>
+          <w:sz w:val="22"/>
+        </w:rPr>
+        <w:t>The subagent returns a concise, 25-line Markdown distillation containing only verified code signatures, URLs, and exact invariants back to the Orchestrator.</w:t>
+      </w:r>
+    </w:p>
+    <w:tbl>
+      <w:tblPr>
+        <w:tblW w:type="auto" w:w="0"/>
+        <w:jc w:val="center"/>
+        <w:tblLook w:firstColumn="1" w:firstRow="1" w:lastColumn="0" w:lastRow="0" w:noHBand="0" w:noVBand="1" w:val="04A0"/>
+      </w:tblPr>
+      <w:tblGrid>
+        <w:gridCol w:w="8640"/>
+      </w:tblGrid>
+      <w:tr>
+        <w:tc>
+          <w:tcPr>
+            <w:tcW w:type="dxa" w:w="8640"/>
+            <w:shd w:fill="F0F4F8"/>
+            <w:tcMar>
+              <w:top w:w="140" w:type="dxa"/>
+              <w:bottom w:w="140" w:type="dxa"/>
+              <w:left w:w="200" w:type="dxa"/>
+              <w:right w:w="200" w:type="dxa"/>
+            </w:tcMar>
+            <w:tcBorders>
+              <w:top w:val="none"/>
+              <w:left w:val="single" w:sz="24" w:space="0" w:color="1B3A5C"/>
+              <w:bottom w:val="none"/>
+              <w:right w:val="none"/>
+            </w:tcBorders>
+          </w:tcPr>
+          <w:p>
+            <w:pPr>
+              <w:spacing w:before="0" w:after="40"/>
+            </w:pPr>
+            <w:r>
+              <w:rPr>
+                <w:rFonts w:ascii="Calibri" w:hAnsi="Calibri"/>
+                <w:b/>
+                <w:color w:val="1B3A5C"/>
+                <w:sz w:val="22"/>
+              </w:rPr>
+              <w:t>★ THE GROUNDING INVARIANT</w:t>
+              <w:br/>
+            </w:r>
+            <w:r>
+              <w:rPr>
+                <w:rFonts w:ascii="Calibri" w:hAnsi="Calibri"/>
+                <w:sz w:val="21"/>
+              </w:rPr>
+              <w:t>Never guess an external API signature or assume historical pre-training state. If uncertain, facing recent breaking changes, or researching competitor user complaints, the agent MUST execute targeted web searches to anchor its reasoning in ground-truth reality.</w:t>
+            </w:r>
+          </w:p>
+        </w:tc>
+      </w:tr>
+    </w:tbl>
+    <w:p>
+      <w:pPr>
+        <w:spacing w:before="40" w:after="80"/>
+      </w:pPr>
     </w:p>
     <w:sectPr>
       <w:pgSz w:w="12240" w:h="15840"/>

</xml_diff>